<commit_message>
Release MSDS Skill v3.13 with Section 8.2 child tables
</commit_message>
<xml_diff>
--- a/MSDS Skill/examples/template_reference.docx
+++ b/MSDS Skill/examples/template_reference.docx
@@ -7952,6 +7952,7 @@
         </w:tblPrEx>
         <w:trPr>
           <w:trHeight w:val="244" w:hRule="atLeast"/>
+          <w:cantSplit/>
         </w:trPr>
         <w:tc>
           <w:tcPr>
@@ -8054,6 +8055,141 @@
               <w:t>使用局部排风或全面通风，保持工作场所空气中浓度低于职业接触限值；工作场所设置洗眼器与安全淋浴设施。</w:t>
             </w:r>
           </w:p>
+          <w:tbl>
+            <w:tblPr>
+              <w:tblStyle w:val="5"/>
+              <w:tblW w:type="auto" w:w="0"/>
+              <w:tblLayout w:type="fixed"/>
+              <w:tblLook w:firstColumn="1" w:firstRow="1" w:lastColumn="0" w:lastRow="0" w:noHBand="0" w:noVBand="1" w:val="04A0"/>
+              <w:tblBorders>
+                <w:top w:val="single" w:sz="4" w:space="0" w:color="auto"/>
+                <w:left w:val="single" w:sz="4" w:space="0" w:color="auto"/>
+                <w:bottom w:val="single" w:sz="4" w:space="0" w:color="auto"/>
+                <w:right w:val="single" w:sz="4" w:space="0" w:color="auto"/>
+                <w:insideH w:val="single" w:sz="4" w:space="0" w:color="auto"/>
+                <w:insideV w:val="single" w:sz="4" w:space="0" w:color="auto"/>
+              </w:tblBorders>
+            </w:tblPr>
+            <w:tblGrid>
+              <w:gridCol w:w="2400"/>
+              <w:gridCol w:w="1100"/>
+              <w:gridCol w:w="1100"/>
+              <w:gridCol w:w="1600"/>
+            </w:tblGrid>
+            <w:tr>
+              <w:tc>
+                <w:tcPr>
+                  <w:tcW w:type="dxa" w:w="2400"/>
+                  <w:vAlign w:val="center"/>
+                </w:tcPr>
+                <w:p>
+                  <w:r>
+                    <w:rPr>
+                      <w:sz w:val="24"/>
+                    </w:rPr>
+                    <w:t>物质</w:t>
+                  </w:r>
+                </w:p>
+              </w:tc>
+              <w:tc>
+                <w:tcPr>
+                  <w:tcW w:type="dxa" w:w="1100"/>
+                  <w:vAlign w:val="center"/>
+                </w:tcPr>
+                <w:p>
+                  <w:r>
+                    <w:rPr>
+                      <w:sz w:val="24"/>
+                    </w:rPr>
+                    <w:t>依据</w:t>
+                  </w:r>
+                </w:p>
+              </w:tc>
+              <w:tc>
+                <w:tcPr>
+                  <w:tcW w:type="dxa" w:w="1100"/>
+                  <w:vAlign w:val="center"/>
+                </w:tcPr>
+                <w:p>
+                  <w:r>
+                    <w:rPr>
+                      <w:sz w:val="24"/>
+                    </w:rPr>
+                    <w:t>类型</w:t>
+                  </w:r>
+                </w:p>
+              </w:tc>
+              <w:tc>
+                <w:tcPr>
+                  <w:tcW w:type="dxa" w:w="1600"/>
+                  <w:vAlign w:val="center"/>
+                </w:tcPr>
+                <w:p>
+                  <w:r>
+                    <w:rPr>
+                      <w:sz w:val="24"/>
+                    </w:rPr>
+                    <w:t>数值</w:t>
+                  </w:r>
+                </w:p>
+              </w:tc>
+            </w:tr>
+            <w:tr>
+              <w:tc>
+                <w:tcPr>
+                  <w:tcW w:type="dxa" w:w="2400"/>
+                  <w:vAlign w:val="center"/>
+                </w:tcPr>
+                <w:p>
+                  <w:r>
+                    <w:rPr>
+                      <w:sz w:val="24"/>
+                    </w:rPr>
+                  </w:r>
+                </w:p>
+              </w:tc>
+              <w:tc>
+                <w:tcPr>
+                  <w:tcW w:type="dxa" w:w="1100"/>
+                  <w:vAlign w:val="center"/>
+                </w:tcPr>
+                <w:p>
+                  <w:r>
+                    <w:rPr>
+                      <w:sz w:val="24"/>
+                    </w:rPr>
+                  </w:r>
+                </w:p>
+              </w:tc>
+              <w:tc>
+                <w:tcPr>
+                  <w:tcW w:type="dxa" w:w="1100"/>
+                  <w:vAlign w:val="center"/>
+                </w:tcPr>
+                <w:p>
+                  <w:r>
+                    <w:rPr>
+                      <w:sz w:val="24"/>
+                    </w:rPr>
+                  </w:r>
+                </w:p>
+              </w:tc>
+              <w:tc>
+                <w:tcPr>
+                  <w:tcW w:type="dxa" w:w="1600"/>
+                  <w:vAlign w:val="center"/>
+                </w:tcPr>
+                <w:p>
+                  <w:r>
+                    <w:rPr>
+                      <w:sz w:val="24"/>
+                    </w:rPr>
+                  </w:r>
+                </w:p>
+              </w:tc>
+            </w:tr>
+          </w:tbl>
+          <w:p/>
         </w:tc>
       </w:tr>
     </w:tbl>

</xml_diff>

<commit_message>
Release MSDS Skill v3.14.1 with formal top-level 8.2 rows
</commit_message>
<xml_diff>
--- a/MSDS Skill/examples/template_reference.docx
+++ b/MSDS Skill/examples/template_reference.docx
@@ -4298,12 +4298,6 @@
             <w:insideH w:val="none" w:color="auto" w:sz="0" w:space="0"/>
             <w:insideV w:val="none" w:color="auto" w:sz="0" w:space="0"/>
           </w:tblBorders>
-          <w:tblCellMar>
-            <w:top w:w="0" w:type="dxa"/>
-            <w:left w:w="108" w:type="dxa"/>
-            <w:bottom w:w="0" w:type="dxa"/>
-            <w:right w:w="108" w:type="dxa"/>
-          </w:tblCellMar>
         </w:tblPrEx>
         <w:trPr>
           <w:tblHeader/>
@@ -6699,8 +6693,11 @@
         </w:tblCellMar>
       </w:tblPr>
       <w:tblGrid>
-        <w:gridCol w:w="3519"/>
-        <w:gridCol w:w="6341"/>
+        <w:gridCol w:w="3193"/>
+        <w:gridCol w:w="326"/>
+        <w:gridCol w:w="1411"/>
+        <w:gridCol w:w="2465"/>
+        <w:gridCol w:w="2465"/>
       </w:tblGrid>
       <w:tr>
         <w:tblPrEx>
@@ -6712,12 +6709,6 @@
             <w:insideH w:val="none" w:color="auto" w:sz="0" w:space="0"/>
             <w:insideV w:val="none" w:color="auto" w:sz="0" w:space="0"/>
           </w:tblBorders>
-          <w:tblCellMar>
-            <w:top w:w="0" w:type="dxa"/>
-            <w:left w:w="108" w:type="dxa"/>
-            <w:bottom w:w="0" w:type="dxa"/>
-            <w:right w:w="108" w:type="dxa"/>
-          </w:tblCellMar>
         </w:tblPrEx>
         <w:trPr>
           <w:tblHeader/>
@@ -6725,7 +6716,7 @@
         <w:tc>
           <w:tcPr>
             <w:tcW w:w="9860" w:type="dxa"/>
-            <w:gridSpan w:val="2"/>
+            <w:gridSpan w:val="5"/>
             <w:tcBorders>
               <w:bottom w:val="single" w:color="auto" w:sz="4" w:space="0"/>
               <w:tl2br w:val="nil"/>
@@ -6799,7 +6790,7 @@
         <w:tc>
           <w:tcPr>
             <w:tcW w:w="9860" w:type="dxa"/>
-            <w:gridSpan w:val="2"/>
+            <w:gridSpan w:val="5"/>
             <w:tcBorders>
               <w:top w:val="single" w:color="auto" w:sz="4" w:space="0"/>
               <w:left w:val="single" w:color="auto" w:sz="4" w:space="0"/>
@@ -6877,6 +6868,7 @@
         <w:tc>
           <w:tcPr>
             <w:tcW w:w="3519" w:type="dxa"/>
+            <w:gridSpan w:val="2"/>
             <w:tcBorders>
               <w:top w:val="single" w:color="auto" w:sz="4" w:space="0"/>
               <w:left w:val="single" w:color="auto" w:sz="4" w:space="0"/>
@@ -6920,6 +6912,7 @@
         <w:tc>
           <w:tcPr>
             <w:tcW w:w="6341" w:type="dxa"/>
+            <w:gridSpan w:val="3"/>
             <w:tcBorders>
               <w:top w:val="single" w:color="auto" w:sz="4" w:space="0"/>
               <w:left w:val="dotted" w:color="auto" w:sz="4" w:space="0"/>
@@ -6985,6 +6978,7 @@
         <w:tc>
           <w:tcPr>
             <w:tcW w:w="3519" w:type="dxa"/>
+            <w:gridSpan w:val="2"/>
             <w:tcBorders>
               <w:top w:val="dotted" w:color="auto" w:sz="4" w:space="0"/>
               <w:left w:val="single" w:color="auto" w:sz="4" w:space="0"/>
@@ -7047,6 +7041,7 @@
         <w:tc>
           <w:tcPr>
             <w:tcW w:w="6341" w:type="dxa"/>
+            <w:gridSpan w:val="3"/>
             <w:tcBorders>
               <w:top w:val="dotted" w:color="auto" w:sz="4" w:space="0"/>
               <w:left w:val="dotted" w:color="auto" w:sz="4" w:space="0"/>
@@ -7117,6 +7112,7 @@
         <w:tc>
           <w:tcPr>
             <w:tcW w:w="3519" w:type="dxa"/>
+            <w:gridSpan w:val="2"/>
             <w:tcBorders>
               <w:top w:val="dotted" w:color="auto" w:sz="4" w:space="0"/>
               <w:left w:val="single" w:color="auto" w:sz="4" w:space="0"/>
@@ -7160,6 +7156,7 @@
         <w:tc>
           <w:tcPr>
             <w:tcW w:w="6341" w:type="dxa"/>
+            <w:gridSpan w:val="3"/>
             <w:tcBorders>
               <w:top w:val="dotted" w:color="auto" w:sz="4" w:space="0"/>
               <w:left w:val="dotted" w:color="auto" w:sz="4" w:space="0"/>
@@ -7226,6 +7223,7 @@
         <w:tc>
           <w:tcPr>
             <w:tcW w:w="3519" w:type="dxa"/>
+            <w:gridSpan w:val="2"/>
             <w:tcBorders>
               <w:top w:val="dotted" w:color="auto" w:sz="4" w:space="0"/>
               <w:left w:val="single" w:color="auto" w:sz="4" w:space="0"/>
@@ -7270,6 +7268,7 @@
         <w:tc>
           <w:tcPr>
             <w:tcW w:w="6341" w:type="dxa"/>
+            <w:gridSpan w:val="3"/>
             <w:tcBorders>
               <w:top w:val="dotted" w:color="auto" w:sz="4" w:space="0"/>
               <w:left w:val="dotted" w:color="auto" w:sz="4" w:space="0"/>
@@ -7360,6 +7359,7 @@
         <w:tc>
           <w:tcPr>
             <w:tcW w:w="3519" w:type="dxa"/>
+            <w:gridSpan w:val="2"/>
             <w:tcBorders>
               <w:top w:val="dotted" w:color="auto" w:sz="4" w:space="0"/>
               <w:left w:val="single" w:color="auto" w:sz="4" w:space="0"/>
@@ -7404,6 +7404,7 @@
         <w:tc>
           <w:tcPr>
             <w:tcW w:w="6341" w:type="dxa"/>
+            <w:gridSpan w:val="3"/>
             <w:tcBorders>
               <w:top w:val="dotted" w:color="auto" w:sz="4" w:space="0"/>
               <w:left w:val="dotted" w:color="auto" w:sz="4" w:space="0"/>
@@ -7494,6 +7495,7 @@
         <w:tc>
           <w:tcPr>
             <w:tcW w:w="3519" w:type="dxa"/>
+            <w:gridSpan w:val="2"/>
             <w:tcBorders>
               <w:top w:val="dotted" w:color="auto" w:sz="4" w:space="0"/>
               <w:left w:val="single" w:color="auto" w:sz="4" w:space="0"/>
@@ -7538,6 +7540,7 @@
         <w:tc>
           <w:tcPr>
             <w:tcW w:w="6341" w:type="dxa"/>
+            <w:gridSpan w:val="3"/>
             <w:tcBorders>
               <w:top w:val="dotted" w:color="auto" w:sz="4" w:space="0"/>
               <w:left w:val="dotted" w:color="auto" w:sz="4" w:space="0"/>
@@ -7628,6 +7631,7 @@
         <w:tc>
           <w:tcPr>
             <w:tcW w:w="3519" w:type="dxa"/>
+            <w:gridSpan w:val="2"/>
             <w:tcBorders>
               <w:top w:val="dotted" w:color="auto" w:sz="4" w:space="0"/>
               <w:left w:val="single" w:color="auto" w:sz="4" w:space="0"/>
@@ -7670,6 +7674,7 @@
         <w:tc>
           <w:tcPr>
             <w:tcW w:w="6341" w:type="dxa"/>
+            <w:gridSpan w:val="3"/>
             <w:tcBorders>
               <w:top w:val="dotted" w:color="auto" w:sz="4" w:space="0"/>
               <w:left w:val="dotted" w:color="auto" w:sz="4" w:space="0"/>
@@ -7725,6 +7730,7 @@
         <w:tc>
           <w:tcPr>
             <w:tcW w:w="3519" w:type="dxa"/>
+            <w:gridSpan w:val="2"/>
             <w:tcBorders>
               <w:top w:val="dotted" w:color="auto" w:sz="4" w:space="0"/>
               <w:left w:val="single" w:color="auto" w:sz="4" w:space="0"/>
@@ -7768,6 +7774,7 @@
         <w:tc>
           <w:tcPr>
             <w:tcW w:w="6341" w:type="dxa"/>
+            <w:gridSpan w:val="3"/>
             <w:tcBorders>
               <w:top w:val="dotted" w:color="auto" w:sz="4" w:space="0"/>
               <w:left w:val="dotted" w:color="auto" w:sz="4" w:space="0"/>
@@ -7849,6 +7856,7 @@
         <w:tc>
           <w:tcPr>
             <w:tcW w:w="3519" w:type="dxa"/>
+            <w:gridSpan w:val="2"/>
             <w:tcBorders>
               <w:top w:val="dotted" w:color="auto" w:sz="4" w:space="0"/>
               <w:left w:val="single" w:color="auto" w:sz="4" w:space="0"/>
@@ -7892,6 +7900,7 @@
         <w:tc>
           <w:tcPr>
             <w:tcW w:w="6341" w:type="dxa"/>
+            <w:gridSpan w:val="3"/>
             <w:tcBorders>
               <w:top w:val="dotted" w:color="auto" w:sz="4" w:space="0"/>
               <w:left w:val="dotted" w:color="auto" w:sz="4" w:space="0"/>
@@ -7952,15 +7961,15 @@
         </w:tblPrEx>
         <w:trPr>
           <w:trHeight w:val="244" w:hRule="atLeast"/>
-          <w:cantSplit/>
         </w:trPr>
         <w:tc>
           <w:tcPr>
             <w:tcW w:w="3519" w:type="dxa"/>
+            <w:gridSpan w:val="2"/>
             <w:tcBorders>
               <w:top w:val="dotted" w:color="auto" w:sz="4" w:space="0"/>
               <w:left w:val="single" w:color="auto" w:sz="4" w:space="0"/>
-              <w:bottom w:val="single" w:color="auto" w:sz="4" w:space="0"/>
+              <w:bottom w:val="dotted" w:color="auto" w:sz="4" w:space="0"/>
               <w:right w:val="dotted" w:color="auto" w:sz="4" w:space="0"/>
             </w:tcBorders>
             <w:vAlign w:val="center"/>
@@ -8013,10 +8022,11 @@
         <w:tc>
           <w:tcPr>
             <w:tcW w:w="6341" w:type="dxa"/>
+            <w:gridSpan w:val="3"/>
             <w:tcBorders>
               <w:top w:val="dotted" w:color="auto" w:sz="4" w:space="0"/>
               <w:left w:val="dotted" w:color="auto" w:sz="4" w:space="0"/>
-              <w:bottom w:val="single" w:color="auto" w:sz="4" w:space="0"/>
+              <w:bottom w:val="dotted" w:color="auto" w:sz="4" w:space="0"/>
               <w:right w:val="single" w:color="auto" w:sz="4" w:space="0"/>
             </w:tcBorders>
             <w:vAlign w:val="center"/>
@@ -8055,143 +8065,613 @@
               <w:t>使用局部排风或全面通风，保持工作场所空气中浓度低于职业接触限值；工作场所设置洗眼器与安全淋浴设施。</w:t>
             </w:r>
           </w:p>
-          <w:tbl>
-            <w:tblPr>
-              <w:tblStyle w:val="5"/>
-              <w:tblW w:type="auto" w:w="0"/>
-              <w:tblLayout w:type="fixed"/>
-              <w:tblLook w:firstColumn="1" w:firstRow="1" w:lastColumn="0" w:lastRow="0" w:noHBand="0" w:noVBand="1" w:val="04A0"/>
-              <w:tblBorders>
-                <w:top w:val="single" w:sz="4" w:space="0" w:color="auto"/>
-                <w:left w:val="single" w:sz="4" w:space="0" w:color="auto"/>
-                <w:bottom w:val="single" w:sz="4" w:space="0" w:color="auto"/>
-                <w:right w:val="single" w:sz="4" w:space="0" w:color="auto"/>
-                <w:insideH w:val="single" w:sz="4" w:space="0" w:color="auto"/>
-                <w:insideV w:val="single" w:sz="4" w:space="0" w:color="auto"/>
-              </w:tblBorders>
-            </w:tblPr>
-            <w:tblGrid>
-              <w:gridCol w:w="2400"/>
-              <w:gridCol w:w="1100"/>
-              <w:gridCol w:w="1100"/>
-              <w:gridCol w:w="1600"/>
-            </w:tblGrid>
-            <w:tr>
-              <w:tc>
-                <w:tcPr>
-                  <w:tcW w:type="dxa" w:w="2400"/>
-                  <w:vAlign w:val="center"/>
-                </w:tcPr>
-                <w:p>
-                  <w:r>
-                    <w:rPr>
-                      <w:sz w:val="24"/>
-                    </w:rPr>
-                    <w:t>物质</w:t>
-                  </w:r>
-                </w:p>
-              </w:tc>
-              <w:tc>
-                <w:tcPr>
-                  <w:tcW w:type="dxa" w:w="1100"/>
-                  <w:vAlign w:val="center"/>
-                </w:tcPr>
-                <w:p>
-                  <w:r>
-                    <w:rPr>
-                      <w:sz w:val="24"/>
-                    </w:rPr>
-                    <w:t>依据</w:t>
-                  </w:r>
-                </w:p>
-              </w:tc>
-              <w:tc>
-                <w:tcPr>
-                  <w:tcW w:type="dxa" w:w="1100"/>
-                  <w:vAlign w:val="center"/>
-                </w:tcPr>
-                <w:p>
-                  <w:r>
-                    <w:rPr>
-                      <w:sz w:val="24"/>
-                    </w:rPr>
-                    <w:t>类型</w:t>
-                  </w:r>
-                </w:p>
-              </w:tc>
-              <w:tc>
-                <w:tcPr>
-                  <w:tcW w:type="dxa" w:w="1600"/>
-                  <w:vAlign w:val="center"/>
-                </w:tcPr>
-                <w:p>
-                  <w:r>
-                    <w:rPr>
-                      <w:sz w:val="24"/>
-                    </w:rPr>
-                    <w:t>数值</w:t>
-                  </w:r>
-                </w:p>
-              </w:tc>
-            </w:tr>
-            <w:tr>
-              <w:tc>
-                <w:tcPr>
-                  <w:tcW w:type="dxa" w:w="2400"/>
-                  <w:vAlign w:val="center"/>
-                </w:tcPr>
-                <w:p>
-                  <w:r>
-                    <w:rPr>
-                      <w:sz w:val="24"/>
-                    </w:rPr>
-                  </w:r>
-                </w:p>
-              </w:tc>
-              <w:tc>
-                <w:tcPr>
-                  <w:tcW w:type="dxa" w:w="1100"/>
-                  <w:vAlign w:val="center"/>
-                </w:tcPr>
-                <w:p>
-                  <w:r>
-                    <w:rPr>
-                      <w:sz w:val="24"/>
-                    </w:rPr>
-                  </w:r>
-                </w:p>
-              </w:tc>
-              <w:tc>
-                <w:tcPr>
-                  <w:tcW w:type="dxa" w:w="1100"/>
-                  <w:vAlign w:val="center"/>
-                </w:tcPr>
-                <w:p>
-                  <w:r>
-                    <w:rPr>
-                      <w:sz w:val="24"/>
-                    </w:rPr>
-                  </w:r>
-                </w:p>
-              </w:tc>
-              <w:tc>
-                <w:tcPr>
-                  <w:tcW w:type="dxa" w:w="1600"/>
-                  <w:vAlign w:val="center"/>
-                </w:tcPr>
-                <w:p>
-                  <w:r>
-                    <w:rPr>
-                      <w:sz w:val="24"/>
-                    </w:rPr>
-                  </w:r>
-                </w:p>
-              </w:tc>
-            </w:tr>
-          </w:tbl>
-          <w:p/>
         </w:tc>
       </w:tr>
+      <w:tr>
+        <w:tblPrEx>
+          <w:tblBorders>
+            <w:top w:val="dotted" w:color="auto" w:sz="4" w:space="0"/>
+            <w:left w:val="dotted" w:color="auto" w:sz="4" w:space="0"/>
+            <w:bottom w:val="dotted" w:color="auto" w:sz="4" w:space="0"/>
+            <w:right w:val="dotted" w:color="auto" w:sz="4" w:space="0"/>
+            <w:insideH w:val="none" w:color="auto" w:sz="0" w:space="0"/>
+            <w:insideV w:val="none" w:color="auto" w:sz="0" w:space="0"/>
+          </w:tblBorders>
+          <w:tblCellMar>
+            <w:top w:w="0" w:type="dxa"/>
+            <w:left w:w="108" w:type="dxa"/>
+            <w:bottom w:w="0" w:type="dxa"/>
+            <w:right w:w="108" w:type="dxa"/>
+          </w:tblCellMar>
+        </w:tblPrEx>
+        <w:trPr>
+          <w:trHeight w:val="244" w:hRule="atLeast"/>
+        </w:trPr>
+        <w:tc>
+          <w:tcPr>
+            <w:tcW w:w="9860" w:type="dxa"/>
+            <w:gridSpan w:val="5"/>
+            <w:tcBorders>
+              <w:top w:val="dotted" w:color="auto" w:sz="4" w:space="0"/>
+              <w:left w:val="single" w:color="auto" w:sz="4" w:space="0"/>
+              <w:bottom w:val="dotted" w:color="auto" w:sz="4" w:space="0"/>
+              <w:right w:val="single" w:color="auto" w:sz="4" w:space="0"/>
+            </w:tcBorders>
+            <w:vAlign w:val="center"/>
+          </w:tcPr>
+          <w:p>
+            <w:pPr>
+              <w:spacing w:line="300" w:lineRule="auto"/>
+              <w:rPr>
+                <w:rFonts w:hint="eastAsia" w:hAnsi="Arial" w:cs="Arial"/>
+                <w:kern w:val="0"/>
+                <w:sz w:val="24"/>
+              </w:rPr>
+            </w:pPr>
+            <w:bookmarkStart w:id="0" w:name="_GoBack" w:colFirst="0" w:colLast="3"/>
+            <w:r>
+              <w:rPr>
+                <w:rFonts w:hint="eastAsia"/>
+                <w:b/>
+                <w:sz w:val="24"/>
+              </w:rPr>
+              <w:t>工作场所组分控制参数</w:t>
+            </w:r>
+          </w:p>
+        </w:tc>
+      </w:tr>
+      <w:tr>
+        <w:tblPrEx>
+          <w:tblBorders>
+            <w:top w:val="dotted" w:color="auto" w:sz="4" w:space="0"/>
+            <w:left w:val="dotted" w:color="auto" w:sz="4" w:space="0"/>
+            <w:bottom w:val="dotted" w:color="auto" w:sz="4" w:space="0"/>
+            <w:right w:val="dotted" w:color="auto" w:sz="4" w:space="0"/>
+            <w:insideH w:val="none" w:color="auto" w:sz="0" w:space="0"/>
+            <w:insideV w:val="none" w:color="auto" w:sz="0" w:space="0"/>
+          </w:tblBorders>
+          <w:tblCellMar>
+            <w:top w:w="0" w:type="dxa"/>
+            <w:left w:w="108" w:type="dxa"/>
+            <w:bottom w:w="0" w:type="dxa"/>
+            <w:right w:w="108" w:type="dxa"/>
+          </w:tblCellMar>
+        </w:tblPrEx>
+        <w:trPr>
+          <w:trHeight w:val="244" w:hRule="atLeast"/>
+        </w:trPr>
+        <w:tc>
+          <w:tcPr>
+            <w:tcW w:w="3193" w:type="dxa"/>
+            <w:tcBorders>
+              <w:top w:val="dotted" w:color="auto" w:sz="4" w:space="0"/>
+              <w:left w:val="single" w:color="auto" w:sz="4" w:space="0"/>
+              <w:bottom w:val="dotted" w:color="auto" w:sz="4" w:space="0"/>
+              <w:right w:val="single" w:color="auto" w:sz="4" w:space="0"/>
+            </w:tcBorders>
+            <w:vAlign w:val="center"/>
+          </w:tcPr>
+          <w:p>
+            <w:pPr>
+              <w:spacing w:line="300" w:lineRule="auto"/>
+              <w:jc w:val="both"/>
+              <w:rPr>
+                <w:rFonts w:hint="eastAsia"/>
+                <w:b/>
+                <w:bCs/>
+                <w:sz w:val="24"/>
+              </w:rPr>
+            </w:pPr>
+            <w:r>
+              <w:rPr>
+                <w:rFonts w:hint="eastAsia"/>
+                <w:b/>
+                <w:bCs/>
+                <w:sz w:val="24"/>
+              </w:rPr>
+              <w:t>物质</w:t>
+            </w:r>
+          </w:p>
+        </w:tc>
+        <w:tc>
+          <w:tcPr>
+            <w:tcW w:w="1737" w:type="dxa"/>
+            <w:gridSpan w:val="2"/>
+            <w:tcBorders>
+              <w:top w:val="dotted" w:color="auto" w:sz="4" w:space="0"/>
+              <w:left w:val="single" w:color="auto" w:sz="4" w:space="0"/>
+              <w:bottom w:val="dotted" w:color="auto" w:sz="4" w:space="0"/>
+              <w:right w:val="single" w:color="auto" w:sz="4" w:space="0"/>
+            </w:tcBorders>
+            <w:vAlign w:val="center"/>
+          </w:tcPr>
+          <w:p>
+            <w:pPr>
+              <w:spacing w:line="300" w:lineRule="auto"/>
+              <w:jc w:val="both"/>
+              <w:rPr>
+                <w:rFonts w:hint="eastAsia"/>
+                <w:b/>
+                <w:bCs/>
+                <w:sz w:val="24"/>
+              </w:rPr>
+            </w:pPr>
+            <w:r>
+              <w:rPr>
+                <w:rFonts w:hint="eastAsia"/>
+                <w:b/>
+                <w:bCs/>
+                <w:sz w:val="24"/>
+              </w:rPr>
+              <w:t>依据</w:t>
+            </w:r>
+          </w:p>
+        </w:tc>
+        <w:tc>
+          <w:tcPr>
+            <w:tcW w:w="2465" w:type="dxa"/>
+            <w:tcBorders>
+              <w:top w:val="dotted" w:color="auto" w:sz="4" w:space="0"/>
+              <w:left w:val="single" w:color="auto" w:sz="4" w:space="0"/>
+              <w:bottom w:val="dotted" w:color="auto" w:sz="4" w:space="0"/>
+              <w:right w:val="single" w:color="auto" w:sz="4" w:space="0"/>
+            </w:tcBorders>
+            <w:vAlign w:val="center"/>
+          </w:tcPr>
+          <w:p>
+            <w:pPr>
+              <w:spacing w:line="300" w:lineRule="auto"/>
+              <w:jc w:val="both"/>
+              <w:rPr>
+                <w:rFonts w:hint="eastAsia"/>
+                <w:b/>
+                <w:bCs/>
+                <w:sz w:val="24"/>
+              </w:rPr>
+            </w:pPr>
+            <w:r>
+              <w:rPr>
+                <w:rFonts w:hint="eastAsia"/>
+                <w:b/>
+                <w:bCs/>
+                <w:sz w:val="24"/>
+              </w:rPr>
+              <w:t>类型</w:t>
+            </w:r>
+          </w:p>
+        </w:tc>
+        <w:tc>
+          <w:tcPr>
+            <w:tcW w:w="2465" w:type="dxa"/>
+            <w:tcBorders>
+              <w:top w:val="dotted" w:color="auto" w:sz="4" w:space="0"/>
+              <w:left w:val="single" w:color="auto" w:sz="4" w:space="0"/>
+              <w:bottom w:val="dotted" w:color="auto" w:sz="4" w:space="0"/>
+              <w:right w:val="single" w:color="auto" w:sz="4" w:space="0"/>
+            </w:tcBorders>
+            <w:vAlign w:val="center"/>
+          </w:tcPr>
+          <w:p>
+            <w:pPr>
+              <w:spacing w:line="300" w:lineRule="auto"/>
+              <w:jc w:val="both"/>
+              <w:rPr>
+                <w:rFonts w:hint="eastAsia"/>
+                <w:b/>
+                <w:bCs/>
+                <w:sz w:val="24"/>
+              </w:rPr>
+            </w:pPr>
+            <w:r>
+              <w:rPr>
+                <w:rFonts w:hint="eastAsia"/>
+                <w:b/>
+                <w:bCs/>
+                <w:sz w:val="24"/>
+              </w:rPr>
+              <w:t>数值</w:t>
+            </w:r>
+          </w:p>
+        </w:tc>
+      </w:tr>
+      <w:tr>
+        <w:tblPrEx>
+          <w:tblBorders>
+            <w:top w:val="dotted" w:color="auto" w:sz="4" w:space="0"/>
+            <w:left w:val="dotted" w:color="auto" w:sz="4" w:space="0"/>
+            <w:bottom w:val="dotted" w:color="auto" w:sz="4" w:space="0"/>
+            <w:right w:val="dotted" w:color="auto" w:sz="4" w:space="0"/>
+            <w:insideH w:val="none" w:color="auto" w:sz="0" w:space="0"/>
+            <w:insideV w:val="none" w:color="auto" w:sz="0" w:space="0"/>
+          </w:tblBorders>
+          <w:tblCellMar>
+            <w:top w:w="0" w:type="dxa"/>
+            <w:left w:w="108" w:type="dxa"/>
+            <w:bottom w:w="0" w:type="dxa"/>
+            <w:right w:w="108" w:type="dxa"/>
+          </w:tblCellMar>
+        </w:tblPrEx>
+        <w:trPr>
+          <w:trHeight w:val="244" w:hRule="atLeast"/>
+        </w:trPr>
+        <w:tc>
+          <w:tcPr>
+            <w:tcW w:w="3193" w:type="dxa"/>
+            <w:tcBorders>
+              <w:top w:val="dotted" w:color="auto" w:sz="4" w:space="0"/>
+              <w:left w:val="single" w:color="auto" w:sz="4" w:space="0"/>
+              <w:bottom w:val="dotted" w:color="auto" w:sz="4" w:space="0"/>
+              <w:right w:val="single" w:color="auto" w:sz="4" w:space="0"/>
+            </w:tcBorders>
+            <w:shd w:val="clear"/>
+            <w:vAlign w:val="top"/>
+          </w:tcPr>
+          <w:p>
+            <w:pPr>
+              <w:spacing w:line="300" w:lineRule="auto"/>
+              <w:rPr>
+                <w:rFonts w:hint="default" w:ascii="Times New Roman" w:hAnsi="Times New Roman" w:eastAsia="宋体" w:cs="Times New Roman"/>
+                <w:kern w:val="2"/>
+                <w:sz w:val="24"/>
+                <w:szCs w:val="24"/>
+                <w:lang w:val="en-US" w:eastAsia="zh-CN" w:bidi="ar-SA"/>
+              </w:rPr>
+            </w:pPr>
+            <w:r>
+              <w:rPr>
+                <w:rFonts w:hint="eastAsia"/>
+                <w:sz w:val="24"/>
+              </w:rPr>
+              <w:t>六亚甲基-</w:t>
+            </w:r>
+            <w:r>
+              <w:rPr>
+                <w:sz w:val="24"/>
+              </w:rPr>
+              <w:t>1</w:t>
+            </w:r>
+            <w:r>
+              <w:rPr>
+                <w:rFonts w:hint="eastAsia"/>
+                <w:sz w:val="24"/>
+              </w:rPr>
+              <w:t>,</w:t>
+            </w:r>
+            <w:r>
+              <w:rPr>
+                <w:sz w:val="24"/>
+              </w:rPr>
+              <w:t>6</w:t>
+            </w:r>
+            <w:r>
+              <w:rPr>
+                <w:rFonts w:hint="eastAsia"/>
+                <w:sz w:val="24"/>
+              </w:rPr>
+              <w:t>-二异氰酸酯</w:t>
+            </w:r>
+          </w:p>
+        </w:tc>
+        <w:tc>
+          <w:tcPr>
+            <w:tcW w:w="1737" w:type="dxa"/>
+            <w:gridSpan w:val="2"/>
+            <w:tcBorders>
+              <w:top w:val="dotted" w:color="auto" w:sz="4" w:space="0"/>
+              <w:left w:val="single" w:color="auto" w:sz="4" w:space="0"/>
+              <w:bottom w:val="dotted" w:color="auto" w:sz="4" w:space="0"/>
+              <w:right w:val="single" w:color="auto" w:sz="4" w:space="0"/>
+            </w:tcBorders>
+            <w:shd w:val="clear"/>
+            <w:vAlign w:val="top"/>
+          </w:tcPr>
+          <w:p>
+            <w:pPr>
+              <w:spacing w:line="300" w:lineRule="auto"/>
+              <w:rPr>
+                <w:rFonts w:hint="eastAsia" w:ascii="Times New Roman" w:hAnsi="Times New Roman" w:eastAsia="宋体" w:cs="Times New Roman"/>
+                <w:kern w:val="2"/>
+                <w:sz w:val="24"/>
+                <w:szCs w:val="24"/>
+                <w:lang w:val="en-US" w:eastAsia="zh-CN" w:bidi="ar-SA"/>
+              </w:rPr>
+            </w:pPr>
+            <w:r>
+              <w:rPr>
+                <w:rFonts w:hint="eastAsia"/>
+                <w:sz w:val="24"/>
+              </w:rPr>
+              <w:t>CN</w:t>
+            </w:r>
+            <w:r>
+              <w:rPr>
+                <w:sz w:val="24"/>
+              </w:rPr>
+              <w:t xml:space="preserve"> </w:t>
+            </w:r>
+            <w:r>
+              <w:rPr>
+                <w:rFonts w:hint="eastAsia"/>
+                <w:sz w:val="24"/>
+              </w:rPr>
+              <w:t>OEL</w:t>
+            </w:r>
+          </w:p>
+        </w:tc>
+        <w:tc>
+          <w:tcPr>
+            <w:tcW w:w="2465" w:type="dxa"/>
+            <w:tcBorders>
+              <w:top w:val="dotted" w:color="auto" w:sz="4" w:space="0"/>
+              <w:left w:val="single" w:color="auto" w:sz="4" w:space="0"/>
+              <w:bottom w:val="dotted" w:color="auto" w:sz="4" w:space="0"/>
+              <w:right w:val="single" w:color="auto" w:sz="4" w:space="0"/>
+            </w:tcBorders>
+            <w:shd w:val="clear"/>
+            <w:vAlign w:val="top"/>
+          </w:tcPr>
+          <w:p>
+            <w:pPr>
+              <w:spacing w:line="300" w:lineRule="auto"/>
+              <w:rPr>
+                <w:rFonts w:hint="eastAsia" w:ascii="Times New Roman" w:hAnsi="Times New Roman" w:eastAsia="宋体" w:cs="Times New Roman"/>
+                <w:kern w:val="2"/>
+                <w:sz w:val="24"/>
+                <w:szCs w:val="24"/>
+                <w:lang w:val="en-US" w:eastAsia="zh-CN" w:bidi="ar-SA"/>
+              </w:rPr>
+            </w:pPr>
+            <w:r>
+              <w:rPr>
+                <w:rFonts w:hint="eastAsia"/>
+                <w:sz w:val="24"/>
+              </w:rPr>
+              <w:t>TWA</w:t>
+            </w:r>
+          </w:p>
+        </w:tc>
+        <w:tc>
+          <w:tcPr>
+            <w:tcW w:w="2465" w:type="dxa"/>
+            <w:tcBorders>
+              <w:top w:val="dotted" w:color="auto" w:sz="4" w:space="0"/>
+              <w:left w:val="single" w:color="auto" w:sz="4" w:space="0"/>
+              <w:bottom w:val="dotted" w:color="auto" w:sz="4" w:space="0"/>
+              <w:right w:val="single" w:color="auto" w:sz="4" w:space="0"/>
+            </w:tcBorders>
+            <w:shd w:val="clear"/>
+            <w:vAlign w:val="top"/>
+          </w:tcPr>
+          <w:p>
+            <w:pPr>
+              <w:spacing w:line="300" w:lineRule="auto"/>
+              <w:rPr>
+                <w:rFonts w:hint="eastAsia" w:ascii="Times New Roman" w:hAnsi="Times New Roman" w:eastAsia="宋体" w:cs="Times New Roman"/>
+                <w:kern w:val="2"/>
+                <w:sz w:val="24"/>
+                <w:szCs w:val="24"/>
+                <w:lang w:val="en-US" w:eastAsia="zh-CN" w:bidi="ar-SA"/>
+              </w:rPr>
+            </w:pPr>
+            <w:r>
+              <w:rPr>
+                <w:rFonts w:hint="eastAsia"/>
+                <w:sz w:val="24"/>
+              </w:rPr>
+              <w:t>0</w:t>
+            </w:r>
+            <w:r>
+              <w:rPr>
+                <w:sz w:val="24"/>
+              </w:rPr>
+              <w:t xml:space="preserve">.03 </w:t>
+            </w:r>
+            <w:r>
+              <w:rPr>
+                <w:rFonts w:hint="eastAsia"/>
+                <w:sz w:val="24"/>
+              </w:rPr>
+              <w:t>mg</w:t>
+            </w:r>
+            <w:r>
+              <w:rPr>
+                <w:sz w:val="24"/>
+              </w:rPr>
+              <w:t>/m</w:t>
+            </w:r>
+            <w:r>
+              <w:rPr>
+                <w:sz w:val="24"/>
+                <w:vertAlign w:val="superscript"/>
+              </w:rPr>
+              <w:t>3</w:t>
+            </w:r>
+          </w:p>
+        </w:tc>
+      </w:tr>
+      <w:tr>
+        <w:tblPrEx>
+          <w:tblBorders>
+            <w:top w:val="dotted" w:color="auto" w:sz="4" w:space="0"/>
+            <w:left w:val="dotted" w:color="auto" w:sz="4" w:space="0"/>
+            <w:bottom w:val="dotted" w:color="auto" w:sz="4" w:space="0"/>
+            <w:right w:val="dotted" w:color="auto" w:sz="4" w:space="0"/>
+            <w:insideH w:val="none" w:color="auto" w:sz="0" w:space="0"/>
+            <w:insideV w:val="none" w:color="auto" w:sz="0" w:space="0"/>
+          </w:tblBorders>
+          <w:tblCellMar>
+            <w:top w:w="0" w:type="dxa"/>
+            <w:left w:w="108" w:type="dxa"/>
+            <w:bottom w:w="0" w:type="dxa"/>
+            <w:right w:w="108" w:type="dxa"/>
+          </w:tblCellMar>
+        </w:tblPrEx>
+        <w:trPr>
+          <w:trHeight w:val="244" w:hRule="atLeast"/>
+        </w:trPr>
+        <w:tc>
+          <w:tcPr>
+            <w:tcW w:w="3193" w:type="dxa"/>
+            <w:tcBorders>
+              <w:top w:val="dotted" w:color="auto" w:sz="4" w:space="0"/>
+              <w:left w:val="single" w:color="auto" w:sz="4" w:space="0"/>
+              <w:bottom w:val="single" w:color="auto" w:sz="4" w:space="0"/>
+              <w:right w:val="single" w:color="auto" w:sz="4" w:space="0"/>
+            </w:tcBorders>
+            <w:shd w:val="clear"/>
+            <w:vAlign w:val="top"/>
+          </w:tcPr>
+          <w:p>
+            <w:pPr>
+              <w:spacing w:line="300" w:lineRule="auto"/>
+              <w:rPr>
+                <w:rFonts w:hint="eastAsia" w:ascii="Times New Roman" w:hAnsi="Times New Roman" w:eastAsia="宋体" w:cs="Times New Roman"/>
+                <w:kern w:val="2"/>
+                <w:sz w:val="24"/>
+                <w:szCs w:val="24"/>
+                <w:lang w:val="en-US" w:eastAsia="zh-CN" w:bidi="ar-SA"/>
+              </w:rPr>
+            </w:pPr>
+            <w:r>
+              <w:rPr>
+                <w:rFonts w:hint="eastAsia"/>
+                <w:sz w:val="24"/>
+              </w:rPr>
+              <w:t>丙二醇甲醚醋酸酯</w:t>
+            </w:r>
+          </w:p>
+        </w:tc>
+        <w:tc>
+          <w:tcPr>
+            <w:tcW w:w="1737" w:type="dxa"/>
+            <w:gridSpan w:val="2"/>
+            <w:tcBorders>
+              <w:top w:val="dotted" w:color="auto" w:sz="4" w:space="0"/>
+              <w:left w:val="single" w:color="auto" w:sz="4" w:space="0"/>
+              <w:bottom w:val="single" w:color="auto" w:sz="4" w:space="0"/>
+              <w:right w:val="single" w:color="auto" w:sz="4" w:space="0"/>
+            </w:tcBorders>
+            <w:shd w:val="clear"/>
+            <w:vAlign w:val="top"/>
+          </w:tcPr>
+          <w:p>
+            <w:pPr>
+              <w:spacing w:line="300" w:lineRule="auto"/>
+              <w:rPr>
+                <w:rFonts w:hint="eastAsia" w:ascii="Times New Roman" w:hAnsi="Times New Roman" w:eastAsia="宋体" w:cs="Times New Roman"/>
+                <w:kern w:val="2"/>
+                <w:sz w:val="24"/>
+                <w:szCs w:val="24"/>
+                <w:lang w:val="en-US" w:eastAsia="zh-CN" w:bidi="ar-SA"/>
+              </w:rPr>
+            </w:pPr>
+            <w:r>
+              <w:rPr>
+                <w:rFonts w:hint="eastAsia"/>
+                <w:sz w:val="24"/>
+              </w:rPr>
+              <w:t>CN</w:t>
+            </w:r>
+            <w:r>
+              <w:rPr>
+                <w:sz w:val="24"/>
+              </w:rPr>
+              <w:t xml:space="preserve"> </w:t>
+            </w:r>
+            <w:r>
+              <w:rPr>
+                <w:rFonts w:hint="eastAsia"/>
+                <w:sz w:val="24"/>
+              </w:rPr>
+              <w:t>OEL</w:t>
+            </w:r>
+          </w:p>
+        </w:tc>
+        <w:tc>
+          <w:tcPr>
+            <w:tcW w:w="2465" w:type="dxa"/>
+            <w:tcBorders>
+              <w:top w:val="dotted" w:color="auto" w:sz="4" w:space="0"/>
+              <w:left w:val="single" w:color="auto" w:sz="4" w:space="0"/>
+              <w:bottom w:val="single" w:color="auto" w:sz="4" w:space="0"/>
+              <w:right w:val="single" w:color="auto" w:sz="4" w:space="0"/>
+            </w:tcBorders>
+            <w:shd w:val="clear"/>
+            <w:vAlign w:val="top"/>
+          </w:tcPr>
+          <w:p>
+            <w:pPr>
+              <w:spacing w:line="300" w:lineRule="auto"/>
+              <w:rPr>
+                <w:rFonts w:hint="eastAsia" w:ascii="Times New Roman" w:hAnsi="Times New Roman" w:eastAsia="宋体" w:cs="Times New Roman"/>
+                <w:kern w:val="2"/>
+                <w:sz w:val="24"/>
+                <w:szCs w:val="24"/>
+                <w:lang w:val="en-US" w:eastAsia="zh-CN" w:bidi="ar-SA"/>
+              </w:rPr>
+            </w:pPr>
+            <w:r>
+              <w:rPr>
+                <w:rFonts w:hint="eastAsia"/>
+                <w:sz w:val="24"/>
+              </w:rPr>
+              <w:t>TWA</w:t>
+            </w:r>
+          </w:p>
+        </w:tc>
+        <w:tc>
+          <w:tcPr>
+            <w:tcW w:w="2465" w:type="dxa"/>
+            <w:tcBorders>
+              <w:top w:val="dotted" w:color="auto" w:sz="4" w:space="0"/>
+              <w:left w:val="single" w:color="auto" w:sz="4" w:space="0"/>
+              <w:bottom w:val="single" w:color="auto" w:sz="4" w:space="0"/>
+              <w:right w:val="single" w:color="auto" w:sz="4" w:space="0"/>
+            </w:tcBorders>
+            <w:shd w:val="clear"/>
+            <w:vAlign w:val="top"/>
+          </w:tcPr>
+          <w:p>
+            <w:pPr>
+              <w:spacing w:line="300" w:lineRule="auto"/>
+              <w:rPr>
+                <w:rFonts w:hint="eastAsia" w:ascii="Times New Roman" w:hAnsi="Times New Roman" w:eastAsia="宋体" w:cs="Times New Roman"/>
+                <w:kern w:val="2"/>
+                <w:sz w:val="24"/>
+                <w:szCs w:val="24"/>
+                <w:lang w:val="en-US" w:eastAsia="zh-CN" w:bidi="ar-SA"/>
+              </w:rPr>
+            </w:pPr>
+            <w:r>
+              <w:rPr>
+                <w:sz w:val="24"/>
+              </w:rPr>
+              <w:t xml:space="preserve">100 </w:t>
+            </w:r>
+            <w:r>
+              <w:rPr>
+                <w:rFonts w:hint="eastAsia"/>
+                <w:sz w:val="24"/>
+              </w:rPr>
+              <w:t>mg</w:t>
+            </w:r>
+            <w:r>
+              <w:rPr>
+                <w:sz w:val="24"/>
+              </w:rPr>
+              <w:t>/m</w:t>
+            </w:r>
+            <w:r>
+              <w:rPr>
+                <w:sz w:val="24"/>
+                <w:vertAlign w:val="superscript"/>
+              </w:rPr>
+              <w:t>3</w:t>
+            </w:r>
+          </w:p>
+        </w:tc>
+      </w:tr>
+      <w:bookmarkEnd w:id="0"/>
     </w:tbl>
     <w:p>
       <w:pPr>
@@ -12153,7 +12633,6 @@
                 <w:sz w:val="24"/>
               </w:rPr>
             </w:pPr>
-            <w:bookmarkStart w:id="0" w:name="_GoBack" w:colFirst="0" w:colLast="2"/>
             <w:r>
               <w:rPr>
                 <w:rFonts w:hint="eastAsia" w:hAnsi="Arial"/>
@@ -12851,7 +13330,6 @@
           </w:p>
         </w:tc>
       </w:tr>
-      <w:bookmarkEnd w:id="0"/>
       <w:tr>
         <w:tblPrEx>
           <w:tblBorders>

</xml_diff>

<commit_message>
Update MSDS overwrite skill to v3.18.0
</commit_message>
<xml_diff>
--- a/MSDS Skill/examples/template_reference.docx
+++ b/MSDS Skill/examples/template_reference.docx
@@ -1210,7 +1210,6 @@
           </w:tblCellMar>
         </w:tblPrEx>
         <w:trPr>
-          <w:cantSplit/>
           <w:tblHeader/>
         </w:trPr>
         <w:tc>
@@ -5800,7 +5799,6 @@
           </w:tblCellMar>
         </w:tblPrEx>
         <w:trPr>
-          <w:cantSplit/>
           <w:tblHeader/>
         </w:trPr>
         <w:tc>
@@ -5859,7 +5857,6 @@
           </w:tblCellMar>
         </w:tblPrEx>
         <w:trPr>
-          <w:cantSplit/>
           <w:trHeight w:val="578" w:hRule="atLeast"/>
         </w:trPr>
         <w:tc>
@@ -6029,7 +6026,6 @@
           </w:tblCellMar>
         </w:tblPrEx>
         <w:trPr>
-          <w:cantSplit/>
           <w:trHeight w:val="270" w:hRule="atLeast"/>
         </w:trPr>
         <w:tc>
@@ -12539,7 +12535,6 @@
           </w:tblCellMar>
         </w:tblPrEx>
         <w:trPr>
-          <w:cantSplit/>
           <w:tblHeader/>
         </w:trPr>
         <w:tc>
@@ -12599,7 +12594,6 @@
           </w:tblCellMar>
         </w:tblPrEx>
         <w:trPr>
-          <w:cantSplit/>
           <w:trHeight w:val="285" w:hRule="atLeast"/>
         </w:trPr>
         <w:tc>
@@ -12661,7 +12655,6 @@
           </w:tblCellMar>
         </w:tblPrEx>
         <w:trPr>
-          <w:cantSplit/>
           <w:trHeight w:val="285" w:hRule="atLeast"/>
         </w:trPr>
         <w:tc>
@@ -12725,7 +12718,6 @@
           </w:tblCellMar>
         </w:tblPrEx>
         <w:trPr>
-          <w:cantSplit/>
           <w:trHeight w:val="285" w:hRule="atLeast"/>
         </w:trPr>
         <w:tc>
@@ -12925,7 +12917,6 @@
           </w:tblCellMar>
         </w:tblPrEx>
         <w:trPr>
-          <w:cantSplit/>
           <w:trHeight w:val="285" w:hRule="atLeast"/>
         </w:trPr>
         <w:tc>
@@ -13087,7 +13078,6 @@
           </w:tblCellMar>
         </w:tblPrEx>
         <w:trPr>
-          <w:cantSplit/>
           <w:trHeight w:val="424" w:hRule="atLeast"/>
         </w:trPr>
         <w:tc>
@@ -13249,7 +13239,6 @@
           </w:tblCellMar>
         </w:tblPrEx>
         <w:trPr>
-          <w:cantSplit/>
           <w:trHeight w:val="285" w:hRule="atLeast"/>
         </w:trPr>
         <w:tc>
@@ -13348,7 +13337,6 @@
           </w:tblCellMar>
         </w:tblPrEx>
         <w:trPr>
-          <w:cantSplit/>
           <w:trHeight w:val="285" w:hRule="atLeast"/>
         </w:trPr>
         <w:tc>
@@ -13580,7 +13568,6 @@
           </w:tblCellMar>
         </w:tblPrEx>
         <w:trPr>
-          <w:cantSplit/>
           <w:trHeight w:val="285" w:hRule="atLeast"/>
         </w:trPr>
         <w:tc>
@@ -13810,7 +13797,6 @@
           </w:tblCellMar>
         </w:tblPrEx>
         <w:trPr>
-          <w:cantSplit/>
           <w:trHeight w:val="1169" w:hRule="atLeast"/>
         </w:trPr>
         <w:tc>
@@ -14039,7 +14025,6 @@
           </w:tblCellMar>
         </w:tblPrEx>
         <w:trPr>
-          <w:cantSplit/>
           <w:trHeight w:val="285" w:hRule="atLeast"/>
         </w:trPr>
         <w:tc>
@@ -14176,7 +14161,6 @@
           </w:tblCellMar>
         </w:tblPrEx>
         <w:trPr>
-          <w:cantSplit/>
           <w:trHeight w:val="285" w:hRule="atLeast"/>
         </w:trPr>
         <w:tc>
@@ -14315,7 +14299,6 @@
           </w:tblCellMar>
         </w:tblPrEx>
         <w:trPr>
-          <w:cantSplit/>
           <w:trHeight w:val="285" w:hRule="atLeast"/>
         </w:trPr>
         <w:tc>
@@ -14495,7 +14478,6 @@
           </w:tblCellMar>
         </w:tblPrEx>
         <w:trPr>
-          <w:cantSplit/>
           <w:trHeight w:val="285" w:hRule="atLeast"/>
         </w:trPr>
         <w:tc>
@@ -14647,7 +14629,6 @@
           </w:tblCellMar>
         </w:tblPrEx>
         <w:trPr>
-          <w:cantSplit/>
           <w:trHeight w:val="285" w:hRule="atLeast"/>
         </w:trPr>
         <w:tc>
@@ -14797,7 +14778,6 @@
           </w:tblCellMar>
         </w:tblPrEx>
         <w:trPr>
-          <w:cantSplit/>
           <w:trHeight w:val="285" w:hRule="atLeast"/>
         </w:trPr>
         <w:tc>

</xml_diff>

<commit_message>
feat(msds): enforce global value typography in 3.27.3
</commit_message>
<xml_diff>
--- a/MSDS Skill/examples/template_reference.docx
+++ b/MSDS Skill/examples/template_reference.docx
@@ -316,9 +316,10 @@
             </w:pPr>
             <w:r>
               <w:rPr>
-                <w:rFonts w:hint="eastAsia" w:hAnsi="Arial"/>
+                <w:rFonts w:hint="eastAsia" w:hAnsi="宋体" w:ascii="宋体" w:eastAsia="宋体" w:cs="宋体"/>
                 <w:sz w:val="24"/>
                 <w:lang w:val="en-US" w:eastAsia="zh-CN"/>
+                <w:szCs w:val="24"/>
               </w:rPr>
               <w:t>此处填写产品中文名称+型号</w:t>
             </w:r>
@@ -428,9 +429,10 @@
             </w:pPr>
             <w:r>
               <w:rPr>
-                <w:rFonts w:hint="eastAsia" w:hAnsi="Arial"/>
+                <w:rFonts w:hint="eastAsia" w:hAnsi="宋体" w:ascii="宋体" w:eastAsia="宋体" w:cs="宋体"/>
                 <w:sz w:val="24"/>
                 <w:lang w:val="en-US" w:eastAsia="zh-CN"/>
+                <w:szCs w:val="24"/>
               </w:rPr>
               <w:t>此处填写化学品分类名称</w:t>
             </w:r>
@@ -575,9 +577,10 @@
             </w:pPr>
             <w:r>
               <w:rPr>
-                <w:rFonts w:hint="eastAsia"/>
+                <w:rFonts w:hint="eastAsia" w:ascii="宋体" w:hAnsi="宋体" w:eastAsia="宋体" w:cs="宋体"/>
                 <w:sz w:val="24"/>
                 <w:lang w:val="en-US" w:eastAsia="zh-CN"/>
+                <w:szCs w:val="24"/>
               </w:rPr>
               <w:t>此处填写使用建议和使用限制</w:t>
             </w:r>
@@ -818,9 +821,10 @@
             </w:pPr>
             <w:r>
               <w:rPr>
-                <w:rFonts w:hint="eastAsia" w:cs="Arial"/>
+                <w:rFonts w:hint="eastAsia" w:cs="宋体" w:ascii="宋体" w:hAnsi="宋体" w:eastAsia="宋体"/>
                 <w:kern w:val="0"/>
                 <w:sz w:val="24"/>
+                <w:szCs w:val="24"/>
               </w:rPr>
               <w:t>广州冠志新材料科技有限公司</w:t>
             </w:r>
@@ -929,8 +933,9 @@
             </w:pPr>
             <w:r>
               <w:rPr>
-                <w:rFonts w:hint="eastAsia"/>
-                <w:sz w:val="24"/>
+                <w:rFonts w:hint="eastAsia" w:ascii="宋体" w:hAnsi="宋体" w:eastAsia="宋体" w:cs="宋体"/>
+                <w:sz w:val="24"/>
+                <w:szCs w:val="24"/>
               </w:rPr>
               <w:t>地址：广州市萝岗区科学城掬泉路3号广州国际企业孵化器A区1106室</w:t>
             </w:r>
@@ -1040,7 +1045,9 @@
             </w:pPr>
             <w:r>
               <w:rPr>
-                <w:sz w:val="24"/>
+                <w:rFonts w:ascii="宋体" w:hAnsi="宋体" w:eastAsia="宋体" w:cs="宋体"/>
+                <w:sz w:val="24"/>
+                <w:szCs w:val="24"/>
               </w:rPr>
               <w:t>86-20-82567990</w:t>
             </w:r>
@@ -1150,7 +1157,9 @@
             </w:pPr>
             <w:r>
               <w:rPr>
-                <w:sz w:val="24"/>
+                <w:rFonts w:ascii="宋体" w:hAnsi="宋体" w:eastAsia="宋体" w:cs="宋体"/>
+                <w:sz w:val="24"/>
+                <w:szCs w:val="24"/>
               </w:rPr>
               <w:t>86-20-32214789</w:t>
             </w:r>
@@ -1515,8 +1524,9 @@
             </w:pPr>
             <w:r>
               <w:rPr>
-                <w:rFonts w:hint="eastAsia"/>
-                <w:sz w:val="24"/>
+                <w:rFonts w:hint="eastAsia" w:ascii="宋体" w:hAnsi="宋体" w:eastAsia="宋体" w:cs="宋体"/>
+                <w:sz w:val="24"/>
+                <w:szCs w:val="24"/>
               </w:rPr>
               <w:t>易燃液体，类别4（H227）</w:t>
             </w:r>
@@ -1672,11 +1682,12 @@
             </w:pPr>
             <w:r>
               <w:rPr>
-                <w:rFonts w:hint="eastAsia"/>
+                <w:rFonts w:hint="eastAsia" w:ascii="宋体" w:hAnsi="宋体" w:eastAsia="宋体" w:cs="宋体"/>
                 <w:b w:val="0"/>
                 <w:bCs/>
                 <w:sz w:val="24"/>
                 <w:lang w:val="en-US" w:eastAsia="zh-CN"/>
+                <w:szCs w:val="24"/>
               </w:rPr>
               <w:t>无</w:t>
             </w:r>
@@ -1808,11 +1819,12 @@
             </w:pPr>
             <w:r>
               <w:rPr>
-                <w:rFonts w:hint="eastAsia"/>
+                <w:rFonts w:hint="eastAsia" w:ascii="宋体" w:hAnsi="宋体" w:eastAsia="宋体" w:cs="宋体"/>
                 <w:b w:val="0"/>
                 <w:bCs/>
                 <w:sz w:val="24"/>
                 <w:lang w:val="en-US" w:eastAsia="zh-CN"/>
+                <w:szCs w:val="24"/>
               </w:rPr>
               <w:t>无</w:t>
             </w:r>
@@ -1966,8 +1978,9 @@
             </w:pPr>
             <w:r>
               <w:rPr>
-                <w:rFonts w:hint="eastAsia"/>
-                <w:sz w:val="24"/>
+                <w:rFonts w:hint="eastAsia" w:ascii="宋体" w:hAnsi="宋体" w:eastAsia="宋体" w:cs="宋体"/>
+                <w:sz w:val="24"/>
+                <w:szCs w:val="24"/>
               </w:rPr>
               <w:t>警告</w:t>
             </w:r>
@@ -2122,10 +2135,11 @@
             </w:pPr>
             <w:r>
               <w:rPr>
-                <w:rFonts w:hint="eastAsia" w:hAnsi="Arial" w:cs="Arial"/>
+                <w:rFonts w:hint="eastAsia" w:hAnsi="宋体" w:cs="宋体" w:ascii="宋体" w:eastAsia="宋体"/>
                 <w:kern w:val="0"/>
                 <w:sz w:val="24"/>
                 <w:lang w:val="en-US" w:eastAsia="zh-CN"/>
+                <w:szCs w:val="24"/>
               </w:rPr>
               <w:t>H316造成轻微皮肤刺激。</w:t>
             </w:r>
@@ -2274,10 +2288,11 @@
             </w:pPr>
             <w:r>
               <w:rPr>
-                <w:rFonts w:hint="eastAsia" w:hAnsi="Arial" w:cs="Arial"/>
+                <w:rFonts w:hint="eastAsia" w:hAnsi="宋体" w:cs="宋体" w:ascii="宋体" w:eastAsia="宋体"/>
                 <w:kern w:val="0"/>
                 <w:sz w:val="24"/>
                 <w:lang w:val="en-US" w:eastAsia="zh-CN"/>
+                <w:szCs w:val="24"/>
               </w:rPr>
               <w:t>预防措施：</w:t>
             </w:r>
@@ -2308,10 +2323,11 @@
             </w:pPr>
             <w:r>
               <w:rPr>
-                <w:rFonts w:hint="eastAsia" w:hAnsi="Arial" w:cs="Arial"/>
+                <w:rFonts w:hint="eastAsia" w:hAnsi="宋体" w:cs="宋体" w:ascii="宋体" w:eastAsia="宋体"/>
                 <w:kern w:val="0"/>
                 <w:sz w:val="24"/>
                 <w:lang w:val="en-US" w:eastAsia="zh-CN"/>
+                <w:szCs w:val="24"/>
               </w:rPr>
               <w:t>P210 远离热源、热表面、火花、明火和其他点火源。禁止吸烟。</w:t>
             </w:r>
@@ -2447,10 +2463,11 @@
             </w:pPr>
             <w:r>
               <w:rPr>
-                <w:rFonts w:hint="eastAsia" w:hAnsi="Arial" w:cs="Arial"/>
+                <w:rFonts w:hint="eastAsia" w:hAnsi="宋体" w:cs="宋体" w:ascii="宋体" w:eastAsia="宋体"/>
                 <w:kern w:val="0"/>
                 <w:sz w:val="24"/>
                 <w:lang w:val="en-US" w:eastAsia="zh-CN"/>
+                <w:szCs w:val="24"/>
               </w:rPr>
               <w:t>喷涂使用时可能形成雾滴或气溶胶，应避免吸入。</w:t>
             </w:r>
@@ -2582,10 +2599,11 @@
             </w:pPr>
             <w:r>
               <w:rPr>
-                <w:rFonts w:hint="eastAsia" w:hAnsi="Arial" w:cs="Arial"/>
+                <w:rFonts w:hint="eastAsia" w:hAnsi="宋体" w:cs="宋体" w:ascii="宋体" w:eastAsia="宋体"/>
                 <w:kern w:val="0"/>
                 <w:sz w:val="24"/>
                 <w:lang w:val="en-US" w:eastAsia="zh-CN"/>
+                <w:szCs w:val="24"/>
               </w:rPr>
               <w:t>吸入：</w:t>
             </w:r>
@@ -2697,10 +2715,11 @@
             </w:pPr>
             <w:r>
               <w:rPr>
-                <w:rFonts w:hint="eastAsia" w:hAnsi="Arial" w:cs="Arial"/>
+                <w:rFonts w:hint="eastAsia" w:hAnsi="宋体" w:cs="宋体" w:ascii="宋体" w:eastAsia="宋体"/>
                 <w:kern w:val="0"/>
                 <w:sz w:val="24"/>
                 <w:lang w:val="en-US" w:eastAsia="zh-CN"/>
+                <w:szCs w:val="24"/>
               </w:rPr>
               <w:t>食入：</w:t>
             </w:r>
@@ -2812,10 +2831,11 @@
             </w:pPr>
             <w:r>
               <w:rPr>
-                <w:rFonts w:hint="eastAsia" w:hAnsi="Arial" w:cs="Arial"/>
+                <w:rFonts w:hint="eastAsia" w:hAnsi="宋体" w:cs="宋体" w:ascii="宋体" w:eastAsia="宋体"/>
                 <w:kern w:val="0"/>
                 <w:sz w:val="24"/>
                 <w:lang w:val="en-US" w:eastAsia="zh-CN"/>
+                <w:szCs w:val="24"/>
               </w:rPr>
               <w:t>皮肤：</w:t>
             </w:r>
@@ -2927,10 +2947,11 @@
             </w:pPr>
             <w:r>
               <w:rPr>
-                <w:rFonts w:hint="eastAsia" w:hAnsi="Arial" w:cs="Arial"/>
+                <w:rFonts w:hint="eastAsia" w:hAnsi="宋体" w:cs="宋体" w:ascii="宋体" w:eastAsia="宋体"/>
                 <w:kern w:val="0"/>
                 <w:sz w:val="24"/>
                 <w:lang w:val="en-US" w:eastAsia="zh-CN"/>
+                <w:szCs w:val="24"/>
               </w:rPr>
               <w:t>眼睛：</w:t>
             </w:r>
@@ -3042,10 +3063,11 @@
             </w:pPr>
             <w:r>
               <w:rPr>
-                <w:rFonts w:hint="eastAsia" w:hAnsi="Arial" w:cs="Arial"/>
+                <w:rFonts w:hint="eastAsia" w:hAnsi="宋体" w:cs="宋体" w:ascii="宋体" w:eastAsia="宋体"/>
                 <w:kern w:val="0"/>
                 <w:sz w:val="24"/>
                 <w:lang w:val="en-US" w:eastAsia="zh-CN"/>
+                <w:szCs w:val="24"/>
               </w:rPr>
               <w:t>症状和体征：</w:t>
             </w:r>
@@ -3178,19 +3200,21 @@
             </w:pPr>
             <w:r>
               <w:rPr>
-                <w:rFonts w:hint="eastAsia" w:hAnsi="Arial" w:cs="Arial"/>
+                <w:rFonts w:hint="eastAsia" w:hAnsi="宋体" w:cs="宋体" w:ascii="宋体" w:eastAsia="宋体"/>
                 <w:kern w:val="0"/>
                 <w:sz w:val="24"/>
                 <w:lang w:val="en-US" w:eastAsia="zh-CN"/>
+                <w:szCs w:val="24"/>
               </w:rPr>
               <w:t>如：对水生生物有毒。</w:t>
             </w:r>
             <w:r>
               <w:rPr>
-                <w:rFonts w:hint="default" w:hAnsi="Arial" w:cs="Arial"/>
+                <w:rFonts w:hint="default" w:hAnsi="宋体" w:cs="宋体" w:ascii="宋体" w:eastAsia="宋体"/>
                 <w:kern w:val="0"/>
                 <w:sz w:val="24"/>
                 <w:lang w:val="en-US" w:eastAsia="zh-CN"/>
+                <w:szCs w:val="24"/>
               </w:rPr>
               <w:t>可能对水生环境造成长期有害影响</w:t>
             </w:r>
@@ -3323,10 +3347,11 @@
             </w:pPr>
             <w:r>
               <w:rPr>
-                <w:rFonts w:hint="eastAsia" w:hAnsi="Arial" w:cs="Arial"/>
+                <w:rFonts w:hint="eastAsia" w:hAnsi="宋体" w:cs="宋体" w:ascii="宋体" w:eastAsia="宋体"/>
                 <w:kern w:val="0"/>
                 <w:sz w:val="24"/>
                 <w:lang w:val="en-US" w:eastAsia="zh-CN"/>
+                <w:szCs w:val="24"/>
               </w:rPr>
               <w:t>无</w:t>
             </w:r>
@@ -3524,6 +3549,7 @@
               <w:bottom w:val="dotted" w:color="auto" w:sz="4" w:space="0"/>
               <w:right w:val="single" w:color="auto" w:sz="4" w:space="0"/>
             </w:tcBorders>
+            <w:vAlign w:val="center"/>
           </w:tcPr>
           <w:p>
             <w:pPr>
@@ -3552,9 +3578,10 @@
             </w:pPr>
             <w:r>
               <w:rPr>
-                <w:rFonts w:hint="eastAsia" w:hAnsi="Arial" w:cs="Arial"/>
+                <w:rFonts w:hint="eastAsia" w:hAnsi="宋体" w:cs="宋体" w:ascii="宋体" w:eastAsia="宋体"/>
                 <w:kern w:val="0"/>
                 <w:sz w:val="24"/>
+                <w:szCs w:val="24"/>
               </w:rPr>
               <w:t>混合物</w:t>
             </w:r>
@@ -3948,7 +3975,7 @@
               <w:snapToGrid/>
               <w:spacing w:line="300" w:lineRule="auto"/>
               <w:ind w:right="480"/>
-              <w:jc w:val="center"/>
+              <w:jc w:val="left"/>
               <w:textAlignment w:val="auto"/>
               <w:rPr>
                 <w:rFonts w:hint="default" w:ascii="Times New Roman" w:hAnsi="Times New Roman" w:eastAsia="宋体" w:cs="Times New Roman"/>
@@ -3962,7 +3989,7 @@
             </w:pPr>
             <w:r>
               <w:rPr>
-                <w:rFonts w:hint="eastAsia" w:cs="Times New Roman"/>
+                <w:rFonts w:hint="eastAsia" w:cs="宋体" w:ascii="宋体" w:hAnsi="宋体" w:eastAsia="宋体"/>
                 <w:b w:val="0"/>
                 <w:bCs/>
                 <w:kern w:val="2"/>
@@ -4002,7 +4029,7 @@
               <w:snapToGrid/>
               <w:spacing w:line="300" w:lineRule="auto"/>
               <w:ind w:right="480" w:rightChars="0"/>
-              <w:jc w:val="center"/>
+              <w:jc w:val="left"/>
               <w:textAlignment w:val="auto"/>
               <w:rPr>
                 <w:rFonts w:hint="eastAsia"/>
@@ -4012,9 +4039,10 @@
             </w:pPr>
             <w:r>
               <w:rPr>
-                <w:rFonts w:hint="eastAsia"/>
+                <w:rFonts w:hint="eastAsia" w:ascii="宋体" w:hAnsi="宋体" w:eastAsia="宋体" w:cs="宋体"/>
                 <w:sz w:val="24"/>
                 <w:lang w:val="en-US" w:eastAsia="zh-CN"/>
+                <w:szCs w:val="24"/>
               </w:rPr>
               <w:t>商业机密</w:t>
             </w:r>
@@ -4048,7 +4076,7 @@
               <w:snapToGrid/>
               <w:spacing w:line="300" w:lineRule="auto"/>
               <w:ind w:right="480"/>
-              <w:jc w:val="center"/>
+              <w:jc w:val="left"/>
               <w:textAlignment w:val="auto"/>
               <w:rPr>
                 <w:rFonts w:hint="default" w:ascii="Times New Roman" w:hAnsi="Times New Roman" w:eastAsia="宋体" w:cs="Times New Roman"/>
@@ -4060,9 +4088,10 @@
             </w:pPr>
             <w:r>
               <w:rPr>
-                <w:rFonts w:hint="eastAsia"/>
+                <w:rFonts w:hint="eastAsia" w:ascii="宋体" w:hAnsi="宋体" w:eastAsia="宋体" w:cs="宋体"/>
                 <w:sz w:val="24"/>
                 <w:lang w:val="en-US" w:eastAsia="zh-CN"/>
+                <w:szCs w:val="24"/>
               </w:rPr>
               <w:t>&gt; n</w:t>
             </w:r>
@@ -4117,7 +4146,7 @@
               <w:snapToGrid/>
               <w:spacing w:line="300" w:lineRule="auto"/>
               <w:ind w:right="480"/>
-              <w:jc w:val="center"/>
+              <w:jc w:val="left"/>
               <w:textAlignment w:val="auto"/>
               <w:rPr>
                 <w:rFonts w:hint="default" w:ascii="Times New Roman" w:hAnsi="Times New Roman" w:eastAsia="宋体" w:cs="Times New Roman"/>
@@ -4131,7 +4160,7 @@
             </w:pPr>
             <w:r>
               <w:rPr>
-                <w:rFonts w:hint="eastAsia" w:cs="Times New Roman"/>
+                <w:rFonts w:hint="eastAsia" w:cs="宋体" w:ascii="宋体" w:hAnsi="宋体" w:eastAsia="宋体"/>
                 <w:b w:val="0"/>
                 <w:bCs/>
                 <w:kern w:val="2"/>
@@ -4171,7 +4200,7 @@
               <w:snapToGrid/>
               <w:spacing w:line="300" w:lineRule="auto"/>
               <w:ind w:right="480"/>
-              <w:jc w:val="center"/>
+              <w:jc w:val="left"/>
               <w:textAlignment w:val="auto"/>
               <w:rPr>
                 <w:rFonts w:hint="eastAsia"/>
@@ -4181,8 +4210,9 @@
             </w:pPr>
             <w:r>
               <w:rPr>
-                <w:rFonts w:hint="eastAsia"/>
-                <w:sz w:val="24"/>
+                <w:rFonts w:hint="eastAsia" w:ascii="宋体" w:hAnsi="宋体" w:eastAsia="宋体" w:cs="宋体"/>
+                <w:sz w:val="24"/>
+                <w:szCs w:val="24"/>
               </w:rPr>
               <w:t>7732-18-5</w:t>
             </w:r>
@@ -4216,7 +4246,7 @@
               <w:snapToGrid/>
               <w:spacing w:line="300" w:lineRule="auto"/>
               <w:ind w:right="480"/>
-              <w:jc w:val="center"/>
+              <w:jc w:val="left"/>
               <w:textAlignment w:val="auto"/>
               <w:rPr>
                 <w:rFonts w:hint="default" w:ascii="Times New Roman" w:hAnsi="Times New Roman" w:eastAsia="宋体" w:cs="Times New Roman"/>
@@ -4228,9 +4258,10 @@
             </w:pPr>
             <w:r>
               <w:rPr>
-                <w:rFonts w:hint="eastAsia"/>
+                <w:rFonts w:hint="eastAsia" w:ascii="宋体" w:hAnsi="宋体" w:eastAsia="宋体" w:cs="宋体"/>
                 <w:sz w:val="24"/>
                 <w:lang w:val="en-US" w:eastAsia="zh-CN"/>
+                <w:szCs w:val="24"/>
               </w:rPr>
               <w:t>&gt; 45</w:t>
             </w:r>
@@ -4428,6 +4459,7 @@
               <w:left w:val="dotted" w:color="auto" w:sz="4" w:space="0"/>
               <w:bottom w:val="dotted" w:color="auto" w:sz="4" w:space="0"/>
             </w:tcBorders>
+            <w:vAlign w:val="center"/>
           </w:tcPr>
           <w:p>
             <w:pPr>
@@ -4443,10 +4475,11 @@
             </w:pPr>
             <w:r>
               <w:rPr>
-                <w:rFonts w:hint="eastAsia" w:hAnsi="Arial" w:cs="Arial"/>
+                <w:rFonts w:hint="eastAsia" w:hAnsi="宋体" w:cs="宋体" w:ascii="宋体" w:eastAsia="宋体"/>
                 <w:kern w:val="0"/>
                 <w:sz w:val="24"/>
                 <w:lang w:val="en-US" w:eastAsia="zh-CN"/>
+                <w:szCs w:val="24"/>
               </w:rPr>
               <w:t>立即脱掉所有被污染的衣物。</w:t>
             </w:r>
@@ -4551,7 +4584,7 @@
               <w:left w:val="dotted" w:color="auto" w:sz="4" w:space="0"/>
               <w:bottom w:val="dotted" w:color="auto" w:sz="4" w:space="0"/>
             </w:tcBorders>
-            <w:vAlign w:val="top"/>
+            <w:vAlign w:val="center"/>
           </w:tcPr>
           <w:p>
             <w:pPr>
@@ -4567,18 +4600,20 @@
             </w:pPr>
             <w:r>
               <w:rPr>
-                <w:rFonts w:hint="eastAsia"/>
+                <w:rFonts w:hint="eastAsia" w:ascii="宋体" w:hAnsi="宋体" w:eastAsia="宋体" w:cs="宋体"/>
                 <w:sz w:val="24"/>
                 <w:lang w:val="en-US" w:eastAsia="zh-CN"/>
+                <w:szCs w:val="24"/>
               </w:rPr>
               <w:t>若意外吞食，不要催吐，立即就医。</w:t>
             </w:r>
             <w:r>
               <w:rPr>
-                <w:rFonts w:hint="eastAsia" w:hAnsi="Arial" w:cs="Arial"/>
+                <w:rFonts w:hint="eastAsia" w:hAnsi="宋体" w:cs="宋体" w:ascii="宋体" w:eastAsia="宋体"/>
                 <w:kern w:val="0"/>
                 <w:sz w:val="24"/>
                 <w:lang w:val="en-US" w:eastAsia="zh-CN"/>
+                <w:szCs w:val="24"/>
               </w:rPr>
               <w:t>无意识时，不要经口喂食任何食物。</w:t>
             </w:r>
@@ -4683,7 +4718,7 @@
               <w:left w:val="dotted" w:color="auto" w:sz="4" w:space="0"/>
               <w:bottom w:val="dotted" w:color="auto" w:sz="4" w:space="0"/>
             </w:tcBorders>
-            <w:vAlign w:val="top"/>
+            <w:vAlign w:val="center"/>
           </w:tcPr>
           <w:p>
             <w:pPr>
@@ -4699,10 +4734,11 @@
             </w:pPr>
             <w:r>
               <w:rPr>
-                <w:rFonts w:hint="eastAsia" w:hAnsi="Arial" w:cs="Arial"/>
+                <w:rFonts w:hint="eastAsia" w:hAnsi="宋体" w:cs="宋体" w:ascii="宋体" w:eastAsia="宋体"/>
                 <w:kern w:val="0"/>
                 <w:sz w:val="24"/>
                 <w:lang w:val="en-US" w:eastAsia="zh-CN"/>
+                <w:szCs w:val="24"/>
               </w:rPr>
               <w:t>立即翻起上下眼睑用大量缓和流动的水清洗眼睛至少20 分钟。且将头倾斜，避免化学品流入另一只未受污染的眼睛，并立即就医。</w:t>
             </w:r>
@@ -4807,7 +4843,7 @@
               <w:left w:val="dotted" w:color="auto" w:sz="4" w:space="0"/>
               <w:bottom w:val="dotted" w:color="auto" w:sz="4" w:space="0"/>
             </w:tcBorders>
-            <w:vAlign w:val="top"/>
+            <w:vAlign w:val="center"/>
           </w:tcPr>
           <w:p>
             <w:pPr>
@@ -4823,8 +4859,9 @@
             </w:pPr>
             <w:r>
               <w:rPr>
-                <w:rFonts w:hint="eastAsia"/>
-                <w:sz w:val="24"/>
+                <w:rFonts w:hint="eastAsia" w:ascii="宋体" w:hAnsi="宋体" w:eastAsia="宋体" w:cs="宋体"/>
+                <w:sz w:val="24"/>
+                <w:szCs w:val="24"/>
               </w:rPr>
               <w:t>立即用肥皂和大量的水冲洗。若发生皮肤反应，就医。</w:t>
             </w:r>
@@ -4933,6 +4970,7 @@
               <w:left w:val="dotted" w:color="auto" w:sz="4" w:space="0"/>
               <w:bottom w:val="single" w:color="auto" w:sz="4" w:space="0"/>
             </w:tcBorders>
+            <w:vAlign w:val="center"/>
           </w:tcPr>
           <w:p>
             <w:pPr>
@@ -4948,10 +4986,11 @@
             </w:pPr>
             <w:r>
               <w:rPr>
-                <w:rFonts w:hint="eastAsia" w:hAnsi="Arial" w:cs="Arial"/>
+                <w:rFonts w:hint="eastAsia" w:hAnsi="宋体" w:cs="宋体" w:ascii="宋体" w:eastAsia="宋体"/>
                 <w:kern w:val="0"/>
                 <w:sz w:val="24"/>
                 <w:lang w:val="en-US" w:eastAsia="zh-CN"/>
+                <w:szCs w:val="24"/>
               </w:rPr>
               <w:t>一旦吸入，如有不适，就医。</w:t>
             </w:r>
@@ -5149,6 +5188,7 @@
               <w:left w:val="dotted" w:color="auto" w:sz="4" w:space="0"/>
               <w:bottom w:val="dotted" w:color="auto" w:sz="4" w:space="0"/>
             </w:tcBorders>
+            <w:vAlign w:val="center"/>
           </w:tcPr>
           <w:p>
             <w:pPr>
@@ -5176,67 +5216,78 @@
             </w:pPr>
             <w:r>
               <w:rPr>
-                <w:rFonts w:hint="eastAsia"/>
-                <w:sz w:val="24"/>
+                <w:rFonts w:hint="eastAsia" w:ascii="宋体" w:hAnsi="宋体" w:eastAsia="宋体" w:cs="宋体"/>
+                <w:sz w:val="24"/>
+                <w:szCs w:val="24"/>
               </w:rPr>
               <w:t>二氧化碳（</w:t>
             </w:r>
             <w:r>
               <w:rPr>
-                <w:sz w:val="24"/>
+                <w:rFonts w:ascii="宋体" w:hAnsi="宋体" w:eastAsia="宋体" w:cs="宋体"/>
+                <w:sz w:val="24"/>
+                <w:szCs w:val="24"/>
               </w:rPr>
               <w:t>CO</w:t>
             </w:r>
             <w:r>
               <w:rPr>
+                <w:rFonts w:ascii="宋体" w:hAnsi="宋体" w:eastAsia="宋体" w:cs="宋体"/>
                 <w:sz w:val="24"/>
                 <w:vertAlign w:val="subscript"/>
+                <w:szCs w:val="24"/>
               </w:rPr>
               <w:t>2</w:t>
             </w:r>
             <w:r>
               <w:rPr>
-                <w:rFonts w:hint="eastAsia"/>
-                <w:sz w:val="24"/>
+                <w:rFonts w:hint="eastAsia" w:ascii="宋体" w:hAnsi="宋体" w:eastAsia="宋体" w:cs="宋体"/>
+                <w:sz w:val="24"/>
+                <w:szCs w:val="24"/>
               </w:rPr>
               <w:t>），</w:t>
             </w:r>
             <w:r>
               <w:rPr>
-                <w:rFonts w:hint="eastAsia"/>
+                <w:rFonts w:hint="eastAsia" w:ascii="宋体" w:hAnsi="宋体" w:eastAsia="宋体" w:cs="宋体"/>
                 <w:sz w:val="24"/>
                 <w:lang w:val="en-US" w:eastAsia="zh-CN"/>
+                <w:szCs w:val="24"/>
               </w:rPr>
               <w:t>耐醇</w:t>
             </w:r>
             <w:r>
               <w:rPr>
-                <w:rFonts w:hint="eastAsia"/>
-                <w:sz w:val="24"/>
+                <w:rFonts w:hint="eastAsia" w:ascii="宋体" w:hAnsi="宋体" w:eastAsia="宋体" w:cs="宋体"/>
+                <w:sz w:val="24"/>
+                <w:szCs w:val="24"/>
               </w:rPr>
               <w:t>泡沫，</w:t>
             </w:r>
             <w:r>
               <w:rPr>
-                <w:rFonts w:hint="eastAsia"/>
+                <w:rFonts w:hint="eastAsia" w:ascii="宋体" w:hAnsi="宋体" w:eastAsia="宋体" w:cs="宋体"/>
                 <w:sz w:val="24"/>
                 <w:lang w:val="en-US" w:eastAsia="zh-CN"/>
+                <w:szCs w:val="24"/>
               </w:rPr>
               <w:t>化学干粉</w:t>
             </w:r>
             <w:r>
               <w:rPr>
-                <w:rFonts w:hint="eastAsia"/>
+                <w:rFonts w:hint="eastAsia" w:ascii="宋体" w:hAnsi="宋体" w:eastAsia="宋体" w:cs="宋体"/>
                 <w:sz w:val="24"/>
                 <w:lang w:eastAsia="zh-CN"/>
+                <w:szCs w:val="24"/>
               </w:rPr>
               <w:t>。</w:t>
             </w:r>
             <w:r>
               <w:rPr>
-                <w:rFonts w:hint="eastAsia"/>
+                <w:rFonts w:hint="eastAsia" w:ascii="宋体" w:hAnsi="宋体" w:eastAsia="宋体" w:cs="宋体"/>
                 <w:sz w:val="24"/>
                 <w:lang w:val="en-US" w:eastAsia="zh-CN"/>
+                <w:szCs w:val="24"/>
               </w:rPr>
               <w:t>大火时应用水喷洒。</w:t>
             </w:r>
@@ -5341,6 +5392,7 @@
               <w:left w:val="dotted" w:color="auto" w:sz="4" w:space="0"/>
               <w:bottom w:val="dotted" w:color="auto" w:sz="4" w:space="0"/>
             </w:tcBorders>
+            <w:vAlign w:val="center"/>
           </w:tcPr>
           <w:p>
             <w:pPr>
@@ -5372,15 +5424,17 @@
             </w:pPr>
             <w:r>
               <w:rPr>
-                <w:rFonts w:hint="eastAsia" w:hAnsi="Arial"/>
-                <w:sz w:val="24"/>
+                <w:rFonts w:hint="eastAsia" w:hAnsi="宋体" w:ascii="宋体" w:eastAsia="宋体" w:cs="宋体"/>
+                <w:sz w:val="24"/>
+                <w:szCs w:val="24"/>
               </w:rPr>
               <w:t>高流量的水喷射</w:t>
             </w:r>
             <w:r>
               <w:rPr>
-                <w:rFonts w:hint="eastAsia"/>
-                <w:sz w:val="24"/>
+                <w:rFonts w:hint="eastAsia" w:ascii="宋体" w:hAnsi="宋体" w:eastAsia="宋体" w:cs="宋体"/>
+                <w:sz w:val="24"/>
+                <w:szCs w:val="24"/>
               </w:rPr>
               <w:t>。</w:t>
             </w:r>
@@ -5485,6 +5539,7 @@
               <w:left w:val="dotted" w:color="auto" w:sz="4" w:space="0"/>
               <w:bottom w:val="dotted" w:color="auto" w:sz="4" w:space="0"/>
             </w:tcBorders>
+            <w:vAlign w:val="center"/>
           </w:tcPr>
           <w:p>
             <w:pPr>
@@ -5512,24 +5567,27 @@
             </w:pPr>
             <w:r>
               <w:rPr>
-                <w:rFonts w:hint="eastAsia"/>
-                <w:sz w:val="24"/>
+                <w:rFonts w:hint="eastAsia" w:ascii="宋体" w:hAnsi="宋体" w:eastAsia="宋体" w:cs="宋体"/>
+                <w:sz w:val="24"/>
+                <w:szCs w:val="24"/>
               </w:rPr>
               <w:t>燃烧时释放一氧化碳、二氧化碳、氮氧化物</w:t>
             </w:r>
             <w:r>
               <w:rPr>
-                <w:rFonts w:hint="eastAsia"/>
+                <w:rFonts w:hint="eastAsia" w:ascii="宋体" w:hAnsi="宋体" w:eastAsia="宋体" w:cs="宋体"/>
                 <w:sz w:val="24"/>
                 <w:lang w:val="en-US" w:eastAsia="zh-CN"/>
+                <w:szCs w:val="24"/>
               </w:rPr>
               <w:t>等</w:t>
             </w:r>
             <w:r>
               <w:rPr>
-                <w:rFonts w:hint="eastAsia"/>
+                <w:rFonts w:hint="eastAsia" w:ascii="宋体" w:hAnsi="宋体" w:eastAsia="宋体" w:cs="宋体"/>
                 <w:sz w:val="24"/>
                 <w:lang w:eastAsia="zh-CN"/>
+                <w:szCs w:val="24"/>
               </w:rPr>
               <w:t>。</w:t>
             </w:r>
@@ -5560,8 +5618,9 @@
             </w:pPr>
             <w:r>
               <w:rPr>
-                <w:rFonts w:hint="eastAsia"/>
-                <w:sz w:val="24"/>
+                <w:rFonts w:hint="eastAsia" w:ascii="宋体" w:hAnsi="宋体" w:eastAsia="宋体" w:cs="宋体"/>
+                <w:sz w:val="24"/>
+                <w:szCs w:val="24"/>
               </w:rPr>
               <w:t>在着火或爆炸情况下，不要吸进烟尘。</w:t>
             </w:r>
@@ -5666,6 +5725,7 @@
               <w:left w:val="dotted" w:color="auto" w:sz="4" w:space="0"/>
               <w:bottom w:val="single" w:color="auto" w:sz="4" w:space="0"/>
             </w:tcBorders>
+            <w:vAlign w:val="center"/>
           </w:tcPr>
           <w:p>
             <w:pPr>
@@ -5694,8 +5754,9 @@
             </w:pPr>
             <w:r>
               <w:rPr>
-                <w:rFonts w:hint="eastAsia"/>
-                <w:sz w:val="24"/>
+                <w:rFonts w:hint="eastAsia" w:ascii="宋体" w:hAnsi="宋体" w:eastAsia="宋体" w:cs="宋体"/>
+                <w:sz w:val="24"/>
+                <w:szCs w:val="24"/>
               </w:rPr>
               <w:t>消防人员必须佩戴自供气式呼吸器。</w:t>
             </w:r>
@@ -5729,8 +5790,9 @@
             </w:pPr>
             <w:r>
               <w:rPr>
-                <w:rFonts w:hint="eastAsia"/>
-                <w:sz w:val="24"/>
+                <w:rFonts w:hint="eastAsia" w:ascii="宋体" w:hAnsi="宋体" w:eastAsia="宋体" w:cs="宋体"/>
+                <w:sz w:val="24"/>
+                <w:szCs w:val="24"/>
               </w:rPr>
               <w:t>禁止污染的灭火用水流入土壤，地下水或地表水中。</w:t>
             </w:r>
@@ -5922,6 +5984,7 @@
               <w:left w:val="nil"/>
               <w:bottom w:val="dotted" w:color="auto" w:sz="4" w:space="0"/>
             </w:tcBorders>
+            <w:vAlign w:val="center"/>
           </w:tcPr>
           <w:p>
             <w:pPr>
@@ -5946,21 +6009,25 @@
             </w:pPr>
             <w:r>
               <w:rPr>
-                <w:rFonts w:hint="eastAsia"/>
-                <w:sz w:val="24"/>
+                <w:rFonts w:hint="eastAsia" w:ascii="宋体" w:hAnsi="宋体" w:eastAsia="宋体" w:cs="宋体"/>
+                <w:sz w:val="24"/>
+                <w:szCs w:val="24"/>
               </w:rPr>
               <w:t>戴防护设备。确保充分的通风</w:t>
             </w:r>
             <w:r>
               <w:rPr>
-                <w:sz w:val="24"/>
+                <w:rFonts w:ascii="宋体" w:hAnsi="宋体" w:eastAsia="宋体" w:cs="宋体"/>
+                <w:sz w:val="24"/>
+                <w:szCs w:val="24"/>
               </w:rPr>
               <w:t>/</w:t>
             </w:r>
             <w:r>
               <w:rPr>
-                <w:rFonts w:hint="eastAsia"/>
-                <w:sz w:val="24"/>
+                <w:rFonts w:hint="eastAsia" w:ascii="宋体" w:hAnsi="宋体" w:eastAsia="宋体" w:cs="宋体"/>
+                <w:sz w:val="24"/>
+                <w:szCs w:val="24"/>
               </w:rPr>
               <w:t>排气。</w:t>
             </w:r>
@@ -5987,8 +6054,9 @@
             </w:pPr>
             <w:r>
               <w:rPr>
-                <w:rFonts w:hint="eastAsia"/>
-                <w:sz w:val="24"/>
+                <w:rFonts w:hint="eastAsia" w:ascii="宋体" w:hAnsi="宋体" w:eastAsia="宋体" w:cs="宋体"/>
+                <w:sz w:val="24"/>
+                <w:szCs w:val="24"/>
               </w:rPr>
               <w:t>令未授权人员离开。</w:t>
             </w:r>
@@ -6093,6 +6161,7 @@
               <w:left w:val="nil"/>
               <w:bottom w:val="dotted" w:color="auto" w:sz="4" w:space="0"/>
             </w:tcBorders>
+            <w:vAlign w:val="center"/>
           </w:tcPr>
           <w:p>
             <w:pPr>
@@ -6119,16 +6188,18 @@
             </w:pPr>
             <w:r>
               <w:rPr>
-                <w:rFonts w:hint="eastAsia" w:hAnsi="Arial" w:cs="Arial"/>
+                <w:rFonts w:hint="eastAsia" w:hAnsi="宋体" w:cs="宋体" w:ascii="宋体" w:eastAsia="宋体"/>
                 <w:kern w:val="0"/>
                 <w:sz w:val="24"/>
+                <w:szCs w:val="24"/>
               </w:rPr>
               <w:t>禁止排入下水道，废水或土壤中</w:t>
             </w:r>
             <w:r>
               <w:rPr>
-                <w:rFonts w:hint="eastAsia"/>
-                <w:sz w:val="24"/>
+                <w:rFonts w:hint="eastAsia" w:ascii="宋体" w:hAnsi="宋体" w:eastAsia="宋体" w:cs="宋体"/>
+                <w:sz w:val="24"/>
+                <w:szCs w:val="24"/>
               </w:rPr>
               <w:t>。</w:t>
             </w:r>
@@ -6231,6 +6302,7 @@
               <w:left w:val="nil"/>
               <w:bottom w:val="single" w:color="auto" w:sz="4" w:space="0"/>
             </w:tcBorders>
+            <w:vAlign w:val="center"/>
           </w:tcPr>
           <w:p>
             <w:pPr>
@@ -6258,9 +6330,10 @@
             </w:pPr>
             <w:r>
               <w:rPr>
-                <w:rFonts w:hint="eastAsia" w:hAnsi="Arial" w:cs="Arial"/>
+                <w:rFonts w:hint="eastAsia" w:hAnsi="宋体" w:cs="宋体" w:ascii="宋体" w:eastAsia="宋体"/>
                 <w:kern w:val="0"/>
                 <w:sz w:val="24"/>
+                <w:szCs w:val="24"/>
               </w:rPr>
               <w:t>用化学品吸收材料或必要时用干沙收集，并储存于密闭容器中。</w:t>
             </w:r>
@@ -6431,6 +6504,7 @@
               <w:left w:val="dotted" w:color="auto" w:sz="4" w:space="0"/>
               <w:bottom w:val="dotted" w:color="auto" w:sz="4" w:space="0"/>
             </w:tcBorders>
+            <w:vAlign w:val="center"/>
           </w:tcPr>
           <w:p>
             <w:pPr>
@@ -6459,27 +6533,30 @@
             </w:pPr>
             <w:r>
               <w:rPr>
-                <w:rFonts w:hint="eastAsia" w:hAnsi="Arial" w:cs="Arial"/>
+                <w:rFonts w:hint="eastAsia" w:hAnsi="宋体" w:cs="宋体" w:ascii="宋体" w:eastAsia="宋体"/>
                 <w:kern w:val="0"/>
                 <w:sz w:val="24"/>
                 <w:lang w:val="en-US" w:eastAsia="zh-CN"/>
+                <w:szCs w:val="24"/>
               </w:rPr>
               <w:t>在具有适当排气通风的场所使用。</w:t>
             </w:r>
             <w:r>
               <w:rPr>
-                <w:rFonts w:hint="eastAsia" w:hAnsi="Arial" w:cs="Arial"/>
+                <w:rFonts w:hint="eastAsia" w:hAnsi="宋体" w:cs="宋体" w:ascii="宋体" w:eastAsia="宋体"/>
                 <w:kern w:val="0"/>
                 <w:sz w:val="24"/>
+                <w:szCs w:val="24"/>
               </w:rPr>
               <w:t>避免与皮肤和眼睛接触。</w:t>
             </w:r>
             <w:r>
               <w:rPr>
-                <w:rFonts w:hint="eastAsia" w:hAnsi="Arial" w:cs="Arial"/>
+                <w:rFonts w:hint="eastAsia" w:hAnsi="宋体" w:cs="宋体" w:ascii="宋体" w:eastAsia="宋体"/>
                 <w:kern w:val="0"/>
                 <w:sz w:val="24"/>
                 <w:lang w:val="en-US" w:eastAsia="zh-CN"/>
+                <w:szCs w:val="24"/>
               </w:rPr>
               <w:t>不要呼吸蒸气或喷雾。远离食物，饮料和烟草，休息前及工作结束及时洗手。更换被污染或浸湿的衣物。</w:t>
             </w:r>
@@ -6562,6 +6639,7 @@
               <w:left w:val="dotted" w:color="auto" w:sz="4" w:space="0"/>
               <w:bottom w:val="single" w:color="auto" w:sz="4" w:space="0"/>
             </w:tcBorders>
+            <w:vAlign w:val="center"/>
           </w:tcPr>
           <w:p>
             <w:pPr>
@@ -6587,51 +6665,57 @@
             </w:pPr>
             <w:r>
               <w:rPr>
-                <w:rFonts w:hint="eastAsia" w:hAnsi="Arial" w:cs="Arial"/>
+                <w:rFonts w:hint="eastAsia" w:hAnsi="宋体" w:cs="宋体" w:ascii="宋体" w:eastAsia="宋体"/>
                 <w:kern w:val="0"/>
                 <w:sz w:val="24"/>
+                <w:szCs w:val="24"/>
               </w:rPr>
               <w:t>容器保持紧闭，存储在</w:t>
             </w:r>
             <w:r>
               <w:rPr>
-                <w:rFonts w:hint="eastAsia" w:hAnsi="Arial" w:cs="Arial"/>
+                <w:rFonts w:hint="eastAsia" w:hAnsi="宋体" w:cs="宋体" w:ascii="宋体" w:eastAsia="宋体"/>
                 <w:kern w:val="0"/>
                 <w:sz w:val="24"/>
                 <w:lang w:val="en-US" w:eastAsia="zh-CN"/>
+                <w:szCs w:val="24"/>
               </w:rPr>
               <w:t>凉爽</w:t>
             </w:r>
             <w:r>
               <w:rPr>
-                <w:rFonts w:hint="eastAsia" w:hAnsi="Arial" w:cs="Arial"/>
+                <w:rFonts w:hint="eastAsia" w:hAnsi="宋体" w:cs="宋体" w:ascii="宋体" w:eastAsia="宋体"/>
                 <w:kern w:val="0"/>
                 <w:sz w:val="24"/>
+                <w:szCs w:val="24"/>
               </w:rPr>
               <w:t>通风处。</w:t>
             </w:r>
             <w:r>
               <w:rPr>
-                <w:rFonts w:hint="eastAsia" w:hAnsi="Arial" w:cs="Arial"/>
+                <w:rFonts w:hint="eastAsia" w:hAnsi="宋体" w:cs="宋体" w:ascii="宋体" w:eastAsia="宋体"/>
                 <w:kern w:val="0"/>
                 <w:sz w:val="24"/>
                 <w:lang w:val="en-US" w:eastAsia="zh-CN"/>
+                <w:szCs w:val="24"/>
               </w:rPr>
               <w:t>为保证</w:t>
             </w:r>
             <w:r>
               <w:rPr>
-                <w:rFonts w:hint="eastAsia" w:hAnsi="Arial" w:cs="Arial"/>
+                <w:rFonts w:hint="eastAsia" w:hAnsi="宋体" w:cs="宋体" w:ascii="宋体" w:eastAsia="宋体"/>
                 <w:kern w:val="0"/>
                 <w:sz w:val="24"/>
+                <w:szCs w:val="24"/>
               </w:rPr>
               <w:t>产品质量，必须遵守我们产品信息表的储存条件。</w:t>
             </w:r>
             <w:r>
               <w:rPr>
-                <w:rFonts w:cs="Arial"/>
+                <w:rFonts w:cs="宋体" w:ascii="宋体" w:hAnsi="宋体" w:eastAsia="宋体"/>
                 <w:kern w:val="0"/>
                 <w:sz w:val="24"/>
+                <w:szCs w:val="24"/>
               </w:rPr>
               <w:t xml:space="preserve"> </w:t>
             </w:r>
@@ -6930,9 +7014,10 @@
             </w:pPr>
             <w:r>
               <w:rPr>
-                <w:rFonts w:hint="eastAsia" w:hAnsi="Arial" w:cs="Arial"/>
+                <w:rFonts w:hint="eastAsia" w:hAnsi="宋体" w:cs="宋体" w:ascii="宋体" w:eastAsia="宋体"/>
                 <w:kern w:val="0"/>
                 <w:sz w:val="24"/>
+                <w:szCs w:val="24"/>
               </w:rPr>
               <w:t>喷涂过程中要求有呼吸防护设备。</w:t>
             </w:r>
@@ -7063,10 +7148,11 @@
             </w:pPr>
             <w:r>
               <w:rPr>
-                <w:rFonts w:hint="eastAsia" w:hAnsi="Arial" w:cs="Arial"/>
+                <w:rFonts w:hint="eastAsia" w:hAnsi="宋体" w:cs="宋体" w:ascii="宋体" w:eastAsia="宋体"/>
                 <w:kern w:val="0"/>
                 <w:sz w:val="24"/>
                 <w:lang w:val="en-US" w:eastAsia="zh-CN"/>
+                <w:szCs w:val="24"/>
               </w:rPr>
               <w:t>建议戴上防护手套。</w:t>
             </w:r>
@@ -7175,9 +7261,10 @@
             </w:pPr>
             <w:r>
               <w:rPr>
-                <w:rFonts w:cs="Arial"/>
+                <w:rFonts w:cs="宋体" w:ascii="宋体" w:hAnsi="宋体" w:eastAsia="宋体"/>
                 <w:kern w:val="0"/>
                 <w:sz w:val="24"/>
+                <w:szCs w:val="24"/>
               </w:rPr>
               <w:t>EN 374-3</w:t>
             </w:r>
@@ -7287,33 +7374,37 @@
             </w:pPr>
             <w:r>
               <w:rPr>
-                <w:rFonts w:hint="eastAsia" w:hAnsi="Arial" w:cs="Arial"/>
+                <w:rFonts w:hint="eastAsia" w:hAnsi="宋体" w:cs="宋体" w:ascii="宋体" w:eastAsia="宋体"/>
                 <w:kern w:val="0"/>
                 <w:sz w:val="24"/>
+                <w:szCs w:val="24"/>
               </w:rPr>
               <w:t>厚度≧</w:t>
             </w:r>
             <w:r>
               <w:rPr>
-                <w:rFonts w:cs="Arial"/>
+                <w:rFonts w:cs="宋体" w:ascii="宋体" w:hAnsi="宋体" w:eastAsia="宋体"/>
                 <w:kern w:val="0"/>
                 <w:sz w:val="24"/>
+                <w:szCs w:val="24"/>
               </w:rPr>
               <w:t>0.4mm</w:t>
             </w:r>
             <w:r>
               <w:rPr>
-                <w:rFonts w:hint="eastAsia" w:hAnsi="Arial" w:cs="Arial"/>
+                <w:rFonts w:hint="eastAsia" w:hAnsi="宋体" w:cs="宋体" w:ascii="宋体" w:eastAsia="宋体"/>
                 <w:kern w:val="0"/>
                 <w:sz w:val="24"/>
+                <w:szCs w:val="24"/>
               </w:rPr>
               <w:t>；穿透时间≧</w:t>
             </w:r>
             <w:r>
               <w:rPr>
-                <w:rFonts w:cs="Arial"/>
+                <w:rFonts w:cs="宋体" w:ascii="宋体" w:hAnsi="宋体" w:eastAsia="宋体"/>
                 <w:kern w:val="0"/>
                 <w:sz w:val="24"/>
+                <w:szCs w:val="24"/>
               </w:rPr>
               <w:t>480min.</w:t>
             </w:r>
@@ -7423,33 +7514,37 @@
             </w:pPr>
             <w:r>
               <w:rPr>
-                <w:rFonts w:hint="eastAsia" w:hAnsi="Arial" w:cs="Arial"/>
+                <w:rFonts w:hint="eastAsia" w:hAnsi="宋体" w:cs="宋体" w:ascii="宋体" w:eastAsia="宋体"/>
                 <w:kern w:val="0"/>
                 <w:sz w:val="24"/>
+                <w:szCs w:val="24"/>
               </w:rPr>
               <w:t>厚度≧</w:t>
             </w:r>
             <w:r>
               <w:rPr>
-                <w:rFonts w:cs="Arial"/>
+                <w:rFonts w:cs="宋体" w:ascii="宋体" w:hAnsi="宋体" w:eastAsia="宋体"/>
                 <w:kern w:val="0"/>
                 <w:sz w:val="24"/>
+                <w:szCs w:val="24"/>
               </w:rPr>
               <w:t>0.5mm</w:t>
             </w:r>
             <w:r>
               <w:rPr>
-                <w:rFonts w:hint="eastAsia" w:hAnsi="Arial" w:cs="Arial"/>
+                <w:rFonts w:hint="eastAsia" w:hAnsi="宋体" w:cs="宋体" w:ascii="宋体" w:eastAsia="宋体"/>
                 <w:kern w:val="0"/>
                 <w:sz w:val="24"/>
+                <w:szCs w:val="24"/>
               </w:rPr>
               <w:t>；穿透时间≧</w:t>
             </w:r>
             <w:r>
               <w:rPr>
-                <w:rFonts w:cs="Arial"/>
+                <w:rFonts w:cs="宋体" w:ascii="宋体" w:hAnsi="宋体" w:eastAsia="宋体"/>
                 <w:kern w:val="0"/>
                 <w:sz w:val="24"/>
+                <w:szCs w:val="24"/>
               </w:rPr>
               <w:t>480min.</w:t>
             </w:r>
@@ -7559,33 +7654,37 @@
             </w:pPr>
             <w:r>
               <w:rPr>
-                <w:rFonts w:hint="eastAsia" w:hAnsi="Arial" w:cs="Arial"/>
+                <w:rFonts w:hint="eastAsia" w:hAnsi="宋体" w:cs="宋体" w:ascii="宋体" w:eastAsia="宋体"/>
                 <w:kern w:val="0"/>
                 <w:sz w:val="24"/>
+                <w:szCs w:val="24"/>
               </w:rPr>
               <w:t>厚度≧</w:t>
             </w:r>
             <w:r>
               <w:rPr>
-                <w:rFonts w:cs="Arial"/>
+                <w:rFonts w:cs="宋体" w:ascii="宋体" w:hAnsi="宋体" w:eastAsia="宋体"/>
                 <w:kern w:val="0"/>
                 <w:sz w:val="24"/>
+                <w:szCs w:val="24"/>
               </w:rPr>
               <w:t>0.35mm</w:t>
             </w:r>
             <w:r>
               <w:rPr>
-                <w:rFonts w:hint="eastAsia" w:hAnsi="Arial" w:cs="Arial"/>
+                <w:rFonts w:hint="eastAsia" w:hAnsi="宋体" w:cs="宋体" w:ascii="宋体" w:eastAsia="宋体"/>
                 <w:kern w:val="0"/>
                 <w:sz w:val="24"/>
+                <w:szCs w:val="24"/>
               </w:rPr>
               <w:t>；穿透时间≧</w:t>
             </w:r>
             <w:r>
               <w:rPr>
-                <w:rFonts w:cs="Arial"/>
+                <w:rFonts w:cs="宋体" w:ascii="宋体" w:hAnsi="宋体" w:eastAsia="宋体"/>
                 <w:kern w:val="0"/>
                 <w:sz w:val="24"/>
+                <w:szCs w:val="24"/>
               </w:rPr>
               <w:t>480min.</w:t>
             </w:r>
@@ -7791,26 +7890,29 @@
             </w:pPr>
             <w:r>
               <w:rPr>
-                <w:rFonts w:hint="eastAsia" w:hAnsi="Arial" w:cs="Arial"/>
+                <w:rFonts w:hint="eastAsia" w:hAnsi="宋体" w:cs="宋体" w:ascii="宋体" w:eastAsia="宋体"/>
                 <w:kern w:val="0"/>
                 <w:sz w:val="24"/>
+                <w:szCs w:val="24"/>
               </w:rPr>
               <w:t>戴</w:t>
             </w:r>
             <w:r>
               <w:rPr>
-                <w:rFonts w:hint="eastAsia" w:hAnsi="Arial" w:cs="Arial"/>
+                <w:rFonts w:hint="eastAsia" w:hAnsi="宋体" w:cs="宋体" w:ascii="宋体" w:eastAsia="宋体"/>
                 <w:kern w:val="0"/>
                 <w:sz w:val="24"/>
                 <w:lang w:val="en-US" w:eastAsia="zh-CN"/>
+                <w:szCs w:val="24"/>
               </w:rPr>
               <w:t>护目镜</w:t>
             </w:r>
             <w:r>
               <w:rPr>
-                <w:rFonts w:hint="eastAsia" w:hAnsi="Arial" w:cs="Arial"/>
+                <w:rFonts w:hint="eastAsia" w:hAnsi="宋体" w:cs="宋体" w:ascii="宋体" w:eastAsia="宋体"/>
                 <w:kern w:val="0"/>
                 <w:sz w:val="24"/>
+                <w:szCs w:val="24"/>
               </w:rPr>
               <w:t>/面罩。</w:t>
             </w:r>
@@ -7917,9 +8019,10 @@
             </w:pPr>
             <w:r>
               <w:rPr>
-                <w:rFonts w:hint="eastAsia" w:hAnsi="Arial" w:cs="Arial"/>
+                <w:rFonts w:hint="eastAsia" w:hAnsi="宋体" w:cs="宋体" w:ascii="宋体" w:eastAsia="宋体"/>
                 <w:kern w:val="0"/>
                 <w:sz w:val="24"/>
+                <w:szCs w:val="24"/>
               </w:rPr>
               <w:t>穿着适当的防护服。</w:t>
             </w:r>
@@ -8042,9 +8145,10 @@
             </w:pPr>
             <w:r>
               <w:rPr>
-                <w:rFonts w:hint="eastAsia" w:hAnsi="Arial" w:cs="Arial"/>
+                <w:rFonts w:hint="eastAsia" w:hAnsi="宋体" w:cs="宋体" w:ascii="宋体" w:eastAsia="宋体"/>
                 <w:kern w:val="0"/>
                 <w:sz w:val="24"/>
+                <w:szCs w:val="24"/>
               </w:rPr>
               <w:t>使用局部排风或全面通风，保持工作场所空气中浓度低于职业接触限值；工作场所设置洗眼器与安全淋浴设施。</w:t>
             </w:r>
@@ -8287,11 +8391,12 @@
               <w:right w:val="dotted" w:color="auto" w:sz="4" w:space="0"/>
             </w:tcBorders>
             <w:shd w:val="clear" w:color="auto" w:fill="auto"/>
-            <w:vAlign w:val="top"/>
-          </w:tcPr>
-          <w:p>
-            <w:pPr>
-              <w:spacing w:line="300" w:lineRule="auto"/>
+            <w:vAlign w:val="center"/>
+          </w:tcPr>
+          <w:p>
+            <w:pPr>
+              <w:spacing w:line="300" w:lineRule="auto"/>
+              <w:jc w:val="left"/>
               <w:rPr>
                 <w:rFonts w:hint="default" w:ascii="Times New Roman" w:hAnsi="Times New Roman" w:eastAsia="宋体" w:cs="Times New Roman"/>
                 <w:kern w:val="2"/>
@@ -8302,34 +8407,41 @@
             </w:pPr>
             <w:r>
               <w:rPr>
-                <w:rFonts w:hint="eastAsia"/>
-                <w:sz w:val="24"/>
+                <w:rFonts w:hint="eastAsia" w:ascii="宋体" w:hAnsi="宋体" w:eastAsia="宋体" w:cs="宋体"/>
+                <w:sz w:val="24"/>
+                <w:szCs w:val="24"/>
               </w:rPr>
               <w:t>六亚甲基-</w:t>
             </w:r>
             <w:r>
               <w:rPr>
-                <w:sz w:val="24"/>
+                <w:rFonts w:ascii="宋体" w:hAnsi="宋体" w:eastAsia="宋体" w:cs="宋体"/>
+                <w:sz w:val="24"/>
+                <w:szCs w:val="24"/>
               </w:rPr>
               <w:t>1</w:t>
             </w:r>
             <w:r>
               <w:rPr>
-                <w:rFonts w:hint="eastAsia"/>
-                <w:sz w:val="24"/>
+                <w:rFonts w:hint="eastAsia" w:ascii="宋体" w:hAnsi="宋体" w:eastAsia="宋体" w:cs="宋体"/>
+                <w:sz w:val="24"/>
+                <w:szCs w:val="24"/>
               </w:rPr>
               <w:t>,</w:t>
             </w:r>
             <w:r>
               <w:rPr>
-                <w:sz w:val="24"/>
+                <w:rFonts w:ascii="宋体" w:hAnsi="宋体" w:eastAsia="宋体" w:cs="宋体"/>
+                <w:sz w:val="24"/>
+                <w:szCs w:val="24"/>
               </w:rPr>
               <w:t>6</w:t>
             </w:r>
             <w:r>
               <w:rPr>
-                <w:rFonts w:hint="eastAsia"/>
-                <w:sz w:val="24"/>
+                <w:rFonts w:hint="eastAsia" w:ascii="宋体" w:hAnsi="宋体" w:eastAsia="宋体" w:cs="宋体"/>
+                <w:sz w:val="24"/>
+                <w:szCs w:val="24"/>
               </w:rPr>
               <w:t>-二异氰酸酯</w:t>
             </w:r>
@@ -8346,11 +8458,12 @@
               <w:right w:val="dotted" w:color="auto" w:sz="4" w:space="0"/>
             </w:tcBorders>
             <w:shd w:val="clear" w:color="auto" w:fill="auto"/>
-            <w:vAlign w:val="top"/>
-          </w:tcPr>
-          <w:p>
-            <w:pPr>
-              <w:spacing w:line="300" w:lineRule="auto"/>
+            <w:vAlign w:val="center"/>
+          </w:tcPr>
+          <w:p>
+            <w:pPr>
+              <w:spacing w:line="300" w:lineRule="auto"/>
+              <w:jc w:val="left"/>
               <w:rPr>
                 <w:rFonts w:hint="eastAsia" w:ascii="Times New Roman" w:hAnsi="Times New Roman" w:eastAsia="宋体" w:cs="Times New Roman"/>
                 <w:kern w:val="2"/>
@@ -8361,21 +8474,25 @@
             </w:pPr>
             <w:r>
               <w:rPr>
-                <w:rFonts w:hint="eastAsia"/>
-                <w:sz w:val="24"/>
+                <w:rFonts w:hint="eastAsia" w:ascii="宋体" w:hAnsi="宋体" w:eastAsia="宋体" w:cs="宋体"/>
+                <w:sz w:val="24"/>
+                <w:szCs w:val="24"/>
               </w:rPr>
               <w:t>CN</w:t>
             </w:r>
             <w:r>
               <w:rPr>
-                <w:sz w:val="24"/>
+                <w:rFonts w:ascii="宋体" w:hAnsi="宋体" w:eastAsia="宋体" w:cs="宋体"/>
+                <w:sz w:val="24"/>
+                <w:szCs w:val="24"/>
               </w:rPr>
               <w:t xml:space="preserve"> </w:t>
             </w:r>
             <w:r>
               <w:rPr>
-                <w:rFonts w:hint="eastAsia"/>
-                <w:sz w:val="24"/>
+                <w:rFonts w:hint="eastAsia" w:ascii="宋体" w:hAnsi="宋体" w:eastAsia="宋体" w:cs="宋体"/>
+                <w:sz w:val="24"/>
+                <w:szCs w:val="24"/>
               </w:rPr>
               <w:t>OEL</w:t>
             </w:r>
@@ -8391,11 +8508,12 @@
               <w:right w:val="dotted" w:color="auto" w:sz="4" w:space="0"/>
             </w:tcBorders>
             <w:shd w:val="clear" w:color="auto" w:fill="auto"/>
-            <w:vAlign w:val="top"/>
-          </w:tcPr>
-          <w:p>
-            <w:pPr>
-              <w:spacing w:line="300" w:lineRule="auto"/>
+            <w:vAlign w:val="center"/>
+          </w:tcPr>
+          <w:p>
+            <w:pPr>
+              <w:spacing w:line="300" w:lineRule="auto"/>
+              <w:jc w:val="left"/>
               <w:rPr>
                 <w:rFonts w:hint="eastAsia" w:ascii="Times New Roman" w:hAnsi="Times New Roman" w:eastAsia="宋体" w:cs="Times New Roman"/>
                 <w:kern w:val="2"/>
@@ -8406,8 +8524,9 @@
             </w:pPr>
             <w:r>
               <w:rPr>
-                <w:rFonts w:hint="eastAsia"/>
-                <w:sz w:val="24"/>
+                <w:rFonts w:hint="eastAsia" w:ascii="宋体" w:hAnsi="宋体" w:eastAsia="宋体" w:cs="宋体"/>
+                <w:sz w:val="24"/>
+                <w:szCs w:val="24"/>
               </w:rPr>
               <w:t>TWA</w:t>
             </w:r>
@@ -8423,11 +8542,12 @@
               <w:right w:val="single" w:color="auto" w:sz="4" w:space="0"/>
             </w:tcBorders>
             <w:shd w:val="clear" w:color="auto" w:fill="auto"/>
-            <w:vAlign w:val="top"/>
-          </w:tcPr>
-          <w:p>
-            <w:pPr>
-              <w:spacing w:line="300" w:lineRule="auto"/>
+            <w:vAlign w:val="center"/>
+          </w:tcPr>
+          <w:p>
+            <w:pPr>
+              <w:spacing w:line="300" w:lineRule="auto"/>
+              <w:jc w:val="left"/>
               <w:rPr>
                 <w:rFonts w:hint="eastAsia" w:ascii="Times New Roman" w:hAnsi="Times New Roman" w:eastAsia="宋体" w:cs="Times New Roman"/>
                 <w:kern w:val="2"/>
@@ -8438,34 +8558,42 @@
             </w:pPr>
             <w:r>
               <w:rPr>
-                <w:rFonts w:hint="eastAsia"/>
-                <w:sz w:val="24"/>
+                <w:rFonts w:hint="eastAsia" w:ascii="宋体" w:hAnsi="宋体" w:eastAsia="宋体" w:cs="宋体"/>
+                <w:sz w:val="24"/>
+                <w:szCs w:val="24"/>
               </w:rPr>
               <w:t>0</w:t>
             </w:r>
             <w:r>
               <w:rPr>
-                <w:sz w:val="24"/>
+                <w:rFonts w:ascii="宋体" w:hAnsi="宋体" w:eastAsia="宋体" w:cs="宋体"/>
+                <w:sz w:val="24"/>
+                <w:szCs w:val="24"/>
               </w:rPr>
               <w:t xml:space="preserve">.03 </w:t>
             </w:r>
             <w:r>
               <w:rPr>
-                <w:rFonts w:hint="eastAsia"/>
-                <w:sz w:val="24"/>
+                <w:rFonts w:hint="eastAsia" w:ascii="宋体" w:hAnsi="宋体" w:eastAsia="宋体" w:cs="宋体"/>
+                <w:sz w:val="24"/>
+                <w:szCs w:val="24"/>
               </w:rPr>
               <w:t>mg</w:t>
             </w:r>
             <w:r>
               <w:rPr>
-                <w:sz w:val="24"/>
+                <w:rFonts w:ascii="宋体" w:hAnsi="宋体" w:eastAsia="宋体" w:cs="宋体"/>
+                <w:sz w:val="24"/>
+                <w:szCs w:val="24"/>
               </w:rPr>
               <w:t>/m</w:t>
             </w:r>
             <w:r>
               <w:rPr>
+                <w:rFonts w:ascii="宋体" w:hAnsi="宋体" w:eastAsia="宋体" w:cs="宋体"/>
                 <w:sz w:val="24"/>
                 <w:vertAlign w:val="superscript"/>
+                <w:szCs w:val="24"/>
               </w:rPr>
               <w:t>3</w:t>
             </w:r>
@@ -8502,11 +8630,12 @@
               <w:right w:val="dotted" w:color="auto" w:sz="4" w:space="0"/>
             </w:tcBorders>
             <w:shd w:val="clear" w:color="auto" w:fill="auto"/>
-            <w:vAlign w:val="top"/>
-          </w:tcPr>
-          <w:p>
-            <w:pPr>
-              <w:spacing w:line="300" w:lineRule="auto"/>
+            <w:vAlign w:val="center"/>
+          </w:tcPr>
+          <w:p>
+            <w:pPr>
+              <w:spacing w:line="300" w:lineRule="auto"/>
+              <w:jc w:val="left"/>
               <w:rPr>
                 <w:rFonts w:hint="eastAsia" w:ascii="Times New Roman" w:hAnsi="Times New Roman" w:eastAsia="宋体" w:cs="Times New Roman"/>
                 <w:kern w:val="2"/>
@@ -8517,8 +8646,9 @@
             </w:pPr>
             <w:r>
               <w:rPr>
-                <w:rFonts w:hint="eastAsia"/>
-                <w:sz w:val="24"/>
+                <w:rFonts w:hint="eastAsia" w:ascii="宋体" w:hAnsi="宋体" w:eastAsia="宋体" w:cs="宋体"/>
+                <w:sz w:val="24"/>
+                <w:szCs w:val="24"/>
               </w:rPr>
               <w:t>丙二醇甲醚醋酸酯</w:t>
             </w:r>
@@ -8535,11 +8665,12 @@
               <w:right w:val="dotted" w:color="auto" w:sz="4" w:space="0"/>
             </w:tcBorders>
             <w:shd w:val="clear" w:color="auto" w:fill="auto"/>
-            <w:vAlign w:val="top"/>
-          </w:tcPr>
-          <w:p>
-            <w:pPr>
-              <w:spacing w:line="300" w:lineRule="auto"/>
+            <w:vAlign w:val="center"/>
+          </w:tcPr>
+          <w:p>
+            <w:pPr>
+              <w:spacing w:line="300" w:lineRule="auto"/>
+              <w:jc w:val="left"/>
               <w:rPr>
                 <w:rFonts w:hint="eastAsia" w:ascii="Times New Roman" w:hAnsi="Times New Roman" w:eastAsia="宋体" w:cs="Times New Roman"/>
                 <w:kern w:val="2"/>
@@ -8550,21 +8681,25 @@
             </w:pPr>
             <w:r>
               <w:rPr>
-                <w:rFonts w:hint="eastAsia"/>
-                <w:sz w:val="24"/>
+                <w:rFonts w:hint="eastAsia" w:ascii="宋体" w:hAnsi="宋体" w:eastAsia="宋体" w:cs="宋体"/>
+                <w:sz w:val="24"/>
+                <w:szCs w:val="24"/>
               </w:rPr>
               <w:t>CN</w:t>
             </w:r>
             <w:r>
               <w:rPr>
-                <w:sz w:val="24"/>
+                <w:rFonts w:ascii="宋体" w:hAnsi="宋体" w:eastAsia="宋体" w:cs="宋体"/>
+                <w:sz w:val="24"/>
+                <w:szCs w:val="24"/>
               </w:rPr>
               <w:t xml:space="preserve"> </w:t>
             </w:r>
             <w:r>
               <w:rPr>
-                <w:rFonts w:hint="eastAsia"/>
-                <w:sz w:val="24"/>
+                <w:rFonts w:hint="eastAsia" w:ascii="宋体" w:hAnsi="宋体" w:eastAsia="宋体" w:cs="宋体"/>
+                <w:sz w:val="24"/>
+                <w:szCs w:val="24"/>
               </w:rPr>
               <w:t>OEL</w:t>
             </w:r>
@@ -8580,11 +8715,12 @@
               <w:right w:val="dotted" w:color="auto" w:sz="4" w:space="0"/>
             </w:tcBorders>
             <w:shd w:val="clear" w:color="auto" w:fill="auto"/>
-            <w:vAlign w:val="top"/>
-          </w:tcPr>
-          <w:p>
-            <w:pPr>
-              <w:spacing w:line="300" w:lineRule="auto"/>
+            <w:vAlign w:val="center"/>
+          </w:tcPr>
+          <w:p>
+            <w:pPr>
+              <w:spacing w:line="300" w:lineRule="auto"/>
+              <w:jc w:val="left"/>
               <w:rPr>
                 <w:rFonts w:hint="eastAsia" w:ascii="Times New Roman" w:hAnsi="Times New Roman" w:eastAsia="宋体" w:cs="Times New Roman"/>
                 <w:kern w:val="2"/>
@@ -8595,8 +8731,9 @@
             </w:pPr>
             <w:r>
               <w:rPr>
-                <w:rFonts w:hint="eastAsia"/>
-                <w:sz w:val="24"/>
+                <w:rFonts w:hint="eastAsia" w:ascii="宋体" w:hAnsi="宋体" w:eastAsia="宋体" w:cs="宋体"/>
+                <w:sz w:val="24"/>
+                <w:szCs w:val="24"/>
               </w:rPr>
               <w:t>TWA</w:t>
             </w:r>
@@ -8612,11 +8749,12 @@
               <w:right w:val="single" w:color="auto" w:sz="4" w:space="0"/>
             </w:tcBorders>
             <w:shd w:val="clear" w:color="auto" w:fill="auto"/>
-            <w:vAlign w:val="top"/>
-          </w:tcPr>
-          <w:p>
-            <w:pPr>
-              <w:spacing w:line="300" w:lineRule="auto"/>
+            <w:vAlign w:val="center"/>
+          </w:tcPr>
+          <w:p>
+            <w:pPr>
+              <w:spacing w:line="300" w:lineRule="auto"/>
+              <w:jc w:val="left"/>
               <w:rPr>
                 <w:rFonts w:hint="eastAsia" w:ascii="Times New Roman" w:hAnsi="Times New Roman" w:eastAsia="宋体" w:cs="Times New Roman"/>
                 <w:kern w:val="2"/>
@@ -8627,27 +8765,34 @@
             </w:pPr>
             <w:r>
               <w:rPr>
-                <w:sz w:val="24"/>
+                <w:rFonts w:ascii="宋体" w:hAnsi="宋体" w:eastAsia="宋体" w:cs="宋体"/>
+                <w:sz w:val="24"/>
+                <w:szCs w:val="24"/>
               </w:rPr>
               <w:t xml:space="preserve">100 </w:t>
             </w:r>
             <w:r>
               <w:rPr>
-                <w:rFonts w:hint="eastAsia"/>
-                <w:sz w:val="24"/>
+                <w:rFonts w:hint="eastAsia" w:ascii="宋体" w:hAnsi="宋体" w:eastAsia="宋体" w:cs="宋体"/>
+                <w:sz w:val="24"/>
+                <w:szCs w:val="24"/>
               </w:rPr>
               <w:t>mg</w:t>
             </w:r>
             <w:r>
               <w:rPr>
-                <w:sz w:val="24"/>
+                <w:rFonts w:ascii="宋体" w:hAnsi="宋体" w:eastAsia="宋体" w:cs="宋体"/>
+                <w:sz w:val="24"/>
+                <w:szCs w:val="24"/>
               </w:rPr>
               <w:t>/m</w:t>
             </w:r>
             <w:r>
               <w:rPr>
+                <w:rFonts w:ascii="宋体" w:hAnsi="宋体" w:eastAsia="宋体" w:cs="宋体"/>
                 <w:sz w:val="24"/>
                 <w:vertAlign w:val="superscript"/>
+                <w:szCs w:val="24"/>
               </w:rPr>
               <w:t>3</w:t>
             </w:r>
@@ -9003,8 +9148,9 @@
             </w:pPr>
             <w:r>
               <w:rPr>
-                <w:rFonts w:hint="eastAsia"/>
-                <w:sz w:val="24"/>
+                <w:rFonts w:hint="eastAsia" w:ascii="宋体" w:hAnsi="宋体" w:eastAsia="宋体" w:cs="宋体"/>
+                <w:sz w:val="24"/>
+                <w:szCs w:val="24"/>
               </w:rPr>
               <w:t>无数据</w:t>
             </w:r>
@@ -9131,8 +9277,9 @@
             </w:pPr>
             <w:r>
               <w:rPr>
-                <w:rFonts w:hint="eastAsia"/>
-                <w:sz w:val="24"/>
+                <w:rFonts w:hint="eastAsia" w:ascii="宋体" w:hAnsi="宋体" w:eastAsia="宋体" w:cs="宋体"/>
+                <w:sz w:val="24"/>
+                <w:szCs w:val="24"/>
               </w:rPr>
               <w:t>7-9</w:t>
             </w:r>
@@ -9259,7 +9406,7 @@
             </w:pPr>
             <w:r>
               <w:rPr>
-                <w:rFonts w:hint="eastAsia" w:ascii="宋体" w:hAnsi="宋体" w:cs="宋体"/>
+                <w:rFonts w:hint="eastAsia" w:ascii="宋体" w:hAnsi="宋体" w:cs="宋体" w:eastAsia="宋体"/>
                 <w:color w:val="000000"/>
                 <w:sz w:val="24"/>
                 <w:szCs w:val="24"/>
@@ -9386,8 +9533,9 @@
             </w:pPr>
             <w:r>
               <w:rPr>
-                <w:rFonts w:hint="eastAsia"/>
-                <w:sz w:val="24"/>
+                <w:rFonts w:hint="eastAsia" w:ascii="宋体" w:hAnsi="宋体" w:eastAsia="宋体" w:cs="宋体"/>
+                <w:sz w:val="24"/>
+                <w:szCs w:val="24"/>
               </w:rPr>
               <w:t>无数据</w:t>
             </w:r>
@@ -9522,8 +9670,9 @@
             </w:pPr>
             <w:r>
               <w:rPr>
-                <w:rFonts w:hint="eastAsia"/>
-                <w:sz w:val="24"/>
+                <w:rFonts w:hint="eastAsia" w:ascii="宋体" w:hAnsi="宋体" w:eastAsia="宋体" w:cs="宋体"/>
+                <w:sz w:val="24"/>
+                <w:szCs w:val="24"/>
               </w:rPr>
               <w:t>无数据</w:t>
             </w:r>
@@ -9658,8 +9807,9 @@
             </w:pPr>
             <w:r>
               <w:rPr>
-                <w:rFonts w:hint="eastAsia"/>
-                <w:sz w:val="24"/>
+                <w:rFonts w:hint="eastAsia" w:ascii="宋体" w:hAnsi="宋体" w:eastAsia="宋体" w:cs="宋体"/>
+                <w:sz w:val="24"/>
+                <w:szCs w:val="24"/>
               </w:rPr>
               <w:t>无数据</w:t>
             </w:r>
@@ -9783,8 +9933,9 @@
             </w:pPr>
             <w:r>
               <w:rPr>
-                <w:rFonts w:hint="eastAsia"/>
-                <w:sz w:val="24"/>
+                <w:rFonts w:hint="eastAsia" w:ascii="宋体" w:hAnsi="宋体" w:eastAsia="宋体" w:cs="宋体"/>
+                <w:sz w:val="24"/>
+                <w:szCs w:val="24"/>
               </w:rPr>
               <w:t>无数据</w:t>
             </w:r>
@@ -9909,8 +10060,9 @@
             </w:pPr>
             <w:r>
               <w:rPr>
-                <w:rFonts w:hint="eastAsia"/>
-                <w:sz w:val="24"/>
+                <w:rFonts w:hint="eastAsia" w:ascii="宋体" w:hAnsi="宋体" w:eastAsia="宋体" w:cs="宋体"/>
+                <w:sz w:val="24"/>
+                <w:szCs w:val="24"/>
               </w:rPr>
               <w:t>无数据</w:t>
             </w:r>
@@ -10034,8 +10186,9 @@
             </w:pPr>
             <w:r>
               <w:rPr>
-                <w:rFonts w:hint="eastAsia"/>
-                <w:sz w:val="24"/>
+                <w:rFonts w:hint="eastAsia" w:ascii="宋体" w:hAnsi="宋体" w:eastAsia="宋体" w:cs="宋体"/>
+                <w:sz w:val="24"/>
+                <w:szCs w:val="24"/>
               </w:rPr>
               <w:t>无数据</w:t>
             </w:r>
@@ -10159,8 +10312,9 @@
             </w:pPr>
             <w:r>
               <w:rPr>
-                <w:rFonts w:hint="eastAsia"/>
-                <w:sz w:val="24"/>
+                <w:rFonts w:hint="eastAsia" w:ascii="宋体" w:hAnsi="宋体" w:eastAsia="宋体" w:cs="宋体"/>
+                <w:sz w:val="24"/>
+                <w:szCs w:val="24"/>
               </w:rPr>
               <w:t>无数据</w:t>
             </w:r>
@@ -10286,8 +10440,9 @@
             </w:pPr>
             <w:r>
               <w:rPr>
-                <w:rFonts w:hint="eastAsia"/>
-                <w:sz w:val="24"/>
+                <w:rFonts w:hint="eastAsia" w:ascii="宋体" w:hAnsi="宋体" w:eastAsia="宋体" w:cs="宋体"/>
+                <w:sz w:val="24"/>
+                <w:szCs w:val="24"/>
               </w:rPr>
               <w:t>无数据</w:t>
             </w:r>
@@ -10411,8 +10566,9 @@
             </w:pPr>
             <w:r>
               <w:rPr>
-                <w:rFonts w:hint="eastAsia"/>
-                <w:sz w:val="24"/>
+                <w:rFonts w:hint="eastAsia" w:ascii="宋体" w:hAnsi="宋体" w:eastAsia="宋体" w:cs="宋体"/>
+                <w:sz w:val="24"/>
+                <w:szCs w:val="24"/>
               </w:rPr>
               <w:t>无数据</w:t>
             </w:r>
@@ -10536,8 +10692,9 @@
             </w:pPr>
             <w:r>
               <w:rPr>
-                <w:rFonts w:hint="eastAsia"/>
-                <w:sz w:val="24"/>
+                <w:rFonts w:hint="eastAsia" w:ascii="宋体" w:hAnsi="宋体" w:eastAsia="宋体" w:cs="宋体"/>
+                <w:sz w:val="24"/>
+                <w:szCs w:val="24"/>
               </w:rPr>
               <w:t>无数据</w:t>
             </w:r>
@@ -10662,8 +10819,9 @@
             </w:pPr>
             <w:r>
               <w:rPr>
-                <w:rFonts w:hint="eastAsia"/>
-                <w:sz w:val="24"/>
+                <w:rFonts w:hint="eastAsia" w:ascii="宋体" w:hAnsi="宋体" w:eastAsia="宋体" w:cs="宋体"/>
+                <w:sz w:val="24"/>
+                <w:szCs w:val="24"/>
               </w:rPr>
               <w:t>无数据</w:t>
             </w:r>
@@ -10789,8 +10947,9 @@
             </w:pPr>
             <w:r>
               <w:rPr>
-                <w:rFonts w:hint="eastAsia"/>
-                <w:sz w:val="24"/>
+                <w:rFonts w:hint="eastAsia" w:ascii="宋体" w:hAnsi="宋体" w:eastAsia="宋体" w:cs="宋体"/>
+                <w:sz w:val="24"/>
+                <w:szCs w:val="24"/>
               </w:rPr>
               <w:t>无数据</w:t>
             </w:r>
@@ -10918,8 +11077,9 @@
             </w:pPr>
             <w:r>
               <w:rPr>
-                <w:rFonts w:hint="eastAsia"/>
-                <w:sz w:val="24"/>
+                <w:rFonts w:hint="eastAsia" w:ascii="宋体" w:hAnsi="宋体" w:eastAsia="宋体" w:cs="宋体"/>
+                <w:sz w:val="24"/>
+                <w:szCs w:val="24"/>
               </w:rPr>
               <w:t>无数据</w:t>
             </w:r>
@@ -11047,8 +11207,9 @@
             </w:pPr>
             <w:r>
               <w:rPr>
-                <w:rFonts w:hint="eastAsia"/>
-                <w:sz w:val="24"/>
+                <w:rFonts w:hint="eastAsia" w:ascii="宋体" w:hAnsi="宋体" w:eastAsia="宋体" w:cs="宋体"/>
+                <w:sz w:val="24"/>
+                <w:szCs w:val="24"/>
               </w:rPr>
               <w:t>无数据</w:t>
             </w:r>
@@ -11147,7 +11308,7 @@
               <w:left w:val="dotted" w:color="auto" w:sz="4" w:space="0"/>
               <w:bottom w:val="dotted" w:color="auto" w:sz="4" w:space="0"/>
             </w:tcBorders>
-            <w:vAlign w:val="top"/>
+            <w:vAlign w:val="center"/>
           </w:tcPr>
           <w:p>
             <w:pPr>
@@ -11172,8 +11333,9 @@
             </w:pPr>
             <w:r>
               <w:rPr>
-                <w:rFonts w:hint="eastAsia"/>
-                <w:sz w:val="24"/>
+                <w:rFonts w:hint="eastAsia" w:ascii="宋体" w:hAnsi="宋体" w:eastAsia="宋体" w:cs="宋体"/>
+                <w:sz w:val="24"/>
+                <w:szCs w:val="24"/>
               </w:rPr>
               <w:t>无数据</w:t>
             </w:r>
@@ -11272,7 +11434,7 @@
               <w:left w:val="dotted" w:color="auto" w:sz="4" w:space="0"/>
               <w:bottom w:val="dotted" w:color="auto" w:sz="4" w:space="0"/>
             </w:tcBorders>
-            <w:vAlign w:val="top"/>
+            <w:vAlign w:val="center"/>
           </w:tcPr>
           <w:p>
             <w:pPr>
@@ -11297,8 +11459,9 @@
             </w:pPr>
             <w:r>
               <w:rPr>
-                <w:rFonts w:hint="eastAsia"/>
-                <w:sz w:val="24"/>
+                <w:rFonts w:hint="eastAsia" w:ascii="宋体" w:hAnsi="宋体" w:eastAsia="宋体" w:cs="宋体"/>
+                <w:sz w:val="24"/>
+                <w:szCs w:val="24"/>
               </w:rPr>
               <w:t>无数据</w:t>
             </w:r>
@@ -11397,7 +11560,7 @@
               <w:left w:val="dotted" w:color="auto" w:sz="4" w:space="0"/>
               <w:bottom w:val="dotted" w:color="auto" w:sz="4" w:space="0"/>
             </w:tcBorders>
-            <w:vAlign w:val="top"/>
+            <w:vAlign w:val="center"/>
           </w:tcPr>
           <w:p>
             <w:pPr>
@@ -11422,8 +11585,9 @@
             </w:pPr>
             <w:r>
               <w:rPr>
-                <w:rFonts w:hint="eastAsia"/>
-                <w:sz w:val="24"/>
+                <w:rFonts w:hint="eastAsia" w:ascii="宋体" w:hAnsi="宋体" w:eastAsia="宋体" w:cs="宋体"/>
+                <w:sz w:val="24"/>
+                <w:szCs w:val="24"/>
               </w:rPr>
               <w:t>无数据</w:t>
             </w:r>
@@ -11522,7 +11686,7 @@
               <w:left w:val="dotted" w:color="auto" w:sz="4" w:space="0"/>
               <w:bottom w:val="dotted" w:color="auto" w:sz="4" w:space="0"/>
             </w:tcBorders>
-            <w:vAlign w:val="top"/>
+            <w:vAlign w:val="center"/>
           </w:tcPr>
           <w:p>
             <w:pPr>
@@ -11547,8 +11711,9 @@
             </w:pPr>
             <w:r>
               <w:rPr>
-                <w:rFonts w:hint="eastAsia"/>
-                <w:sz w:val="24"/>
+                <w:rFonts w:hint="eastAsia" w:ascii="宋体" w:hAnsi="宋体" w:eastAsia="宋体" w:cs="宋体"/>
+                <w:sz w:val="24"/>
+                <w:szCs w:val="24"/>
               </w:rPr>
               <w:t>无数据</w:t>
             </w:r>
@@ -11647,7 +11812,7 @@
               <w:left w:val="dotted" w:color="auto" w:sz="4" w:space="0"/>
               <w:bottom w:val="single" w:color="auto" w:sz="4" w:space="0"/>
             </w:tcBorders>
-            <w:vAlign w:val="top"/>
+            <w:vAlign w:val="center"/>
           </w:tcPr>
           <w:p>
             <w:pPr>
@@ -11672,8 +11837,9 @@
             </w:pPr>
             <w:r>
               <w:rPr>
-                <w:rFonts w:hint="eastAsia"/>
-                <w:sz w:val="24"/>
+                <w:rFonts w:hint="eastAsia" w:ascii="宋体" w:hAnsi="宋体" w:eastAsia="宋体" w:cs="宋体"/>
+                <w:sz w:val="24"/>
+                <w:szCs w:val="24"/>
               </w:rPr>
               <w:t>无数据</w:t>
             </w:r>
@@ -11874,7 +12040,7 @@
               <w:left w:val="dotted" w:color="auto" w:sz="4" w:space="0"/>
               <w:bottom w:val="dotted" w:color="auto" w:sz="4" w:space="0"/>
             </w:tcBorders>
-            <w:vAlign w:val="top"/>
+            <w:vAlign w:val="center"/>
           </w:tcPr>
           <w:p>
             <w:pPr>
@@ -11901,8 +12067,9 @@
             </w:pPr>
             <w:r>
               <w:rPr>
-                <w:rFonts w:hint="eastAsia" w:hAnsi="Arial"/>
-                <w:sz w:val="24"/>
+                <w:rFonts w:hint="eastAsia" w:hAnsi="宋体" w:ascii="宋体" w:eastAsia="宋体" w:cs="宋体"/>
+                <w:sz w:val="24"/>
+                <w:szCs w:val="24"/>
               </w:rPr>
               <w:t>在推荐储存和操作条件下稳定。避免冻结、过热和长期阳光照射。</w:t>
             </w:r>
@@ -12010,7 +12177,7 @@
               <w:left w:val="dotted" w:color="auto" w:sz="4" w:space="0"/>
               <w:bottom w:val="dotted" w:color="auto" w:sz="4" w:space="0"/>
             </w:tcBorders>
-            <w:vAlign w:val="top"/>
+            <w:vAlign w:val="center"/>
           </w:tcPr>
           <w:p>
             <w:pPr>
@@ -12038,8 +12205,9 @@
             </w:pPr>
             <w:r>
               <w:rPr>
-                <w:rFonts w:hint="eastAsia" w:hAnsi="Arial"/>
-                <w:sz w:val="24"/>
+                <w:rFonts w:hint="eastAsia" w:hAnsi="宋体" w:ascii="宋体" w:eastAsia="宋体" w:cs="宋体"/>
+                <w:sz w:val="24"/>
+                <w:szCs w:val="24"/>
               </w:rPr>
               <w:t>受热分解或燃烧可能产生一氧化碳、二氧化碳、氮氧化物及刺激性烟气。</w:t>
             </w:r>
@@ -12147,7 +12315,7 @@
               <w:left w:val="dotted" w:color="auto" w:sz="4" w:space="0"/>
               <w:bottom w:val="dotted" w:color="auto" w:sz="4" w:space="0"/>
             </w:tcBorders>
-            <w:vAlign w:val="top"/>
+            <w:vAlign w:val="center"/>
           </w:tcPr>
           <w:p>
             <w:pPr>
@@ -12173,8 +12341,9 @@
             </w:pPr>
             <w:r>
               <w:rPr>
-                <w:rFonts w:hint="eastAsia" w:hAnsi="Arial"/>
-                <w:sz w:val="24"/>
+                <w:rFonts w:hint="eastAsia" w:hAnsi="宋体" w:ascii="宋体" w:eastAsia="宋体" w:cs="宋体"/>
+                <w:sz w:val="24"/>
+                <w:szCs w:val="24"/>
               </w:rPr>
               <w:t>正常使用条件下无已知危险反应；</w:t>
             </w:r>
@@ -12296,7 +12465,7 @@
               <w:left w:val="dotted" w:color="auto" w:sz="4" w:space="0"/>
               <w:bottom w:val="dotted" w:color="auto" w:sz="4" w:space="0"/>
             </w:tcBorders>
-            <w:vAlign w:val="top"/>
+            <w:vAlign w:val="center"/>
           </w:tcPr>
           <w:p>
             <w:pPr>
@@ -12324,9 +12493,10 @@
             </w:pPr>
             <w:r>
               <w:rPr>
-                <w:rFonts w:hint="eastAsia" w:hAnsi="Arial"/>
+                <w:rFonts w:hint="eastAsia" w:hAnsi="宋体" w:ascii="宋体" w:eastAsia="宋体" w:cs="宋体"/>
                 <w:sz w:val="24"/>
                 <w:lang w:val="en-US" w:eastAsia="zh-CN"/>
+                <w:szCs w:val="24"/>
               </w:rPr>
               <w:t>无数据</w:t>
             </w:r>
@@ -12429,7 +12599,7 @@
               <w:left w:val="dotted" w:color="auto" w:sz="4" w:space="0"/>
               <w:bottom w:val="single" w:color="auto" w:sz="4" w:space="0"/>
             </w:tcBorders>
-            <w:vAlign w:val="top"/>
+            <w:vAlign w:val="center"/>
           </w:tcPr>
           <w:p>
             <w:pPr>
@@ -12457,9 +12627,10 @@
             </w:pPr>
             <w:r>
               <w:rPr>
-                <w:rFonts w:hint="eastAsia" w:hAnsi="Arial"/>
+                <w:rFonts w:hint="eastAsia" w:hAnsi="宋体" w:ascii="宋体" w:eastAsia="宋体" w:cs="宋体"/>
                 <w:sz w:val="24"/>
                 <w:lang w:val="en-US" w:eastAsia="zh-CN"/>
+                <w:szCs w:val="24"/>
               </w:rPr>
               <w:t>无数据</w:t>
             </w:r>
@@ -12586,6 +12757,7 @@
               <w:top w:val="single" w:color="auto" w:sz="4" w:space="0"/>
               <w:bottom w:val="dotted" w:color="auto" w:sz="4" w:space="0"/>
             </w:tcBorders>
+            <w:vAlign w:val="center"/>
           </w:tcPr>
           <w:p>
             <w:pPr>
@@ -12611,8 +12783,9 @@
             </w:pPr>
             <w:r>
               <w:rPr>
-                <w:rFonts w:hint="eastAsia" w:hAnsi="Arial"/>
-                <w:sz w:val="24"/>
+                <w:rFonts w:hint="eastAsia" w:hAnsi="宋体" w:ascii="宋体" w:eastAsia="宋体" w:cs="宋体"/>
+                <w:sz w:val="24"/>
+                <w:szCs w:val="24"/>
               </w:rPr>
               <w:t>该产品无可用的毒理学研究。</w:t>
             </w:r>
@@ -12648,6 +12821,7 @@
               <w:top w:val="dotted" w:color="auto" w:sz="4" w:space="0"/>
               <w:bottom w:val="dotted" w:color="auto" w:sz="4" w:space="0"/>
             </w:tcBorders>
+            <w:vAlign w:val="center"/>
           </w:tcPr>
           <w:p>
             <w:pPr>
@@ -12846,6 +13020,7 @@
               <w:left w:val="dotted" w:color="auto" w:sz="4" w:space="0"/>
               <w:bottom w:val="dotted" w:color="auto" w:sz="4" w:space="0"/>
             </w:tcBorders>
+            <w:vAlign w:val="center"/>
           </w:tcPr>
           <w:p>
             <w:pPr>
@@ -12874,9 +13049,10 @@
             </w:pPr>
             <w:r>
               <w:rPr>
-                <w:rFonts w:hint="eastAsia"/>
+                <w:rFonts w:hint="eastAsia" w:ascii="宋体" w:hAnsi="宋体" w:eastAsia="宋体" w:cs="宋体"/>
                 <w:sz w:val="24"/>
                 <w:lang w:val="en-US" w:eastAsia="zh-CN"/>
+                <w:szCs w:val="24"/>
               </w:rPr>
               <w:t>半数致死剂量（LD50）/大鼠：约3,306 mg/kg。</w:t>
             </w:r>
@@ -13008,6 +13184,7 @@
               <w:left w:val="dotted" w:color="auto" w:sz="4" w:space="0"/>
               <w:bottom w:val="dotted" w:color="auto" w:sz="4" w:space="0"/>
             </w:tcBorders>
+            <w:vAlign w:val="center"/>
           </w:tcPr>
           <w:p>
             <w:pPr>
@@ -13036,9 +13213,10 @@
             </w:pPr>
             <w:r>
               <w:rPr>
-                <w:rFonts w:hint="eastAsia"/>
+                <w:rFonts w:hint="eastAsia" w:ascii="宋体" w:hAnsi="宋体" w:eastAsia="宋体" w:cs="宋体"/>
                 <w:sz w:val="24"/>
                 <w:lang w:val="en-US" w:eastAsia="zh-CN"/>
+                <w:szCs w:val="24"/>
               </w:rPr>
               <w:t xml:space="preserve">半数致死浓度（LC50）/4 h/大鼠： ＞1.5 mg/L（气溶胶）。 </w:t>
             </w:r>
@@ -13170,6 +13348,7 @@
               <w:left w:val="dotted" w:color="auto" w:sz="4" w:space="0"/>
               <w:bottom w:val="dotted" w:color="auto" w:sz="4" w:space="0"/>
             </w:tcBorders>
+            <w:vAlign w:val="center"/>
           </w:tcPr>
           <w:p>
             <w:pPr>
@@ -13198,9 +13377,10 @@
             </w:pPr>
             <w:r>
               <w:rPr>
-                <w:rFonts w:hint="eastAsia"/>
+                <w:rFonts w:hint="eastAsia" w:ascii="宋体" w:hAnsi="宋体" w:eastAsia="宋体" w:cs="宋体"/>
                 <w:sz w:val="24"/>
                 <w:lang w:val="en-US" w:eastAsia="zh-CN"/>
+                <w:szCs w:val="24"/>
               </w:rPr>
               <w:t>半数致死剂量（LD50）/兔：2,764 mg/kg。</w:t>
             </w:r>
@@ -13269,6 +13449,7 @@
               <w:left w:val="dotted" w:color="auto" w:sz="4" w:space="0"/>
               <w:bottom w:val="dotted" w:color="auto" w:sz="4" w:space="0"/>
             </w:tcBorders>
+            <w:vAlign w:val="center"/>
           </w:tcPr>
           <w:p>
             <w:pPr>
@@ -13297,9 +13478,10 @@
             </w:pPr>
             <w:r>
               <w:rPr>
-                <w:rFonts w:hint="eastAsia"/>
+                <w:rFonts w:hint="eastAsia" w:ascii="宋体" w:hAnsi="宋体" w:eastAsia="宋体" w:cs="宋体"/>
                 <w:sz w:val="24"/>
                 <w:lang w:val="en-US" w:eastAsia="zh-CN"/>
+                <w:szCs w:val="24"/>
               </w:rPr>
               <w:t>根据现有数据，二乙二醇单丁醚未达到急性经口、 经皮或气溶胶吸入毒性的分类标准。</w:t>
             </w:r>
@@ -13417,6 +13599,7 @@
               <w:left w:val="dotted" w:color="auto" w:sz="4" w:space="0"/>
               <w:bottom w:val="dotted" w:color="auto" w:sz="4" w:space="0"/>
             </w:tcBorders>
+            <w:vAlign w:val="center"/>
           </w:tcPr>
           <w:p>
             <w:pPr>
@@ -13445,9 +13628,10 @@
             </w:pPr>
             <w:r>
               <w:rPr>
-                <w:rFonts w:hint="eastAsia"/>
+                <w:rFonts w:hint="eastAsia" w:ascii="宋体" w:hAnsi="宋体" w:eastAsia="宋体" w:cs="宋体"/>
                 <w:sz w:val="24"/>
                 <w:lang w:val="en-US" w:eastAsia="zh-CN"/>
+                <w:szCs w:val="24"/>
               </w:rPr>
               <w:t>物种：兔子</w:t>
             </w:r>
@@ -13479,9 +13663,10 @@
             </w:pPr>
             <w:r>
               <w:rPr>
-                <w:rFonts w:hint="eastAsia"/>
+                <w:rFonts w:hint="eastAsia" w:ascii="宋体" w:hAnsi="宋体" w:eastAsia="宋体" w:cs="宋体"/>
                 <w:sz w:val="24"/>
                 <w:lang w:val="en-US" w:eastAsia="zh-CN"/>
+                <w:szCs w:val="24"/>
               </w:rPr>
               <w:t>分类：</w:t>
             </w:r>
@@ -13521,9 +13706,10 @@
             </w:pPr>
             <w:r>
               <w:rPr>
-                <w:rFonts w:hint="eastAsia"/>
+                <w:rFonts w:hint="eastAsia" w:ascii="宋体" w:hAnsi="宋体" w:eastAsia="宋体" w:cs="宋体"/>
                 <w:sz w:val="24"/>
                 <w:lang w:val="en-US" w:eastAsia="zh-CN"/>
+                <w:szCs w:val="24"/>
               </w:rPr>
               <w:t>结果：</w:t>
             </w:r>
@@ -13655,6 +13841,7 @@
               <w:left w:val="dotted" w:color="auto" w:sz="4" w:space="0"/>
               <w:bottom w:val="dotted" w:color="auto" w:sz="4" w:space="0"/>
             </w:tcBorders>
+            <w:vAlign w:val="center"/>
           </w:tcPr>
           <w:p>
             <w:pPr>
@@ -13683,9 +13870,10 @@
             </w:pPr>
             <w:r>
               <w:rPr>
-                <w:rFonts w:hint="eastAsia"/>
+                <w:rFonts w:hint="eastAsia" w:ascii="宋体" w:hAnsi="宋体" w:eastAsia="宋体" w:cs="宋体"/>
                 <w:sz w:val="24"/>
                 <w:lang w:val="en-US" w:eastAsia="zh-CN"/>
+                <w:szCs w:val="24"/>
               </w:rPr>
               <w:t>物种：兔子</w:t>
             </w:r>
@@ -13717,9 +13905,10 @@
             </w:pPr>
             <w:r>
               <w:rPr>
-                <w:rFonts w:hint="eastAsia"/>
+                <w:rFonts w:hint="eastAsia" w:ascii="宋体" w:hAnsi="宋体" w:eastAsia="宋体" w:cs="宋体"/>
                 <w:sz w:val="24"/>
                 <w:lang w:val="en-US" w:eastAsia="zh-CN"/>
+                <w:szCs w:val="24"/>
               </w:rPr>
               <w:t>分类：刺激眼睛</w:t>
             </w:r>
@@ -13751,9 +13940,10 @@
             </w:pPr>
             <w:r>
               <w:rPr>
-                <w:rFonts w:hint="eastAsia"/>
+                <w:rFonts w:hint="eastAsia" w:ascii="宋体" w:hAnsi="宋体" w:eastAsia="宋体" w:cs="宋体"/>
                 <w:sz w:val="24"/>
                 <w:lang w:val="en-US" w:eastAsia="zh-CN"/>
+                <w:szCs w:val="24"/>
               </w:rPr>
               <w:t>结果：</w:t>
             </w:r>
@@ -13868,6 +14058,7 @@
               <w:left w:val="dotted" w:color="auto" w:sz="4" w:space="0"/>
               <w:bottom w:val="dotted" w:color="auto" w:sz="4" w:space="0"/>
             </w:tcBorders>
+            <w:vAlign w:val="center"/>
           </w:tcPr>
           <w:p>
             <w:pPr>
@@ -13896,9 +14087,10 @@
             </w:pPr>
             <w:r>
               <w:rPr>
-                <w:rFonts w:hint="eastAsia"/>
+                <w:rFonts w:hint="eastAsia" w:ascii="宋体" w:hAnsi="宋体" w:eastAsia="宋体" w:cs="宋体"/>
                 <w:sz w:val="24"/>
                 <w:lang w:val="en-US" w:eastAsia="zh-CN"/>
+                <w:szCs w:val="24"/>
               </w:rPr>
               <w:t>物种：</w:t>
             </w:r>
@@ -13938,9 +14130,10 @@
             </w:pPr>
             <w:r>
               <w:rPr>
-                <w:rFonts w:hint="eastAsia"/>
+                <w:rFonts w:hint="eastAsia" w:ascii="宋体" w:hAnsi="宋体" w:eastAsia="宋体" w:cs="宋体"/>
                 <w:sz w:val="24"/>
                 <w:lang w:val="en-US" w:eastAsia="zh-CN"/>
+                <w:szCs w:val="24"/>
               </w:rPr>
               <w:t>分类：</w:t>
             </w:r>
@@ -13980,9 +14173,10 @@
             </w:pPr>
             <w:r>
               <w:rPr>
-                <w:rFonts w:hint="eastAsia"/>
+                <w:rFonts w:hint="eastAsia" w:ascii="宋体" w:hAnsi="宋体" w:eastAsia="宋体" w:cs="宋体"/>
                 <w:sz w:val="24"/>
                 <w:lang w:val="en-US" w:eastAsia="zh-CN"/>
+                <w:szCs w:val="24"/>
               </w:rPr>
               <w:t>结果：</w:t>
             </w:r>
@@ -14097,6 +14291,7 @@
               <w:left w:val="dotted" w:color="auto" w:sz="4" w:space="0"/>
               <w:bottom w:val="dotted" w:color="auto" w:sz="4" w:space="0"/>
             </w:tcBorders>
+            <w:vAlign w:val="center"/>
           </w:tcPr>
           <w:p>
             <w:pPr>
@@ -14236,6 +14431,7 @@
               <w:left w:val="dotted" w:color="auto" w:sz="4" w:space="0"/>
               <w:bottom w:val="dotted" w:color="auto" w:sz="4" w:space="0"/>
             </w:tcBorders>
+            <w:vAlign w:val="center"/>
           </w:tcPr>
           <w:p>
             <w:pPr>
@@ -14264,9 +14460,10 @@
             </w:pPr>
             <w:r>
               <w:rPr>
-                <w:rFonts w:hint="eastAsia" w:hAnsi="Arial"/>
+                <w:rFonts w:hint="eastAsia" w:hAnsi="宋体" w:ascii="宋体" w:eastAsia="宋体" w:cs="宋体"/>
                 <w:sz w:val="24"/>
                 <w:lang w:val="en-US" w:eastAsia="zh-CN"/>
+                <w:szCs w:val="24"/>
               </w:rPr>
               <w:t>在动物试验中未见致癌影响。</w:t>
             </w:r>
@@ -14424,6 +14621,7 @@
               <w:left w:val="dotted" w:color="auto" w:sz="4" w:space="0"/>
               <w:bottom w:val="dotted" w:color="auto" w:sz="4" w:space="0"/>
             </w:tcBorders>
+            <w:vAlign w:val="center"/>
           </w:tcPr>
           <w:p>
             <w:pPr>
@@ -14576,6 +14774,7 @@
               <w:left w:val="dotted" w:color="auto" w:sz="4" w:space="0"/>
               <w:bottom w:val="dotted" w:color="auto" w:sz="4" w:space="0"/>
             </w:tcBorders>
+            <w:vAlign w:val="center"/>
           </w:tcPr>
           <w:p>
             <w:pPr>
@@ -14726,6 +14925,7 @@
               <w:left w:val="dotted" w:color="auto" w:sz="4" w:space="0"/>
               <w:bottom w:val="dotted" w:color="auto" w:sz="4" w:space="0"/>
             </w:tcBorders>
+            <w:vAlign w:val="center"/>
           </w:tcPr>
           <w:p>
             <w:pPr>
@@ -14998,6 +15198,7 @@
               <w:left w:val="dotted" w:color="auto" w:sz="4" w:space="0"/>
               <w:bottom w:val="dotted" w:color="auto" w:sz="4" w:space="0"/>
             </w:tcBorders>
+            <w:vAlign w:val="center"/>
           </w:tcPr>
           <w:p>
             <w:pPr>
@@ -15026,9 +15227,10 @@
             </w:pPr>
             <w:r>
               <w:rPr>
-                <w:rFonts w:hint="eastAsia" w:hAnsi="Arial"/>
+                <w:rFonts w:hint="eastAsia" w:hAnsi="宋体" w:ascii="宋体" w:eastAsia="宋体" w:cs="宋体"/>
                 <w:sz w:val="24"/>
                 <w:lang w:val="en-US" w:eastAsia="zh-CN"/>
+                <w:szCs w:val="24"/>
               </w:rPr>
               <w:t>无数据资料。</w:t>
             </w:r>
@@ -15135,6 +15337,7 @@
               <w:top w:val="dotted" w:color="auto" w:sz="4" w:space="0"/>
               <w:left w:val="dotted" w:color="auto" w:sz="4" w:space="0"/>
             </w:tcBorders>
+            <w:vAlign w:val="center"/>
           </w:tcPr>
           <w:p>
             <w:pPr>
@@ -15416,9 +15619,10 @@
             </w:pPr>
             <w:r>
               <w:rPr>
-                <w:rFonts w:hint="eastAsia" w:hAnsi="Arial"/>
+                <w:rFonts w:hint="eastAsia" w:hAnsi="宋体" w:ascii="宋体" w:eastAsia="宋体" w:cs="宋体"/>
                 <w:sz w:val="24"/>
                 <w:shd w:val="clear" w:color="auto" w:fill="auto"/>
+                <w:szCs w:val="24"/>
               </w:rPr>
               <w:t>该产品无可用的生态毒理学研究。</w:t>
             </w:r>
@@ -15629,12 +15833,13 @@
             </w:pPr>
             <w:r>
               <w:rPr>
-                <w:rFonts w:hint="eastAsia"/>
+                <w:rFonts w:hint="eastAsia" w:ascii="宋体" w:hAnsi="宋体" w:eastAsia="宋体" w:cs="宋体"/>
                 <w:b w:val="0"/>
                 <w:bCs/>
                 <w:sz w:val="24"/>
                 <w:shd w:val="clear" w:color="auto" w:fill="auto"/>
                 <w:lang w:val="en-US" w:eastAsia="zh-CN"/>
+                <w:szCs w:val="24"/>
               </w:rPr>
               <w:t>对鱼类的毒性：</w:t>
             </w:r>
@@ -15715,12 +15920,13 @@
             </w:pPr>
             <w:r>
               <w:rPr>
-                <w:rFonts w:hint="eastAsia"/>
+                <w:rFonts w:hint="eastAsia" w:ascii="宋体" w:hAnsi="宋体" w:eastAsia="宋体" w:cs="宋体"/>
                 <w:b w:val="0"/>
                 <w:bCs/>
                 <w:sz w:val="24"/>
                 <w:shd w:val="clear" w:color="auto" w:fill="auto"/>
                 <w:lang w:val="en-US" w:eastAsia="zh-CN"/>
+                <w:szCs w:val="24"/>
               </w:rPr>
               <w:t>其他：</w:t>
             </w:r>
@@ -15941,7 +16147,7 @@
             </w:r>
             <w:r>
               <w:rPr>
-                <w:rFonts w:hint="eastAsia" w:ascii="宋体" w:hAnsi="宋体" w:cs="宋体"/>
+                <w:rFonts w:hint="eastAsia" w:ascii="宋体" w:hAnsi="宋体" w:cs="宋体" w:eastAsia="宋体"/>
                 <w:sz w:val="24"/>
                 <w:szCs w:val="24"/>
                 <w:lang w:eastAsia="zh-CN"/>
@@ -16069,6 +16275,7 @@
               <w:left w:val="dotted" w:color="auto" w:sz="4" w:space="0"/>
               <w:bottom w:val="single" w:color="auto" w:sz="4" w:space="0"/>
             </w:tcBorders>
+            <w:vAlign w:val="center"/>
           </w:tcPr>
           <w:p>
             <w:pPr>
@@ -16095,9 +16302,10 @@
             </w:pPr>
             <w:r>
               <w:rPr>
-                <w:rFonts w:hint="eastAsia" w:hAnsi="Arial"/>
+                <w:rFonts w:hint="eastAsia" w:hAnsi="宋体" w:ascii="宋体" w:eastAsia="宋体" w:cs="宋体"/>
                 <w:sz w:val="24"/>
                 <w:lang w:val="en-US" w:eastAsia="zh-CN"/>
+                <w:szCs w:val="24"/>
               </w:rPr>
               <w:t>无数据资料。</w:t>
             </w:r>
@@ -16253,8 +16461,9 @@
             </w:pPr>
             <w:r>
               <w:rPr>
-                <w:rFonts w:hint="eastAsia" w:hAnsi="Arial"/>
-                <w:sz w:val="24"/>
+                <w:rFonts w:hint="eastAsia" w:hAnsi="宋体" w:ascii="宋体" w:eastAsia="宋体" w:cs="宋体"/>
+                <w:sz w:val="24"/>
+                <w:szCs w:val="24"/>
               </w:rPr>
               <w:t>必须遵守适用的国标、国家或当地法规进行废弃。</w:t>
             </w:r>
@@ -16284,21 +16493,25 @@
             </w:pPr>
             <w:r>
               <w:rPr>
-                <w:rFonts w:hint="eastAsia" w:hAnsi="Arial"/>
-                <w:sz w:val="24"/>
+                <w:rFonts w:hint="eastAsia" w:hAnsi="宋体" w:ascii="宋体" w:eastAsia="宋体" w:cs="宋体"/>
+                <w:sz w:val="24"/>
+                <w:szCs w:val="24"/>
               </w:rPr>
               <w:t>在欧盟领域内废弃，应根据欧洲废弃物分类（</w:t>
             </w:r>
             <w:r>
               <w:rPr>
-                <w:sz w:val="24"/>
+                <w:rFonts w:ascii="宋体" w:hAnsi="宋体" w:eastAsia="宋体" w:cs="宋体"/>
+                <w:sz w:val="24"/>
+                <w:szCs w:val="24"/>
               </w:rPr>
               <w:t>EWC</w:t>
             </w:r>
             <w:r>
               <w:rPr>
-                <w:rFonts w:hint="eastAsia" w:hAnsi="Arial"/>
-                <w:sz w:val="24"/>
+                <w:rFonts w:hint="eastAsia" w:hAnsi="宋体" w:ascii="宋体" w:eastAsia="宋体" w:cs="宋体"/>
+                <w:sz w:val="24"/>
+                <w:szCs w:val="24"/>
               </w:rPr>
               <w:t>）的适当法规。</w:t>
             </w:r>
@@ -16396,44 +16609,49 @@
               <w:adjustRightInd/>
               <w:snapToGrid/>
               <w:spacing w:line="300" w:lineRule="auto"/>
-              <w:jc w:val="both"/>
-              <w:textAlignment w:val="auto"/>
-              <w:rPr>
-                <w:sz w:val="24"/>
-              </w:rPr>
-            </w:pPr>
-            <w:r>
-              <w:rPr>
-                <w:rFonts w:hint="eastAsia" w:hAnsi="Arial"/>
-                <w:sz w:val="24"/>
+              <w:jc w:val="left"/>
+              <w:textAlignment w:val="auto"/>
+              <w:rPr>
+                <w:sz w:val="24"/>
+              </w:rPr>
+            </w:pPr>
+            <w:r>
+              <w:rPr>
+                <w:rFonts w:hint="eastAsia" w:hAnsi="宋体" w:ascii="宋体" w:eastAsia="宋体" w:cs="宋体"/>
+                <w:sz w:val="24"/>
+                <w:szCs w:val="24"/>
               </w:rPr>
               <w:t>尽可能将容器倒空（例如经倾倒，刮擦或排干直至</w:t>
             </w:r>
             <w:r>
               <w:rPr>
-                <w:rFonts w:hint="eastAsia"/>
-                <w:sz w:val="24"/>
+                <w:rFonts w:hint="eastAsia" w:ascii="宋体" w:hAnsi="宋体" w:eastAsia="宋体" w:cs="宋体"/>
+                <w:sz w:val="24"/>
+                <w:szCs w:val="24"/>
               </w:rPr>
               <w:t>“</w:t>
             </w:r>
             <w:r>
               <w:rPr>
-                <w:rFonts w:hint="eastAsia" w:hAnsi="Arial"/>
-                <w:sz w:val="24"/>
+                <w:rFonts w:hint="eastAsia" w:hAnsi="宋体" w:ascii="宋体" w:eastAsia="宋体" w:cs="宋体"/>
+                <w:sz w:val="24"/>
+                <w:szCs w:val="24"/>
               </w:rPr>
               <w:t>滴干</w:t>
             </w:r>
             <w:r>
               <w:rPr>
-                <w:rFonts w:hint="eastAsia"/>
-                <w:sz w:val="24"/>
+                <w:rFonts w:hint="eastAsia" w:ascii="宋体" w:hAnsi="宋体" w:eastAsia="宋体" w:cs="宋体"/>
+                <w:sz w:val="24"/>
+                <w:szCs w:val="24"/>
               </w:rPr>
               <w:t>”</w:t>
             </w:r>
             <w:r>
               <w:rPr>
-                <w:rFonts w:hint="eastAsia" w:hAnsi="Arial"/>
-                <w:sz w:val="24"/>
+                <w:rFonts w:hint="eastAsia" w:hAnsi="宋体" w:ascii="宋体" w:eastAsia="宋体" w:cs="宋体"/>
+                <w:sz w:val="24"/>
+                <w:szCs w:val="24"/>
               </w:rPr>
               <w:t>）</w:t>
             </w:r>
@@ -16454,16 +16672,17 @@
               <w:adjustRightInd/>
               <w:snapToGrid/>
               <w:spacing w:line="300" w:lineRule="auto"/>
-              <w:jc w:val="both"/>
-              <w:textAlignment w:val="auto"/>
-              <w:rPr>
-                <w:sz w:val="24"/>
-              </w:rPr>
-            </w:pPr>
-            <w:r>
-              <w:rPr>
-                <w:rFonts w:hint="eastAsia" w:hAnsi="Arial"/>
-                <w:sz w:val="24"/>
+              <w:jc w:val="left"/>
+              <w:textAlignment w:val="auto"/>
+              <w:rPr>
+                <w:sz w:val="24"/>
+              </w:rPr>
+            </w:pPr>
+            <w:r>
+              <w:rPr>
+                <w:rFonts w:hint="eastAsia" w:hAnsi="宋体" w:ascii="宋体" w:eastAsia="宋体" w:cs="宋体"/>
+                <w:sz w:val="24"/>
+                <w:szCs w:val="24"/>
               </w:rPr>
               <w:t>可根据化学工业现存的回收方案送往适当的收集点处理。</w:t>
             </w:r>
@@ -16484,16 +16703,17 @@
               <w:adjustRightInd/>
               <w:snapToGrid/>
               <w:spacing w:line="300" w:lineRule="auto"/>
-              <w:jc w:val="both"/>
-              <w:textAlignment w:val="auto"/>
-              <w:rPr>
-                <w:sz w:val="24"/>
-              </w:rPr>
-            </w:pPr>
-            <w:r>
-              <w:rPr>
-                <w:rFonts w:hint="eastAsia" w:hAnsi="Arial"/>
-                <w:sz w:val="24"/>
+              <w:jc w:val="left"/>
+              <w:textAlignment w:val="auto"/>
+              <w:rPr>
+                <w:sz w:val="24"/>
+              </w:rPr>
+            </w:pPr>
+            <w:r>
+              <w:rPr>
+                <w:rFonts w:hint="eastAsia" w:hAnsi="宋体" w:ascii="宋体" w:eastAsia="宋体" w:cs="宋体"/>
+                <w:sz w:val="24"/>
+                <w:szCs w:val="24"/>
               </w:rPr>
               <w:t>容器应按照国家法令和环境相关法规进行回收。</w:t>
             </w:r>
@@ -16514,7 +16734,7 @@
               <w:adjustRightInd/>
               <w:snapToGrid/>
               <w:spacing w:line="300" w:lineRule="auto"/>
-              <w:jc w:val="both"/>
+              <w:jc w:val="left"/>
               <w:textAlignment w:val="auto"/>
               <w:rPr>
                 <w:rFonts w:hint="eastAsia" w:hAnsi="Arial"/>
@@ -16523,8 +16743,9 @@
             </w:pPr>
             <w:r>
               <w:rPr>
-                <w:rFonts w:hint="eastAsia" w:hAnsi="Arial"/>
-                <w:sz w:val="24"/>
+                <w:rFonts w:hint="eastAsia" w:hAnsi="宋体" w:ascii="宋体" w:eastAsia="宋体" w:cs="宋体"/>
+                <w:sz w:val="24"/>
+                <w:szCs w:val="24"/>
               </w:rPr>
               <w:t>不能将废弃物通过废水排放。</w:t>
             </w:r>
@@ -16752,8 +16973,9 @@
             </w:pPr>
             <w:r>
               <w:rPr>
-                <w:rFonts w:hint="eastAsia" w:hAnsi="Arial"/>
-                <w:sz w:val="24"/>
+                <w:rFonts w:hint="eastAsia" w:hAnsi="宋体" w:ascii="宋体" w:eastAsia="宋体" w:cs="宋体"/>
+                <w:sz w:val="24"/>
+                <w:szCs w:val="24"/>
               </w:rPr>
               <w:t>非危险品陆运输方式。</w:t>
             </w:r>
@@ -16889,8 +17111,9 @@
             </w:pPr>
             <w:r>
               <w:rPr>
-                <w:rFonts w:hint="eastAsia" w:hAnsi="Arial"/>
-                <w:sz w:val="24"/>
+                <w:rFonts w:hint="eastAsia" w:hAnsi="宋体" w:ascii="宋体" w:eastAsia="宋体" w:cs="宋体"/>
+                <w:sz w:val="24"/>
+                <w:szCs w:val="24"/>
               </w:rPr>
               <w:t>非危险品海运方式。</w:t>
             </w:r>
@@ -17026,8 +17249,9 @@
             </w:pPr>
             <w:r>
               <w:rPr>
-                <w:rFonts w:hint="eastAsia" w:hAnsi="Arial"/>
-                <w:sz w:val="24"/>
+                <w:rFonts w:hint="eastAsia" w:hAnsi="宋体" w:ascii="宋体" w:eastAsia="宋体" w:cs="宋体"/>
+                <w:sz w:val="24"/>
+                <w:szCs w:val="24"/>
               </w:rPr>
               <w:t>非危险品运输方式。</w:t>
             </w:r>
@@ -17162,8 +17386,9 @@
             </w:pPr>
             <w:r>
               <w:rPr>
-                <w:rFonts w:hint="eastAsia" w:hAnsi="Arial"/>
-                <w:sz w:val="24"/>
+                <w:rFonts w:hint="eastAsia" w:hAnsi="宋体" w:ascii="宋体" w:eastAsia="宋体" w:cs="宋体"/>
+                <w:sz w:val="24"/>
+                <w:szCs w:val="24"/>
               </w:rPr>
               <w:t>非危险货物。</w:t>
             </w:r>
@@ -17193,58 +17418,68 @@
             </w:pPr>
             <w:r>
               <w:rPr>
-                <w:rFonts w:hint="eastAsia" w:hAnsi="Arial"/>
+                <w:rFonts w:hint="eastAsia" w:hAnsi="宋体" w:ascii="宋体" w:eastAsia="宋体" w:cs="宋体"/>
                 <w:sz w:val="24"/>
                 <w:lang w:val="en-US" w:eastAsia="zh-CN"/>
+                <w:szCs w:val="24"/>
               </w:rPr>
               <w:t>避免</w:t>
             </w:r>
             <w:r>
               <w:rPr>
-                <w:rFonts w:hint="eastAsia" w:hAnsi="Arial"/>
-                <w:sz w:val="24"/>
+                <w:rFonts w:hint="eastAsia" w:hAnsi="宋体" w:ascii="宋体" w:eastAsia="宋体" w:cs="宋体"/>
+                <w:sz w:val="24"/>
+                <w:szCs w:val="24"/>
               </w:rPr>
               <w:t>温度高于</w:t>
             </w:r>
             <w:r>
               <w:rPr>
-                <w:sz w:val="24"/>
+                <w:rFonts w:ascii="宋体" w:hAnsi="宋体" w:eastAsia="宋体" w:cs="宋体"/>
+                <w:sz w:val="24"/>
+                <w:szCs w:val="24"/>
               </w:rPr>
               <w:t>+</w:t>
             </w:r>
             <w:r>
               <w:rPr>
-                <w:rFonts w:hint="eastAsia"/>
+                <w:rFonts w:hint="eastAsia" w:ascii="宋体" w:hAnsi="宋体" w:eastAsia="宋体" w:cs="宋体"/>
                 <w:sz w:val="24"/>
                 <w:lang w:val="en-US" w:eastAsia="zh-CN"/>
+                <w:szCs w:val="24"/>
               </w:rPr>
               <w:t>35</w:t>
             </w:r>
             <w:r>
               <w:rPr>
-                <w:rFonts w:hint="eastAsia"/>
-                <w:sz w:val="24"/>
+                <w:rFonts w:hint="eastAsia" w:ascii="宋体" w:hAnsi="宋体" w:eastAsia="宋体" w:cs="宋体"/>
+                <w:sz w:val="24"/>
+                <w:szCs w:val="24"/>
               </w:rPr>
               <w:t>℃，温度不可低于</w:t>
             </w:r>
             <w:r>
               <w:rPr>
-                <w:rFonts w:hint="eastAsia"/>
+                <w:rFonts w:hint="eastAsia" w:ascii="宋体" w:hAnsi="宋体" w:eastAsia="宋体" w:cs="宋体"/>
                 <w:sz w:val="24"/>
                 <w:lang w:val="en-US" w:eastAsia="zh-CN"/>
+                <w:szCs w:val="24"/>
               </w:rPr>
               <w:t>+</w:t>
             </w:r>
             <w:r>
               <w:rPr>
-                <w:sz w:val="24"/>
+                <w:rFonts w:ascii="宋体" w:hAnsi="宋体" w:eastAsia="宋体" w:cs="宋体"/>
+                <w:sz w:val="24"/>
+                <w:szCs w:val="24"/>
               </w:rPr>
               <w:t>5</w:t>
             </w:r>
             <w:r>
               <w:rPr>
-                <w:rFonts w:hint="eastAsia"/>
-                <w:sz w:val="24"/>
+                <w:rFonts w:hint="eastAsia" w:ascii="宋体" w:hAnsi="宋体" w:eastAsia="宋体" w:cs="宋体"/>
+                <w:sz w:val="24"/>
+                <w:szCs w:val="24"/>
               </w:rPr>
               <w:t>℃。</w:t>
             </w:r>
@@ -17275,8 +17510,9 @@
             </w:pPr>
             <w:r>
               <w:rPr>
-                <w:rFonts w:hint="eastAsia"/>
-                <w:sz w:val="24"/>
+                <w:rFonts w:hint="eastAsia" w:ascii="宋体" w:hAnsi="宋体" w:eastAsia="宋体" w:cs="宋体"/>
+                <w:sz w:val="24"/>
+                <w:szCs w:val="24"/>
               </w:rPr>
               <w:t>远离食物、酸和碱。</w:t>
             </w:r>
@@ -17419,10 +17655,11 @@
             </w:pPr>
             <w:r>
               <w:rPr>
-                <w:rFonts w:hint="eastAsia" w:cs="Arial"/>
+                <w:rFonts w:hint="eastAsia" w:cs="宋体" w:ascii="宋体" w:hAnsi="宋体" w:eastAsia="宋体"/>
                 <w:bCs/>
                 <w:kern w:val="0"/>
                 <w:sz w:val="24"/>
+                <w:szCs w:val="24"/>
               </w:rPr>
               <w:t>物质或混合物的相关安全、健康和环保法律法规</w:t>
             </w:r>
@@ -17621,29 +17858,32 @@
             </w:pPr>
             <w:r>
               <w:rPr>
-                <w:rFonts w:hint="eastAsia" w:cs="Arial"/>
+                <w:rFonts w:hint="eastAsia" w:cs="宋体" w:ascii="宋体" w:hAnsi="宋体" w:eastAsia="宋体"/>
                 <w:bCs/>
                 <w:kern w:val="0"/>
                 <w:sz w:val="24"/>
+                <w:szCs w:val="24"/>
               </w:rPr>
               <w:t>危险化学品安全管理条例，国务院令</w:t>
             </w:r>
             <w:r>
               <w:rPr>
-                <w:rFonts w:hint="eastAsia" w:cs="Arial"/>
+                <w:rFonts w:hint="eastAsia" w:cs="宋体" w:ascii="宋体" w:hAnsi="宋体" w:eastAsia="宋体"/>
                 <w:bCs/>
                 <w:kern w:val="0"/>
                 <w:sz w:val="24"/>
                 <w:lang w:val="en-US" w:eastAsia="zh-CN"/>
+                <w:szCs w:val="24"/>
               </w:rPr>
               <w:t>591</w:t>
             </w:r>
             <w:r>
               <w:rPr>
-                <w:rFonts w:hint="eastAsia" w:cs="Arial"/>
+                <w:rFonts w:hint="eastAsia" w:cs="宋体" w:ascii="宋体" w:hAnsi="宋体" w:eastAsia="宋体"/>
                 <w:bCs/>
                 <w:kern w:val="0"/>
                 <w:sz w:val="24"/>
+                <w:szCs w:val="24"/>
               </w:rPr>
               <w:t>号</w:t>
             </w:r>
@@ -17706,19 +17946,21 @@
             </w:pPr>
             <w:r>
               <w:rPr>
-                <w:rFonts w:cs="Arial"/>
+                <w:rFonts w:cs="宋体" w:ascii="宋体" w:hAnsi="宋体" w:eastAsia="宋体"/>
                 <w:bCs/>
                 <w:kern w:val="0"/>
                 <w:sz w:val="24"/>
+                <w:szCs w:val="24"/>
               </w:rPr>
               <w:t xml:space="preserve">GB/T 16483 </w:t>
             </w:r>
             <w:r>
               <w:rPr>
-                <w:rFonts w:hint="eastAsia" w:cs="Arial"/>
+                <w:rFonts w:hint="eastAsia" w:cs="宋体" w:ascii="宋体" w:hAnsi="宋体" w:eastAsia="宋体"/>
                 <w:bCs/>
                 <w:kern w:val="0"/>
                 <w:sz w:val="24"/>
+                <w:szCs w:val="24"/>
               </w:rPr>
               <w:t>化学品安全技术说明书内容和项目顺序</w:t>
             </w:r>
@@ -17781,19 +18023,21 @@
             </w:pPr>
             <w:r>
               <w:rPr>
-                <w:rFonts w:cs="Arial"/>
+                <w:rFonts w:cs="宋体" w:ascii="宋体" w:hAnsi="宋体" w:eastAsia="宋体"/>
                 <w:bCs/>
                 <w:kern w:val="0"/>
                 <w:sz w:val="24"/>
+                <w:szCs w:val="24"/>
               </w:rPr>
               <w:t xml:space="preserve">GB 13690 </w:t>
             </w:r>
             <w:r>
               <w:rPr>
-                <w:rFonts w:hint="eastAsia" w:cs="Arial"/>
+                <w:rFonts w:hint="eastAsia" w:cs="宋体" w:ascii="宋体" w:hAnsi="宋体" w:eastAsia="宋体"/>
                 <w:bCs/>
                 <w:kern w:val="0"/>
                 <w:sz w:val="24"/>
+                <w:szCs w:val="24"/>
               </w:rPr>
               <w:t>化学品分类和危险性公示通则</w:t>
             </w:r>
@@ -17857,20 +18101,22 @@
             </w:pPr>
             <w:r>
               <w:rPr>
-                <w:rFonts w:cs="Arial"/>
+                <w:rFonts w:cs="宋体" w:ascii="宋体" w:hAnsi="宋体" w:eastAsia="宋体"/>
                 <w:bCs/>
                 <w:kern w:val="0"/>
                 <w:sz w:val="24"/>
+                <w:szCs w:val="24"/>
               </w:rPr>
               <w:t xml:space="preserve">GB </w:t>
             </w:r>
             <w:r>
               <w:rPr>
-                <w:rFonts w:hint="eastAsia" w:cs="Arial"/>
+                <w:rFonts w:hint="eastAsia" w:cs="宋体" w:ascii="宋体" w:hAnsi="宋体" w:eastAsia="宋体"/>
                 <w:bCs/>
                 <w:kern w:val="0"/>
                 <w:sz w:val="24"/>
                 <w:lang w:val="en-US" w:eastAsia="zh-CN"/>
+                <w:szCs w:val="24"/>
               </w:rPr>
               <w:t>30000.2-29 化学品分类和标签规范</w:t>
             </w:r>
@@ -17933,11 +18179,12 @@
             </w:pPr>
             <w:r>
               <w:rPr>
-                <w:rFonts w:hint="eastAsia" w:cs="Arial"/>
+                <w:rFonts w:hint="eastAsia" w:cs="宋体" w:ascii="宋体" w:hAnsi="宋体" w:eastAsia="宋体"/>
                 <w:bCs/>
                 <w:kern w:val="0"/>
                 <w:sz w:val="24"/>
                 <w:lang w:val="en-US" w:eastAsia="zh-CN"/>
+                <w:szCs w:val="24"/>
               </w:rPr>
               <w:t>GB 15258 化学品安全标签编写规定</w:t>
             </w:r>
@@ -18060,7 +18307,7 @@
               <w:top w:val="nil"/>
               <w:bottom w:val="single" w:color="auto" w:sz="4" w:space="0"/>
             </w:tcBorders>
-            <w:vAlign w:val="top"/>
+            <w:vAlign w:val="center"/>
           </w:tcPr>
           <w:p>
             <w:pPr>
@@ -18089,10 +18336,11 @@
             </w:pPr>
             <w:r>
               <w:rPr>
-                <w:rFonts w:hint="eastAsia" w:cs="Arial"/>
+                <w:rFonts w:hint="eastAsia" w:cs="宋体" w:ascii="宋体" w:hAnsi="宋体" w:eastAsia="宋体"/>
                 <w:bCs/>
                 <w:kern w:val="0"/>
                 <w:sz w:val="24"/>
+                <w:szCs w:val="24"/>
               </w:rPr>
               <w:t>就我们所掌握的知识信息，截止本安全技术说明书发布之日，它提供的资料是正确的。所提供的信息仅仅作为安全处理，使用，生产，储存，运输，处置和排放的指导书，而不是一份担保或品质说明书。本资料只针对所指定的具体物料，而对这种物料与其它物料混合使用或在其它制程中使用的情况，则未必有效（除非在文本中有特别说明）。</w:t>
             </w:r>

</xml_diff>

<commit_message>
fix(msds): preserve section 3 centering and lock section 11 sublabels
</commit_message>
<xml_diff>
--- a/MSDS Skill/examples/template_reference.docx
+++ b/MSDS Skill/examples/template_reference.docx
@@ -3975,7 +3975,7 @@
               <w:snapToGrid/>
               <w:spacing w:line="300" w:lineRule="auto"/>
               <w:ind w:right="480"/>
-              <w:jc w:val="left"/>
+              <w:jc w:val="center"/>
               <w:textAlignment w:val="auto"/>
               <w:rPr>
                 <w:rFonts w:hint="default" w:ascii="Times New Roman" w:hAnsi="Times New Roman" w:eastAsia="宋体" w:cs="Times New Roman"/>
@@ -4029,7 +4029,7 @@
               <w:snapToGrid/>
               <w:spacing w:line="300" w:lineRule="auto"/>
               <w:ind w:right="480" w:rightChars="0"/>
-              <w:jc w:val="left"/>
+              <w:jc w:val="center"/>
               <w:textAlignment w:val="auto"/>
               <w:rPr>
                 <w:rFonts w:hint="eastAsia"/>
@@ -4076,7 +4076,7 @@
               <w:snapToGrid/>
               <w:spacing w:line="300" w:lineRule="auto"/>
               <w:ind w:right="480"/>
-              <w:jc w:val="left"/>
+              <w:jc w:val="center"/>
               <w:textAlignment w:val="auto"/>
               <w:rPr>
                 <w:rFonts w:hint="default" w:ascii="Times New Roman" w:hAnsi="Times New Roman" w:eastAsia="宋体" w:cs="Times New Roman"/>
@@ -4146,7 +4146,7 @@
               <w:snapToGrid/>
               <w:spacing w:line="300" w:lineRule="auto"/>
               <w:ind w:right="480"/>
-              <w:jc w:val="left"/>
+              <w:jc w:val="center"/>
               <w:textAlignment w:val="auto"/>
               <w:rPr>
                 <w:rFonts w:hint="default" w:ascii="Times New Roman" w:hAnsi="Times New Roman" w:eastAsia="宋体" w:cs="Times New Roman"/>
@@ -4200,7 +4200,7 @@
               <w:snapToGrid/>
               <w:spacing w:line="300" w:lineRule="auto"/>
               <w:ind w:right="480"/>
-              <w:jc w:val="left"/>
+              <w:jc w:val="center"/>
               <w:textAlignment w:val="auto"/>
               <w:rPr>
                 <w:rFonts w:hint="eastAsia"/>
@@ -4246,7 +4246,7 @@
               <w:snapToGrid/>
               <w:spacing w:line="300" w:lineRule="auto"/>
               <w:ind w:right="480"/>
-              <w:jc w:val="left"/>
+              <w:jc w:val="center"/>
               <w:textAlignment w:val="auto"/>
               <w:rPr>
                 <w:rFonts w:hint="default" w:ascii="Times New Roman" w:hAnsi="Times New Roman" w:eastAsia="宋体" w:cs="Times New Roman"/>

</xml_diff>

<commit_message>
release(msds): update templates and publish v3.27.10
</commit_message>
<xml_diff>
--- a/MSDS Skill/examples/template_reference.docx
+++ b/MSDS Skill/examples/template_reference.docx
@@ -1202,6 +1202,22 @@
         <w:gridCol w:w="6276"/>
       </w:tblGrid>
       <w:tr>
+        <w:tblPrEx>
+          <w:tblBorders>
+            <w:top w:val="single" w:color="auto" w:sz="4" w:space="0"/>
+            <w:left w:val="single" w:color="auto" w:sz="4" w:space="0"/>
+            <w:bottom w:val="single" w:color="auto" w:sz="4" w:space="0"/>
+            <w:right w:val="single" w:color="auto" w:sz="4" w:space="0"/>
+            <w:insideH w:val="none" w:color="auto" w:sz="0" w:space="0"/>
+            <w:insideV w:val="none" w:color="auto" w:sz="0" w:space="0"/>
+          </w:tblBorders>
+          <w:tblCellMar>
+            <w:top w:w="0" w:type="dxa"/>
+            <w:left w:w="108" w:type="dxa"/>
+            <w:bottom w:w="0" w:type="dxa"/>
+            <w:right w:w="108" w:type="dxa"/>
+          </w:tblCellMar>
+        </w:tblPrEx>
         <w:trPr>
           <w:cantSplit/>
           <w:tblHeader/>
@@ -1369,8 +1385,9 @@
               <w:jc w:val="left"/>
               <w:textAlignment w:val="auto"/>
               <w:rPr>
-                <w:b/>
-                <w:sz w:val="24"/>
+                <w:sz w:val="24"/>
+                <w:b w:val="0"/>
+                <w:bCs w:val="0"/>
               </w:rPr>
             </w:pPr>
           </w:p>
@@ -1517,9 +1534,10 @@
               <w:textAlignment w:val="auto"/>
               <w:rPr>
                 <w:rFonts w:hint="default"/>
-                <w:b/>
                 <w:sz w:val="24"/>
                 <w:lang w:val="en-US"/>
+                <w:b w:val="0"/>
+                <w:bCs w:val="0"/>
               </w:rPr>
             </w:pPr>
             <w:r>
@@ -1674,10 +1692,10 @@
               <w:textAlignment w:val="auto"/>
               <w:rPr>
                 <w:rFonts w:hint="eastAsia" w:eastAsia="宋体"/>
+                <w:sz w:val="24"/>
+                <w:lang w:val="en-US" w:eastAsia="zh-CN"/>
                 <w:b w:val="0"/>
-                <w:bCs/>
-                <w:sz w:val="24"/>
-                <w:lang w:val="en-US" w:eastAsia="zh-CN"/>
+                <w:bCs w:val="0"/>
               </w:rPr>
             </w:pPr>
             <w:r>
@@ -1811,10 +1829,10 @@
               <w:textAlignment w:val="auto"/>
               <w:rPr>
                 <w:rFonts w:hint="default" w:eastAsia="宋体"/>
+                <w:sz w:val="24"/>
+                <w:lang w:val="en-US" w:eastAsia="zh-CN"/>
                 <w:b w:val="0"/>
-                <w:bCs/>
-                <w:sz w:val="24"/>
-                <w:lang w:val="en-US" w:eastAsia="zh-CN"/>
+                <w:bCs w:val="0"/>
               </w:rPr>
             </w:pPr>
             <w:r>
@@ -1971,9 +1989,10 @@
               <w:textAlignment w:val="auto"/>
               <w:rPr>
                 <w:rFonts w:hint="eastAsia" w:eastAsia="宋体"/>
-                <w:b/>
                 <w:sz w:val="24"/>
                 <w:lang w:val="en-US" w:eastAsia="zh-CN"/>
+                <w:b w:val="0"/>
+                <w:bCs w:val="0"/>
               </w:rPr>
             </w:pPr>
             <w:r>
@@ -2128,9 +2147,10 @@
               <w:textAlignment w:val="auto"/>
               <w:rPr>
                 <w:rFonts w:hint="default"/>
-                <w:b/>
                 <w:sz w:val="24"/>
                 <w:lang w:val="en-US"/>
+                <w:b w:val="0"/>
+                <w:bCs w:val="0"/>
               </w:rPr>
             </w:pPr>
             <w:r>
@@ -2316,9 +2336,10 @@
               <w:textAlignment w:val="auto"/>
               <w:rPr>
                 <w:rFonts w:hint="default"/>
-                <w:b/>
                 <w:sz w:val="24"/>
                 <w:lang w:val="en-US"/>
+                <w:b w:val="0"/>
+                <w:bCs w:val="0"/>
               </w:rPr>
             </w:pPr>
             <w:r>
@@ -3419,7 +3440,7 @@
             <w:tcW w:w="9781" w:type="dxa"/>
             <w:gridSpan w:val="3"/>
             <w:tcBorders>
-              <w:bottom w:val="dotted" w:color="auto" w:sz="4" w:space="0"/>
+              <w:bottom w:val="single" w:color="auto" w:sz="4" w:space="0"/>
             </w:tcBorders>
             <w:shd w:val="clear" w:color="auto" w:fill="D9D9D9"/>
           </w:tcPr>
@@ -3490,7 +3511,7 @@
           <w:tcPr>
             <w:tcW w:w="3519" w:type="dxa"/>
             <w:tcBorders>
-              <w:top w:val="dotted" w:color="auto" w:sz="4" w:space="0"/>
+              <w:top w:val="single" w:color="auto" w:sz="4" w:space="0"/>
               <w:left w:val="single" w:color="auto" w:sz="4" w:space="0"/>
               <w:bottom w:val="dotted" w:color="auto" w:sz="4" w:space="0"/>
               <w:right w:val="dotted" w:color="auto" w:sz="4" w:space="0"/>
@@ -3544,7 +3565,7 @@
             <w:tcW w:w="6262" w:type="dxa"/>
             <w:gridSpan w:val="2"/>
             <w:tcBorders>
-              <w:top w:val="dotted" w:color="auto" w:sz="4" w:space="0"/>
+              <w:top w:val="single" w:color="auto" w:sz="4" w:space="0"/>
               <w:left w:val="dotted" w:color="auto" w:sz="4" w:space="0"/>
               <w:bottom w:val="dotted" w:color="auto" w:sz="4" w:space="0"/>
               <w:right w:val="single" w:color="auto" w:sz="4" w:space="0"/>
@@ -3979,12 +4000,12 @@
               <w:textAlignment w:val="auto"/>
               <w:rPr>
                 <w:rFonts w:hint="default" w:ascii="Times New Roman" w:hAnsi="Times New Roman" w:eastAsia="宋体" w:cs="Times New Roman"/>
+                <w:kern w:val="2"/>
+                <w:sz w:val="24"/>
+                <w:szCs w:val="24"/>
+                <w:lang w:val="en-US" w:eastAsia="zh-CN" w:bidi="ar-SA"/>
                 <w:b w:val="0"/>
-                <w:bCs/>
-                <w:kern w:val="2"/>
-                <w:sz w:val="24"/>
-                <w:szCs w:val="24"/>
-                <w:lang w:val="en-US" w:eastAsia="zh-CN" w:bidi="ar-SA"/>
+                <w:bCs w:val="0"/>
               </w:rPr>
             </w:pPr>
             <w:r>
@@ -4124,7 +4145,7 @@
             <w:tcBorders>
               <w:top w:val="dotted" w:color="auto" w:sz="4" w:space="0"/>
               <w:left w:val="single" w:color="auto" w:sz="4" w:space="0"/>
-              <w:bottom w:val="dotted" w:color="auto" w:sz="4" w:space="0"/>
+              <w:bottom w:val="single" w:color="auto" w:sz="4" w:space="0"/>
               <w:right w:val="dotted" w:color="auto" w:sz="4" w:space="0"/>
             </w:tcBorders>
             <w:vAlign w:val="center"/>
@@ -4150,12 +4171,12 @@
               <w:textAlignment w:val="auto"/>
               <w:rPr>
                 <w:rFonts w:hint="default" w:ascii="Times New Roman" w:hAnsi="Times New Roman" w:eastAsia="宋体" w:cs="Times New Roman"/>
+                <w:kern w:val="2"/>
+                <w:sz w:val="24"/>
+                <w:szCs w:val="24"/>
+                <w:lang w:val="en-US" w:eastAsia="zh-CN" w:bidi="ar-SA"/>
                 <w:b w:val="0"/>
-                <w:bCs/>
-                <w:kern w:val="2"/>
-                <w:sz w:val="24"/>
-                <w:szCs w:val="24"/>
-                <w:lang w:val="en-US" w:eastAsia="zh-CN" w:bidi="ar-SA"/>
+                <w:bCs w:val="0"/>
               </w:rPr>
             </w:pPr>
             <w:r>
@@ -4178,7 +4199,7 @@
             <w:tcBorders>
               <w:top w:val="dotted" w:color="auto" w:sz="4" w:space="0"/>
               <w:left w:val="dotted" w:color="auto" w:sz="4" w:space="0"/>
-              <w:bottom w:val="dotted" w:color="auto" w:sz="4" w:space="0"/>
+              <w:bottom w:val="single" w:color="auto" w:sz="4" w:space="0"/>
               <w:right w:val="dotted" w:color="auto" w:sz="4" w:space="0"/>
             </w:tcBorders>
             <w:vAlign w:val="center"/>
@@ -4224,7 +4245,7 @@
             <w:tcBorders>
               <w:top w:val="dotted" w:color="auto" w:sz="4" w:space="0"/>
               <w:left w:val="dotted" w:color="auto" w:sz="4" w:space="0"/>
-              <w:bottom w:val="dotted" w:color="auto" w:sz="4" w:space="0"/>
+              <w:bottom w:val="single" w:color="auto" w:sz="4" w:space="0"/>
               <w:right w:val="single" w:color="auto" w:sz="4" w:space="0"/>
             </w:tcBorders>
             <w:vAlign w:val="center"/>
@@ -4468,9 +4489,10 @@
               <w:jc w:val="left"/>
               <w:rPr>
                 <w:rFonts w:hint="default"/>
-                <w:b/>
                 <w:sz w:val="24"/>
                 <w:lang w:val="en-US"/>
+                <w:b w:val="0"/>
+                <w:bCs w:val="0"/>
               </w:rPr>
             </w:pPr>
             <w:r>
@@ -5417,9 +5439,10 @@
               <w:textAlignment w:val="auto"/>
               <w:rPr>
                 <w:rFonts w:hint="eastAsia" w:eastAsia="宋体"/>
-                <w:b/>
                 <w:sz w:val="24"/>
                 <w:lang w:val="en-US" w:eastAsia="zh-CN"/>
+                <w:b w:val="0"/>
+                <w:bCs w:val="0"/>
               </w:rPr>
             </w:pPr>
             <w:r>
@@ -5844,6 +5867,12 @@
             <w:insideH w:val="none" w:color="auto" w:sz="0" w:space="0"/>
             <w:insideV w:val="none" w:color="auto" w:sz="0" w:space="0"/>
           </w:tblBorders>
+          <w:tblCellMar>
+            <w:top w:w="0" w:type="dxa"/>
+            <w:left w:w="108" w:type="dxa"/>
+            <w:bottom w:w="0" w:type="dxa"/>
+            <w:right w:w="108" w:type="dxa"/>
+          </w:tblCellMar>
         </w:tblPrEx>
         <w:trPr>
           <w:cantSplit/>
@@ -5914,7 +5943,7 @@
             <w:tcBorders>
               <w:top w:val="single" w:color="auto" w:sz="4" w:space="0"/>
               <w:bottom w:val="dotted" w:color="auto" w:sz="4" w:space="0"/>
-              <w:right w:val="nil"/>
+              <w:right w:val="dotted" w:color="auto" w:sz="4" w:space="0"/>
             </w:tcBorders>
             <w:vAlign w:val="center"/>
           </w:tcPr>
@@ -5981,7 +6010,7 @@
             <w:tcW w:w="6262" w:type="dxa"/>
             <w:tcBorders>
               <w:top w:val="single" w:color="auto" w:sz="4" w:space="0"/>
-              <w:left w:val="nil"/>
+              <w:left w:val="dotted" w:color="auto" w:sz="4" w:space="0"/>
               <w:bottom w:val="dotted" w:color="auto" w:sz="4" w:space="0"/>
             </w:tcBorders>
             <w:vAlign w:val="center"/>
@@ -6090,7 +6119,7 @@
             <w:tcBorders>
               <w:top w:val="dotted" w:color="auto" w:sz="4" w:space="0"/>
               <w:bottom w:val="dotted" w:color="auto" w:sz="4" w:space="0"/>
-              <w:right w:val="nil"/>
+              <w:right w:val="dotted" w:color="auto" w:sz="4" w:space="0"/>
             </w:tcBorders>
             <w:vAlign w:val="center"/>
           </w:tcPr>
@@ -6158,7 +6187,7 @@
             <w:tcW w:w="6262" w:type="dxa"/>
             <w:tcBorders>
               <w:top w:val="dotted" w:color="auto" w:sz="4" w:space="0"/>
-              <w:left w:val="nil"/>
+              <w:left w:val="dotted" w:color="auto" w:sz="4" w:space="0"/>
               <w:bottom w:val="dotted" w:color="auto" w:sz="4" w:space="0"/>
             </w:tcBorders>
             <w:vAlign w:val="center"/>
@@ -6182,8 +6211,9 @@
               <w:jc w:val="left"/>
               <w:textAlignment w:val="auto"/>
               <w:rPr>
-                <w:b/>
-                <w:sz w:val="24"/>
+                <w:sz w:val="24"/>
+                <w:b w:val="0"/>
+                <w:bCs w:val="0"/>
               </w:rPr>
             </w:pPr>
             <w:r>
@@ -6232,7 +6262,7 @@
             <w:tcBorders>
               <w:top w:val="dotted" w:color="auto" w:sz="4" w:space="0"/>
               <w:bottom w:val="single" w:color="auto" w:sz="4" w:space="0"/>
-              <w:right w:val="nil"/>
+              <w:right w:val="dotted" w:color="auto" w:sz="4" w:space="0"/>
             </w:tcBorders>
             <w:vAlign w:val="center"/>
           </w:tcPr>
@@ -6299,7 +6329,7 @@
             <w:tcW w:w="6262" w:type="dxa"/>
             <w:tcBorders>
               <w:top w:val="dotted" w:color="auto" w:sz="4" w:space="0"/>
-              <w:left w:val="nil"/>
+              <w:left w:val="dotted" w:color="auto" w:sz="4" w:space="0"/>
               <w:bottom w:val="single" w:color="auto" w:sz="4" w:space="0"/>
             </w:tcBorders>
             <w:vAlign w:val="center"/>
@@ -7008,8 +7038,9 @@
               <w:jc w:val="left"/>
               <w:textAlignment w:val="auto"/>
               <w:rPr>
-                <w:b/>
-                <w:sz w:val="24"/>
+                <w:sz w:val="24"/>
+                <w:b w:val="0"/>
+                <w:bCs w:val="0"/>
               </w:rPr>
             </w:pPr>
             <w:r>
@@ -7141,9 +7172,10 @@
               <w:textAlignment w:val="auto"/>
               <w:rPr>
                 <w:rFonts w:hint="default" w:eastAsia="宋体"/>
-                <w:b/>
                 <w:sz w:val="24"/>
                 <w:lang w:val="en-US" w:eastAsia="zh-CN"/>
+                <w:b w:val="0"/>
+                <w:bCs w:val="0"/>
               </w:rPr>
             </w:pPr>
             <w:r>
@@ -7783,8 +7815,9 @@
               <w:jc w:val="left"/>
               <w:textAlignment w:val="auto"/>
               <w:rPr>
-                <w:b/>
-                <w:sz w:val="24"/>
+                <w:sz w:val="24"/>
+                <w:b w:val="0"/>
+                <w:bCs w:val="0"/>
               </w:rPr>
             </w:pPr>
           </w:p>
@@ -8136,11 +8169,12 @@
               <w:textAlignment w:val="auto"/>
               <w:rPr>
                 <w:rFonts w:hint="default" w:hAnsi="Arial" w:cs="Times New Roman"/>
-                <w:b/>
                 <w:kern w:val="2"/>
                 <w:sz w:val="21"/>
                 <w:szCs w:val="21"/>
                 <w:lang w:val="en-US" w:eastAsia="zh-CN" w:bidi="ar-SA"/>
+                <w:b w:val="0"/>
+                <w:bCs w:val="0"/>
               </w:rPr>
             </w:pPr>
             <w:r>
@@ -12684,6 +12718,12 @@
             <w:insideH w:val="none" w:color="auto" w:sz="0" w:space="0"/>
             <w:insideV w:val="none" w:color="auto" w:sz="0" w:space="0"/>
           </w:tblBorders>
+          <w:tblCellMar>
+            <w:top w:w="0" w:type="dxa"/>
+            <w:left w:w="108" w:type="dxa"/>
+            <w:bottom w:w="0" w:type="dxa"/>
+            <w:right w:w="108" w:type="dxa"/>
+          </w:tblCellMar>
         </w:tblPrEx>
         <w:trPr>
           <w:cantSplit/>
@@ -15473,841 +15513,6 @@
                 <w:szCs w:val="24"/>
               </w:rPr>
               <w:t>喷涂、加热或形成气溶胶时， 应保持良好通风并避免吸入。 误食较大剂量可能造成不适。</w:t>
-            </w:r>
-          </w:p>
-        </w:tc>
-      </w:tr>
-    </w:tbl>
-    <w:p>
-      <w:pPr>
-        <w:spacing w:line="300" w:lineRule="auto"/>
-        <w:ind w:right="480"/>
-        <w:rPr>
-          <w:sz w:val="24"/>
-        </w:rPr>
-      </w:pPr>
-    </w:p>
-    <w:tbl>
-      <w:tblPr>
-        <w:tblStyle w:val="4"/>
-        <w:tblW w:w="9781" w:type="dxa"/>
-        <w:tblInd w:w="108" w:type="dxa"/>
-        <w:tblBorders>
-          <w:top w:val="single" w:color="auto" w:sz="4" w:space="0"/>
-          <w:left w:val="single" w:color="auto" w:sz="4" w:space="0"/>
-          <w:bottom w:val="single" w:color="auto" w:sz="4" w:space="0"/>
-          <w:right w:val="single" w:color="auto" w:sz="4" w:space="0"/>
-          <w:insideH w:val="none" w:color="auto" w:sz="0" w:space="0"/>
-          <w:insideV w:val="none" w:color="auto" w:sz="0" w:space="0"/>
-        </w:tblBorders>
-        <w:tblLayout w:type="fixed"/>
-        <w:tblCellMar>
-          <w:top w:w="0" w:type="dxa"/>
-          <w:left w:w="108" w:type="dxa"/>
-          <w:bottom w:w="0" w:type="dxa"/>
-          <w:right w:w="108" w:type="dxa"/>
-        </w:tblCellMar>
-      </w:tblPr>
-      <w:tblGrid>
-        <w:gridCol w:w="3504"/>
-        <w:gridCol w:w="6277"/>
-      </w:tblGrid>
-      <w:tr>
-        <w:tblPrEx>
-          <w:tblBorders>
-            <w:top w:val="single" w:color="auto" w:sz="4" w:space="0"/>
-            <w:left w:val="single" w:color="auto" w:sz="4" w:space="0"/>
-            <w:bottom w:val="single" w:color="auto" w:sz="4" w:space="0"/>
-            <w:right w:val="single" w:color="auto" w:sz="4" w:space="0"/>
-            <w:insideH w:val="none" w:color="auto" w:sz="0" w:space="0"/>
-            <w:insideV w:val="none" w:color="auto" w:sz="0" w:space="0"/>
-          </w:tblBorders>
-        </w:tblPrEx>
-        <w:trPr>
-          <w:tblHeader/>
-        </w:trPr>
-        <w:tc>
-          <w:tcPr>
-            <w:tcW w:w="9781" w:type="dxa"/>
-            <w:gridSpan w:val="2"/>
-            <w:tcBorders>
-              <w:top w:val="single" w:color="auto" w:sz="4" w:space="0"/>
-              <w:bottom w:val="single" w:color="auto" w:sz="4" w:space="0"/>
-            </w:tcBorders>
-            <w:shd w:val="clear" w:color="auto" w:fill="D9D9D9"/>
-          </w:tcPr>
-          <w:p>
-            <w:pPr>
-              <w:keepNext/>
-              <w:spacing w:line="300" w:lineRule="auto"/>
-              <w:ind w:right="480"/>
-              <w:rPr>
-                <w:b/>
-                <w:sz w:val="24"/>
-              </w:rPr>
-            </w:pPr>
-            <w:r>
-              <w:rPr>
-                <w:b/>
-                <w:sz w:val="24"/>
-              </w:rPr>
-              <w:t>12.</w:t>
-            </w:r>
-            <w:r>
-              <w:rPr>
-                <w:rFonts w:hint="eastAsia" w:hAnsi="Arial"/>
-                <w:b/>
-                <w:sz w:val="24"/>
-              </w:rPr>
-              <w:t>生态信息</w:t>
-            </w:r>
-          </w:p>
-        </w:tc>
-      </w:tr>
-      <w:tr>
-        <w:tblPrEx>
-          <w:tblBorders>
-            <w:top w:val="single" w:color="auto" w:sz="4" w:space="0"/>
-            <w:left w:val="single" w:color="auto" w:sz="4" w:space="0"/>
-            <w:bottom w:val="single" w:color="auto" w:sz="4" w:space="0"/>
-            <w:right w:val="single" w:color="auto" w:sz="4" w:space="0"/>
-            <w:insideH w:val="none" w:color="auto" w:sz="0" w:space="0"/>
-            <w:insideV w:val="none" w:color="auto" w:sz="0" w:space="0"/>
-          </w:tblBorders>
-          <w:tblCellMar>
-            <w:top w:w="0" w:type="dxa"/>
-            <w:left w:w="108" w:type="dxa"/>
-            <w:bottom w:w="0" w:type="dxa"/>
-            <w:right w:w="108" w:type="dxa"/>
-          </w:tblCellMar>
-        </w:tblPrEx>
-        <w:tc>
-          <w:tcPr>
-            <w:tcW w:w="9781" w:type="dxa"/>
-            <w:gridSpan w:val="2"/>
-            <w:tcBorders>
-              <w:top w:val="single" w:color="auto" w:sz="4" w:space="0"/>
-              <w:bottom w:val="dotted" w:color="auto" w:sz="4" w:space="0"/>
-            </w:tcBorders>
-            <w:shd w:val="clear" w:color="auto" w:fill="auto"/>
-            <w:vAlign w:val="center"/>
-          </w:tcPr>
-          <w:p>
-            <w:pPr>
-              <w:keepNext w:val="0"/>
-              <w:keepLines w:val="0"/>
-              <w:pageBreakBefore w:val="0"/>
-              <w:widowControl w:val="0"/>
-              <w:kinsoku/>
-              <w:wordWrap/>
-              <w:overflowPunct/>
-              <w:topLinePunct w:val="0"/>
-              <w:autoSpaceDE/>
-              <w:autoSpaceDN/>
-              <w:bidi w:val="0"/>
-              <w:adjustRightInd/>
-              <w:snapToGrid/>
-              <w:spacing w:line="300" w:lineRule="auto"/>
-              <w:ind w:right="480"/>
-              <w:jc w:val="left"/>
-              <w:textAlignment w:val="auto"/>
-              <w:rPr>
-                <w:b/>
-                <w:sz w:val="24"/>
-                <w:shd w:val="clear" w:color="auto" w:fill="auto"/>
-              </w:rPr>
-            </w:pPr>
-            <w:r>
-              <w:rPr>
-                <w:rFonts w:hint="eastAsia" w:hAnsi="宋体" w:ascii="宋体" w:eastAsia="宋体" w:cs="宋体"/>
-                <w:sz w:val="24"/>
-                <w:shd w:val="clear" w:color="auto" w:fill="auto"/>
-                <w:szCs w:val="24"/>
-              </w:rPr>
-              <w:t>该产品无可用的生态毒理学研究。</w:t>
-            </w:r>
-          </w:p>
-        </w:tc>
-      </w:tr>
-      <w:tr>
-        <w:tblPrEx>
-          <w:tblBorders>
-            <w:top w:val="single" w:color="auto" w:sz="4" w:space="0"/>
-            <w:left w:val="single" w:color="auto" w:sz="4" w:space="0"/>
-            <w:bottom w:val="single" w:color="auto" w:sz="4" w:space="0"/>
-            <w:right w:val="single" w:color="auto" w:sz="4" w:space="0"/>
-            <w:insideH w:val="none" w:color="auto" w:sz="0" w:space="0"/>
-            <w:insideV w:val="none" w:color="auto" w:sz="0" w:space="0"/>
-          </w:tblBorders>
-          <w:tblCellMar>
-            <w:top w:w="0" w:type="dxa"/>
-            <w:left w:w="108" w:type="dxa"/>
-            <w:bottom w:w="0" w:type="dxa"/>
-            <w:right w:w="108" w:type="dxa"/>
-          </w:tblCellMar>
-        </w:tblPrEx>
-        <w:tc>
-          <w:tcPr>
-            <w:tcW w:w="9781" w:type="dxa"/>
-            <w:gridSpan w:val="2"/>
-            <w:tcBorders>
-              <w:top w:val="dotted" w:color="auto" w:sz="4" w:space="0"/>
-              <w:bottom w:val="dotted" w:color="auto" w:sz="4" w:space="0"/>
-            </w:tcBorders>
-            <w:shd w:val="clear" w:color="auto" w:fill="auto"/>
-            <w:vAlign w:val="center"/>
-          </w:tcPr>
-          <w:p>
-            <w:pPr>
-              <w:keepNext w:val="0"/>
-              <w:keepLines w:val="0"/>
-              <w:pageBreakBefore w:val="0"/>
-              <w:widowControl w:val="0"/>
-              <w:kinsoku/>
-              <w:wordWrap/>
-              <w:overflowPunct/>
-              <w:topLinePunct w:val="0"/>
-              <w:autoSpaceDE/>
-              <w:autoSpaceDN/>
-              <w:bidi w:val="0"/>
-              <w:adjustRightInd/>
-              <w:snapToGrid/>
-              <w:spacing w:line="300" w:lineRule="auto"/>
-              <w:ind w:right="480"/>
-              <w:jc w:val="left"/>
-              <w:textAlignment w:val="auto"/>
-              <w:rPr>
-                <w:rFonts w:hint="eastAsia" w:hAnsi="Arial"/>
-                <w:sz w:val="24"/>
-                <w:shd w:val="clear" w:color="auto" w:fill="auto"/>
-              </w:rPr>
-            </w:pPr>
-            <w:r>
-              <w:rPr>
-                <w:rFonts w:ascii="宋体" w:hAnsi="宋体" w:eastAsia="宋体" w:cs="宋体"/>
-                <w:sz w:val="24"/>
-                <w:szCs w:val="24"/>
-              </w:rPr>
-              <w:t>以下为二乙二醇单丁醚 （CAS号：112-34-5）的生态毒理学参考数据：</w:t>
-            </w:r>
-          </w:p>
-        </w:tc>
-      </w:tr>
-      <w:tr>
-        <w:tblPrEx>
-          <w:tblBorders>
-            <w:top w:val="single" w:color="auto" w:sz="4" w:space="0"/>
-            <w:left w:val="single" w:color="auto" w:sz="4" w:space="0"/>
-            <w:bottom w:val="single" w:color="auto" w:sz="4" w:space="0"/>
-            <w:right w:val="single" w:color="auto" w:sz="4" w:space="0"/>
-            <w:insideH w:val="none" w:color="auto" w:sz="0" w:space="0"/>
-            <w:insideV w:val="none" w:color="auto" w:sz="0" w:space="0"/>
-          </w:tblBorders>
-          <w:tblCellMar>
-            <w:top w:w="0" w:type="dxa"/>
-            <w:left w:w="108" w:type="dxa"/>
-            <w:bottom w:w="0" w:type="dxa"/>
-            <w:right w:w="108" w:type="dxa"/>
-          </w:tblCellMar>
-        </w:tblPrEx>
-        <w:trPr>
-          <w:trHeight w:val="272" w:hRule="atLeast"/>
-        </w:trPr>
-        <w:tc>
-          <w:tcPr>
-            <w:tcW w:w="3504" w:type="dxa"/>
-            <w:tcBorders>
-              <w:top w:val="dotted" w:color="auto" w:sz="4" w:space="0"/>
-              <w:bottom w:val="dotted" w:color="auto" w:sz="4" w:space="0"/>
-              <w:right w:val="dotted" w:color="auto" w:sz="4" w:space="0"/>
-            </w:tcBorders>
-            <w:vAlign w:val="center"/>
-          </w:tcPr>
-          <w:p>
-            <w:pPr>
-              <w:keepNext w:val="0"/>
-              <w:keepLines w:val="0"/>
-              <w:pageBreakBefore w:val="0"/>
-              <w:widowControl w:val="0"/>
-              <w:numPr>
-                <w:ilvl w:val="1"/>
-                <w:numId w:val="0"/>
-              </w:numPr>
-              <w:tabs>
-                <w:tab w:val="left" w:pos="601"/>
-              </w:tabs>
-              <w:kinsoku/>
-              <w:wordWrap/>
-              <w:overflowPunct/>
-              <w:topLinePunct w:val="0"/>
-              <w:autoSpaceDE/>
-              <w:autoSpaceDN/>
-              <w:bidi w:val="0"/>
-              <w:adjustRightInd/>
-              <w:snapToGrid/>
-              <w:spacing w:line="300" w:lineRule="auto"/>
-              <w:ind w:left="597" w:leftChars="0" w:hanging="597" w:hangingChars="283"/>
-              <w:jc w:val="left"/>
-              <w:textAlignment w:val="auto"/>
-              <w:rPr>
-                <w:rFonts w:hint="default" w:eastAsia="宋体"/>
-                <w:sz w:val="24"/>
-                <w:lang w:val="en-US" w:eastAsia="zh-CN"/>
-              </w:rPr>
-            </w:pPr>
-            <w:r>
-              <w:rPr>
-                <w:rFonts w:hint="default" w:ascii="Times New Roman" w:hAnsi="Times New Roman" w:eastAsia="宋体" w:cs="Times New Roman"/>
-                <w:b/>
-                <w:kern w:val="2"/>
-                <w:sz w:val="21"/>
-                <w:szCs w:val="21"/>
-                <w:lang w:val="en-US" w:eastAsia="zh-CN" w:bidi="ar-SA"/>
-              </w:rPr>
-              <w:t>12.</w:t>
-            </w:r>
-            <w:r>
-              <w:rPr>
-                <w:rFonts w:hint="eastAsia" w:cs="Times New Roman"/>
-                <w:b/>
-                <w:kern w:val="2"/>
-                <w:sz w:val="21"/>
-                <w:szCs w:val="21"/>
-                <w:lang w:val="en-US" w:eastAsia="zh-CN" w:bidi="ar-SA"/>
-              </w:rPr>
-              <w:t xml:space="preserve">1  </w:t>
-            </w:r>
-            <w:r>
-              <w:rPr>
-                <w:rFonts w:hint="eastAsia" w:hAnsi="Arial"/>
-                <w:b/>
-                <w:sz w:val="24"/>
-              </w:rPr>
-              <w:t>生态毒性：</w:t>
-            </w:r>
-          </w:p>
-        </w:tc>
-        <w:tc>
-          <w:tcPr>
-            <w:tcW w:w="6277" w:type="dxa"/>
-            <w:tcBorders>
-              <w:top w:val="dotted" w:color="auto" w:sz="4" w:space="0"/>
-              <w:left w:val="dotted" w:color="auto" w:sz="4" w:space="0"/>
-              <w:bottom w:val="dotted" w:color="auto" w:sz="4" w:space="0"/>
-            </w:tcBorders>
-            <w:vAlign w:val="center"/>
-          </w:tcPr>
-          <w:p>
-            <w:pPr>
-              <w:keepNext w:val="0"/>
-              <w:keepLines w:val="0"/>
-              <w:pageBreakBefore w:val="0"/>
-              <w:widowControl w:val="0"/>
-              <w:numPr>
-                <w:ilvl w:val="0"/>
-                <w:numId w:val="0"/>
-              </w:numPr>
-              <w:tabs>
-                <w:tab w:val="left" w:pos="601"/>
-              </w:tabs>
-              <w:kinsoku/>
-              <w:wordWrap/>
-              <w:overflowPunct/>
-              <w:topLinePunct w:val="0"/>
-              <w:autoSpaceDE/>
-              <w:autoSpaceDN/>
-              <w:bidi w:val="0"/>
-              <w:adjustRightInd/>
-              <w:snapToGrid/>
-              <w:spacing w:line="300" w:lineRule="auto"/>
-              <w:jc w:val="left"/>
-              <w:textAlignment w:val="auto"/>
-              <w:rPr>
-                <w:rFonts w:hint="eastAsia"/>
-                <w:b w:val="0"/>
-                <w:bCs/>
-                <w:sz w:val="24"/>
-                <w:shd w:val="clear" w:color="auto" w:fill="auto"/>
-                <w:lang w:val="en-US" w:eastAsia="zh-CN"/>
-              </w:rPr>
-            </w:pPr>
-            <w:r>
-              <w:rPr>
-                <w:rFonts w:hint="eastAsia" w:ascii="宋体" w:hAnsi="宋体" w:eastAsia="宋体" w:cs="宋体"/>
-                <w:b w:val="0"/>
-                <w:bCs/>
-                <w:sz w:val="24"/>
-                <w:shd w:val="clear" w:color="auto" w:fill="auto"/>
-                <w:lang w:val="en-US" w:eastAsia="zh-CN"/>
-                <w:szCs w:val="24"/>
-              </w:rPr>
-              <w:t>对鱼类的毒性：</w:t>
-            </w:r>
-          </w:p>
-          <w:p>
-            <w:pPr>
-              <w:keepNext w:val="0"/>
-              <w:keepLines w:val="0"/>
-              <w:pageBreakBefore w:val="0"/>
-              <w:widowControl w:val="0"/>
-              <w:numPr>
-                <w:ilvl w:val="0"/>
-                <w:numId w:val="0"/>
-              </w:numPr>
-              <w:tabs>
-                <w:tab w:val="left" w:pos="601"/>
-              </w:tabs>
-              <w:kinsoku/>
-              <w:wordWrap/>
-              <w:overflowPunct/>
-              <w:topLinePunct w:val="0"/>
-              <w:autoSpaceDE/>
-              <w:autoSpaceDN/>
-              <w:bidi w:val="0"/>
-              <w:adjustRightInd/>
-              <w:snapToGrid/>
-              <w:spacing w:line="300" w:lineRule="auto"/>
-              <w:jc w:val="left"/>
-              <w:textAlignment w:val="auto"/>
-              <w:rPr>
-                <w:rFonts w:ascii="宋体" w:hAnsi="宋体" w:eastAsia="宋体" w:cs="宋体"/>
-                <w:sz w:val="24"/>
-                <w:szCs w:val="24"/>
-              </w:rPr>
-            </w:pPr>
-            <w:r>
-              <w:rPr>
-                <w:rFonts w:ascii="宋体" w:hAnsi="宋体" w:eastAsia="宋体" w:cs="宋体"/>
-                <w:sz w:val="24"/>
-                <w:szCs w:val="24"/>
-              </w:rPr>
-              <w:t>半数致死浓度（LC50）/96 h/ 蓝鳃太阳鱼：1,300 mg/L</w:t>
-            </w:r>
-          </w:p>
-          <w:p>
-            <w:pPr>
-              <w:keepNext w:val="0"/>
-              <w:keepLines w:val="0"/>
-              <w:pageBreakBefore w:val="0"/>
-              <w:widowControl w:val="0"/>
-              <w:numPr>
-                <w:ilvl w:val="0"/>
-                <w:numId w:val="0"/>
-              </w:numPr>
-              <w:tabs>
-                <w:tab w:val="left" w:pos="601"/>
-              </w:tabs>
-              <w:kinsoku/>
-              <w:wordWrap/>
-              <w:overflowPunct/>
-              <w:topLinePunct w:val="0"/>
-              <w:autoSpaceDE/>
-              <w:autoSpaceDN/>
-              <w:bidi w:val="0"/>
-              <w:adjustRightInd/>
-              <w:snapToGrid/>
-              <w:spacing w:line="300" w:lineRule="auto"/>
-              <w:jc w:val="left"/>
-              <w:textAlignment w:val="auto"/>
-              <w:rPr>
-                <w:rFonts w:hint="eastAsia"/>
-                <w:b w:val="0"/>
-                <w:bCs/>
-                <w:sz w:val="24"/>
-                <w:shd w:val="clear" w:color="auto" w:fill="auto"/>
-                <w:lang w:val="en-US" w:eastAsia="zh-CN"/>
-              </w:rPr>
-            </w:pPr>
-            <w:r>
-              <w:rPr>
-                <w:rFonts w:hint="eastAsia" w:ascii="宋体" w:hAnsi="宋体" w:eastAsia="宋体" w:cs="宋体"/>
-                <w:b w:val="0"/>
-                <w:bCs/>
-                <w:sz w:val="24"/>
-                <w:shd w:val="clear" w:color="auto" w:fill="auto"/>
-                <w:lang w:val="en-US" w:eastAsia="zh-CN"/>
-                <w:szCs w:val="24"/>
-              </w:rPr>
-              <w:t>其他：</w:t>
-            </w:r>
-          </w:p>
-          <w:p>
-            <w:pPr>
-              <w:keepNext w:val="0"/>
-              <w:keepLines w:val="0"/>
-              <w:pageBreakBefore w:val="0"/>
-              <w:widowControl w:val="0"/>
-              <w:numPr>
-                <w:ilvl w:val="0"/>
-                <w:numId w:val="0"/>
-              </w:numPr>
-              <w:tabs>
-                <w:tab w:val="left" w:pos="601"/>
-              </w:tabs>
-              <w:kinsoku/>
-              <w:wordWrap/>
-              <w:overflowPunct/>
-              <w:topLinePunct w:val="0"/>
-              <w:autoSpaceDE/>
-              <w:autoSpaceDN/>
-              <w:bidi w:val="0"/>
-              <w:adjustRightInd/>
-              <w:snapToGrid/>
-              <w:spacing w:line="300" w:lineRule="auto"/>
-              <w:jc w:val="left"/>
-              <w:textAlignment w:val="auto"/>
-              <w:rPr>
-                <w:rFonts w:hint="default" w:ascii="宋体" w:hAnsi="宋体" w:eastAsia="宋体" w:cs="宋体"/>
-                <w:sz w:val="24"/>
-                <w:szCs w:val="24"/>
-                <w:lang w:val="en-US" w:eastAsia="zh-CN"/>
-              </w:rPr>
-            </w:pPr>
-            <w:r>
-              <w:rPr>
-                <w:rFonts w:ascii="宋体" w:hAnsi="宋体" w:eastAsia="宋体" w:cs="宋体"/>
-                <w:sz w:val="24"/>
-                <w:szCs w:val="24"/>
-              </w:rPr>
-              <w:t>生物量半数有效浓度（EbC50）/96 h/ 绿藻：＞100 mg/L。 半数有效浓度（EC50）/48 h/ 大型溞：＞100 mg/L</w:t>
-            </w:r>
-          </w:p>
-        </w:tc>
-      </w:tr>
-      <w:tr>
-        <w:tblPrEx>
-          <w:tblBorders>
-            <w:top w:val="single" w:color="auto" w:sz="4" w:space="0"/>
-            <w:left w:val="single" w:color="auto" w:sz="4" w:space="0"/>
-            <w:bottom w:val="single" w:color="auto" w:sz="4" w:space="0"/>
-            <w:right w:val="single" w:color="auto" w:sz="4" w:space="0"/>
-            <w:insideH w:val="none" w:color="auto" w:sz="0" w:space="0"/>
-            <w:insideV w:val="none" w:color="auto" w:sz="0" w:space="0"/>
-          </w:tblBorders>
-          <w:tblCellMar>
-            <w:top w:w="0" w:type="dxa"/>
-            <w:left w:w="108" w:type="dxa"/>
-            <w:bottom w:w="0" w:type="dxa"/>
-            <w:right w:w="108" w:type="dxa"/>
-          </w:tblCellMar>
-        </w:tblPrEx>
-        <w:trPr>
-          <w:trHeight w:val="272" w:hRule="atLeast"/>
-        </w:trPr>
-        <w:tc>
-          <w:tcPr>
-            <w:tcW w:w="3504" w:type="dxa"/>
-            <w:tcBorders>
-              <w:top w:val="dotted" w:color="auto" w:sz="4" w:space="0"/>
-              <w:bottom w:val="dotted" w:color="auto" w:sz="4" w:space="0"/>
-              <w:right w:val="dotted" w:color="auto" w:sz="4" w:space="0"/>
-            </w:tcBorders>
-            <w:vAlign w:val="center"/>
-          </w:tcPr>
-          <w:p>
-            <w:pPr>
-              <w:keepNext w:val="0"/>
-              <w:keepLines w:val="0"/>
-              <w:pageBreakBefore w:val="0"/>
-              <w:widowControl w:val="0"/>
-              <w:numPr>
-                <w:ilvl w:val="1"/>
-                <w:numId w:val="0"/>
-              </w:numPr>
-              <w:tabs>
-                <w:tab w:val="left" w:pos="601"/>
-              </w:tabs>
-              <w:kinsoku/>
-              <w:wordWrap/>
-              <w:overflowPunct/>
-              <w:topLinePunct w:val="0"/>
-              <w:autoSpaceDE/>
-              <w:autoSpaceDN/>
-              <w:bidi w:val="0"/>
-              <w:adjustRightInd/>
-              <w:snapToGrid/>
-              <w:spacing w:line="300" w:lineRule="auto"/>
-              <w:ind w:left="597" w:leftChars="0" w:hanging="597" w:hangingChars="283"/>
-              <w:jc w:val="left"/>
-              <w:textAlignment w:val="auto"/>
-              <w:rPr>
-                <w:b/>
-                <w:sz w:val="24"/>
-              </w:rPr>
-            </w:pPr>
-            <w:r>
-              <w:rPr>
-                <w:rFonts w:hint="default" w:ascii="Times New Roman" w:hAnsi="Times New Roman" w:eastAsia="宋体" w:cs="Times New Roman"/>
-                <w:b/>
-                <w:kern w:val="2"/>
-                <w:sz w:val="21"/>
-                <w:szCs w:val="21"/>
-                <w:lang w:val="en-US" w:eastAsia="zh-CN" w:bidi="ar-SA"/>
-              </w:rPr>
-              <w:t>12.2</w:t>
-            </w:r>
-            <w:r>
-              <w:rPr>
-                <w:rFonts w:hint="eastAsia" w:cs="Times New Roman"/>
-                <w:b/>
-                <w:kern w:val="2"/>
-                <w:sz w:val="24"/>
-                <w:szCs w:val="24"/>
-                <w:lang w:val="en-US" w:eastAsia="zh-CN" w:bidi="ar-SA"/>
-              </w:rPr>
-              <w:t xml:space="preserve">  </w:t>
-            </w:r>
-            <w:r>
-              <w:rPr>
-                <w:rFonts w:hint="eastAsia" w:hAnsi="Arial"/>
-                <w:b/>
-                <w:sz w:val="24"/>
-              </w:rPr>
-              <w:t>持久性和降解性：</w:t>
-            </w:r>
-          </w:p>
-        </w:tc>
-        <w:tc>
-          <w:tcPr>
-            <w:tcW w:w="6277" w:type="dxa"/>
-            <w:tcBorders>
-              <w:top w:val="dotted" w:color="auto" w:sz="4" w:space="0"/>
-              <w:left w:val="dotted" w:color="auto" w:sz="4" w:space="0"/>
-              <w:bottom w:val="dotted" w:color="auto" w:sz="4" w:space="0"/>
-            </w:tcBorders>
-            <w:vAlign w:val="center"/>
-          </w:tcPr>
-          <w:p>
-            <w:pPr>
-              <w:keepNext w:val="0"/>
-              <w:keepLines w:val="0"/>
-              <w:pageBreakBefore w:val="0"/>
-              <w:widowControl w:val="0"/>
-              <w:kinsoku/>
-              <w:wordWrap/>
-              <w:overflowPunct/>
-              <w:topLinePunct w:val="0"/>
-              <w:autoSpaceDE/>
-              <w:autoSpaceDN/>
-              <w:bidi w:val="0"/>
-              <w:adjustRightInd/>
-              <w:snapToGrid/>
-              <w:spacing w:line="300" w:lineRule="auto"/>
-              <w:ind w:left="1"/>
-              <w:jc w:val="left"/>
-              <w:textAlignment w:val="auto"/>
-              <w:rPr>
-                <w:rFonts w:ascii="宋体" w:hAnsi="宋体" w:eastAsia="宋体" w:cs="宋体"/>
-                <w:sz w:val="24"/>
-                <w:szCs w:val="24"/>
-              </w:rPr>
-            </w:pPr>
-            <w:r>
-              <w:rPr>
-                <w:rFonts w:ascii="宋体" w:hAnsi="宋体" w:eastAsia="宋体" w:cs="宋体"/>
-                <w:sz w:val="24"/>
-                <w:szCs w:val="24"/>
-              </w:rPr>
-              <w:t>生物降解率：89%—93%，28 d</w:t>
-            </w:r>
-          </w:p>
-          <w:p>
-            <w:pPr>
-              <w:keepNext w:val="0"/>
-              <w:keepLines w:val="0"/>
-              <w:pageBreakBefore w:val="0"/>
-              <w:widowControl w:val="0"/>
-              <w:kinsoku/>
-              <w:wordWrap/>
-              <w:overflowPunct/>
-              <w:topLinePunct w:val="0"/>
-              <w:autoSpaceDE/>
-              <w:autoSpaceDN/>
-              <w:bidi w:val="0"/>
-              <w:adjustRightInd/>
-              <w:snapToGrid/>
-              <w:spacing w:line="300" w:lineRule="auto"/>
-              <w:ind w:left="1"/>
-              <w:jc w:val="left"/>
-              <w:textAlignment w:val="auto"/>
-              <w:rPr>
-                <w:rFonts w:hint="eastAsia" w:ascii="宋体" w:hAnsi="宋体" w:eastAsia="宋体" w:cs="宋体"/>
-                <w:sz w:val="24"/>
-                <w:szCs w:val="24"/>
-                <w:lang w:val="en-US" w:eastAsia="zh-CN"/>
-              </w:rPr>
-            </w:pPr>
-            <w:r>
-              <w:rPr>
-                <w:rFonts w:ascii="宋体" w:hAnsi="宋体" w:eastAsia="宋体" w:cs="宋体"/>
-                <w:sz w:val="24"/>
-                <w:szCs w:val="24"/>
-              </w:rPr>
-              <w:t>试验方法：OECD 301C或等效方法</w:t>
-            </w:r>
-            <w:r>
-              <w:rPr>
-                <w:rFonts w:hint="eastAsia" w:ascii="宋体" w:hAnsi="宋体" w:cs="宋体" w:eastAsia="宋体"/>
-                <w:sz w:val="24"/>
-                <w:szCs w:val="24"/>
-                <w:lang w:eastAsia="zh-CN"/>
-              </w:rPr>
-              <w:t>。</w:t>
-            </w:r>
-          </w:p>
-        </w:tc>
-      </w:tr>
-      <w:tr>
-        <w:tblPrEx>
-          <w:tblBorders>
-            <w:top w:val="single" w:color="auto" w:sz="4" w:space="0"/>
-            <w:left w:val="single" w:color="auto" w:sz="4" w:space="0"/>
-            <w:bottom w:val="single" w:color="auto" w:sz="4" w:space="0"/>
-            <w:right w:val="single" w:color="auto" w:sz="4" w:space="0"/>
-            <w:insideH w:val="none" w:color="auto" w:sz="0" w:space="0"/>
-            <w:insideV w:val="none" w:color="auto" w:sz="0" w:space="0"/>
-          </w:tblBorders>
-          <w:tblCellMar>
-            <w:top w:w="0" w:type="dxa"/>
-            <w:left w:w="108" w:type="dxa"/>
-            <w:bottom w:w="0" w:type="dxa"/>
-            <w:right w:w="108" w:type="dxa"/>
-          </w:tblCellMar>
-        </w:tblPrEx>
-        <w:trPr>
-          <w:trHeight w:val="272" w:hRule="atLeast"/>
-        </w:trPr>
-        <w:tc>
-          <w:tcPr>
-            <w:tcW w:w="3504" w:type="dxa"/>
-            <w:tcBorders>
-              <w:top w:val="dotted" w:color="auto" w:sz="4" w:space="0"/>
-              <w:bottom w:val="single" w:color="auto" w:sz="4" w:space="0"/>
-              <w:right w:val="dotted" w:color="auto" w:sz="4" w:space="0"/>
-            </w:tcBorders>
-            <w:vAlign w:val="center"/>
-          </w:tcPr>
-          <w:p>
-            <w:pPr>
-              <w:keepNext w:val="0"/>
-              <w:keepLines w:val="0"/>
-              <w:pageBreakBefore w:val="0"/>
-              <w:widowControl w:val="0"/>
-              <w:numPr>
-                <w:ilvl w:val="1"/>
-                <w:numId w:val="0"/>
-              </w:numPr>
-              <w:tabs>
-                <w:tab w:val="left" w:pos="601"/>
-              </w:tabs>
-              <w:kinsoku/>
-              <w:wordWrap/>
-              <w:overflowPunct/>
-              <w:topLinePunct w:val="0"/>
-              <w:autoSpaceDE/>
-              <w:autoSpaceDN/>
-              <w:bidi w:val="0"/>
-              <w:adjustRightInd/>
-              <w:snapToGrid/>
-              <w:spacing w:line="300" w:lineRule="auto"/>
-              <w:ind w:left="597" w:leftChars="0" w:hanging="597" w:hangingChars="283"/>
-              <w:jc w:val="left"/>
-              <w:textAlignment w:val="auto"/>
-              <w:rPr>
-                <w:b/>
-                <w:sz w:val="24"/>
-              </w:rPr>
-            </w:pPr>
-            <w:r>
-              <w:rPr>
-                <w:rFonts w:hint="default" w:ascii="Times New Roman" w:hAnsi="Times New Roman" w:eastAsia="宋体" w:cs="Times New Roman"/>
-                <w:b/>
-                <w:kern w:val="2"/>
-                <w:sz w:val="21"/>
-                <w:szCs w:val="21"/>
-                <w:lang w:val="en-US" w:eastAsia="zh-CN" w:bidi="ar-SA"/>
-              </w:rPr>
-              <w:t>12.3</w:t>
-            </w:r>
-            <w:r>
-              <w:rPr>
-                <w:rFonts w:hint="eastAsia" w:cs="Times New Roman"/>
-                <w:b/>
-                <w:kern w:val="2"/>
-                <w:sz w:val="21"/>
-                <w:szCs w:val="21"/>
-                <w:lang w:val="en-US" w:eastAsia="zh-CN" w:bidi="ar-SA"/>
-              </w:rPr>
-              <w:t xml:space="preserve">  </w:t>
-            </w:r>
-            <w:r>
-              <w:rPr>
-                <w:rFonts w:hint="eastAsia" w:hAnsi="Arial"/>
-                <w:b/>
-                <w:sz w:val="24"/>
-              </w:rPr>
-              <w:t>其他</w:t>
-            </w:r>
-            <w:r>
-              <w:rPr>
-                <w:rFonts w:hint="eastAsia" w:hAnsi="Arial"/>
-                <w:b/>
-                <w:sz w:val="24"/>
-                <w:lang w:val="en-US" w:eastAsia="zh-CN"/>
-              </w:rPr>
-              <w:t>不利的影响</w:t>
-            </w:r>
-            <w:r>
-              <w:rPr>
-                <w:rFonts w:hint="eastAsia" w:hAnsi="Arial"/>
-                <w:b/>
-                <w:sz w:val="24"/>
-              </w:rPr>
-              <w:t>：</w:t>
-            </w:r>
-          </w:p>
-        </w:tc>
-        <w:tc>
-          <w:tcPr>
-            <w:tcW w:w="6277" w:type="dxa"/>
-            <w:tcBorders>
-              <w:top w:val="dotted" w:color="auto" w:sz="4" w:space="0"/>
-              <w:left w:val="dotted" w:color="auto" w:sz="4" w:space="0"/>
-              <w:bottom w:val="single" w:color="auto" w:sz="4" w:space="0"/>
-            </w:tcBorders>
-            <w:vAlign w:val="center"/>
-          </w:tcPr>
-          <w:p>
-            <w:pPr>
-              <w:keepNext w:val="0"/>
-              <w:keepLines w:val="0"/>
-              <w:pageBreakBefore w:val="0"/>
-              <w:widowControl w:val="0"/>
-              <w:kinsoku/>
-              <w:wordWrap/>
-              <w:overflowPunct/>
-              <w:topLinePunct w:val="0"/>
-              <w:autoSpaceDE/>
-              <w:autoSpaceDN/>
-              <w:bidi w:val="0"/>
-              <w:adjustRightInd/>
-              <w:snapToGrid/>
-              <w:spacing w:line="300" w:lineRule="auto"/>
-              <w:ind w:left="1"/>
-              <w:jc w:val="left"/>
-              <w:textAlignment w:val="auto"/>
-              <w:rPr>
-                <w:sz w:val="24"/>
-              </w:rPr>
-            </w:pPr>
-            <w:r>
-              <w:rPr>
-                <w:rFonts w:hint="eastAsia" w:hAnsi="宋体" w:ascii="宋体" w:eastAsia="宋体" w:cs="宋体"/>
-                <w:sz w:val="24"/>
-                <w:lang w:val="en-US" w:eastAsia="zh-CN"/>
-                <w:szCs w:val="24"/>
-              </w:rPr>
-              <w:t>无数据资料。</w:t>
             </w:r>
           </w:p>
         </w:tc>
@@ -16392,6 +15597,842 @@
                 <w:b/>
                 <w:sz w:val="24"/>
               </w:rPr>
+              <w:t>12.</w:t>
+            </w:r>
+            <w:r>
+              <w:rPr>
+                <w:rFonts w:hint="eastAsia" w:hAnsi="Arial"/>
+                <w:b/>
+                <w:sz w:val="24"/>
+              </w:rPr>
+              <w:t>生态信息</w:t>
+            </w:r>
+          </w:p>
+        </w:tc>
+      </w:tr>
+      <w:tr>
+        <w:tblPrEx>
+          <w:tblBorders>
+            <w:top w:val="single" w:color="auto" w:sz="4" w:space="0"/>
+            <w:left w:val="single" w:color="auto" w:sz="4" w:space="0"/>
+            <w:bottom w:val="single" w:color="auto" w:sz="4" w:space="0"/>
+            <w:right w:val="single" w:color="auto" w:sz="4" w:space="0"/>
+            <w:insideH w:val="none" w:color="auto" w:sz="0" w:space="0"/>
+            <w:insideV w:val="none" w:color="auto" w:sz="0" w:space="0"/>
+          </w:tblBorders>
+          <w:tblCellMar>
+            <w:top w:w="0" w:type="dxa"/>
+            <w:left w:w="108" w:type="dxa"/>
+            <w:bottom w:w="0" w:type="dxa"/>
+            <w:right w:w="108" w:type="dxa"/>
+          </w:tblCellMar>
+        </w:tblPrEx>
+        <w:tc>
+          <w:tcPr>
+            <w:tcW w:w="9781" w:type="dxa"/>
+            <w:gridSpan w:val="2"/>
+            <w:tcBorders>
+              <w:top w:val="single" w:color="auto" w:sz="4" w:space="0"/>
+              <w:bottom w:val="dotted" w:color="auto" w:sz="4" w:space="0"/>
+            </w:tcBorders>
+            <w:shd w:val="clear" w:color="auto" w:fill="auto"/>
+            <w:vAlign w:val="center"/>
+          </w:tcPr>
+          <w:p>
+            <w:pPr>
+              <w:keepNext w:val="0"/>
+              <w:keepLines w:val="0"/>
+              <w:pageBreakBefore w:val="0"/>
+              <w:widowControl w:val="0"/>
+              <w:kinsoku/>
+              <w:wordWrap/>
+              <w:overflowPunct/>
+              <w:topLinePunct w:val="0"/>
+              <w:autoSpaceDE/>
+              <w:autoSpaceDN/>
+              <w:bidi w:val="0"/>
+              <w:adjustRightInd/>
+              <w:snapToGrid/>
+              <w:spacing w:line="300" w:lineRule="auto"/>
+              <w:ind w:right="480"/>
+              <w:jc w:val="left"/>
+              <w:textAlignment w:val="auto"/>
+              <w:rPr>
+                <w:sz w:val="24"/>
+                <w:shd w:val="clear" w:color="auto" w:fill="auto"/>
+                <w:b w:val="0"/>
+                <w:bCs w:val="0"/>
+              </w:rPr>
+            </w:pPr>
+            <w:r>
+              <w:rPr>
+                <w:rFonts w:hint="eastAsia" w:hAnsi="宋体" w:ascii="宋体" w:eastAsia="宋体" w:cs="宋体"/>
+                <w:sz w:val="24"/>
+                <w:shd w:val="clear" w:color="auto" w:fill="auto"/>
+                <w:szCs w:val="24"/>
+              </w:rPr>
+              <w:t>该产品无可用的生态毒理学研究。</w:t>
+            </w:r>
+          </w:p>
+        </w:tc>
+      </w:tr>
+      <w:tr>
+        <w:tblPrEx>
+          <w:tblBorders>
+            <w:top w:val="single" w:color="auto" w:sz="4" w:space="0"/>
+            <w:left w:val="single" w:color="auto" w:sz="4" w:space="0"/>
+            <w:bottom w:val="single" w:color="auto" w:sz="4" w:space="0"/>
+            <w:right w:val="single" w:color="auto" w:sz="4" w:space="0"/>
+            <w:insideH w:val="none" w:color="auto" w:sz="0" w:space="0"/>
+            <w:insideV w:val="none" w:color="auto" w:sz="0" w:space="0"/>
+          </w:tblBorders>
+          <w:tblCellMar>
+            <w:top w:w="0" w:type="dxa"/>
+            <w:left w:w="108" w:type="dxa"/>
+            <w:bottom w:w="0" w:type="dxa"/>
+            <w:right w:w="108" w:type="dxa"/>
+          </w:tblCellMar>
+        </w:tblPrEx>
+        <w:tc>
+          <w:tcPr>
+            <w:tcW w:w="9781" w:type="dxa"/>
+            <w:gridSpan w:val="2"/>
+            <w:tcBorders>
+              <w:top w:val="dotted" w:color="auto" w:sz="4" w:space="0"/>
+              <w:bottom w:val="dotted" w:color="auto" w:sz="4" w:space="0"/>
+            </w:tcBorders>
+            <w:shd w:val="clear" w:color="auto" w:fill="auto"/>
+            <w:vAlign w:val="center"/>
+          </w:tcPr>
+          <w:p>
+            <w:pPr>
+              <w:keepNext w:val="0"/>
+              <w:keepLines w:val="0"/>
+              <w:pageBreakBefore w:val="0"/>
+              <w:widowControl w:val="0"/>
+              <w:kinsoku/>
+              <w:wordWrap/>
+              <w:overflowPunct/>
+              <w:topLinePunct w:val="0"/>
+              <w:autoSpaceDE/>
+              <w:autoSpaceDN/>
+              <w:bidi w:val="0"/>
+              <w:adjustRightInd/>
+              <w:snapToGrid/>
+              <w:spacing w:line="300" w:lineRule="auto"/>
+              <w:ind w:right="480"/>
+              <w:jc w:val="left"/>
+              <w:textAlignment w:val="auto"/>
+              <w:rPr>
+                <w:rFonts w:hint="eastAsia" w:hAnsi="Arial"/>
+                <w:sz w:val="24"/>
+                <w:shd w:val="clear" w:color="auto" w:fill="auto"/>
+              </w:rPr>
+            </w:pPr>
+            <w:r>
+              <w:rPr>
+                <w:rFonts w:ascii="宋体" w:hAnsi="宋体" w:eastAsia="宋体" w:cs="宋体"/>
+                <w:sz w:val="24"/>
+                <w:szCs w:val="24"/>
+              </w:rPr>
+              <w:t>以下为二乙二醇单丁醚 （CAS号：112-34-5）的生态毒理学参考数据：</w:t>
+            </w:r>
+          </w:p>
+        </w:tc>
+      </w:tr>
+      <w:tr>
+        <w:tblPrEx>
+          <w:tblBorders>
+            <w:top w:val="single" w:color="auto" w:sz="4" w:space="0"/>
+            <w:left w:val="single" w:color="auto" w:sz="4" w:space="0"/>
+            <w:bottom w:val="single" w:color="auto" w:sz="4" w:space="0"/>
+            <w:right w:val="single" w:color="auto" w:sz="4" w:space="0"/>
+            <w:insideH w:val="none" w:color="auto" w:sz="0" w:space="0"/>
+            <w:insideV w:val="none" w:color="auto" w:sz="0" w:space="0"/>
+          </w:tblBorders>
+          <w:tblCellMar>
+            <w:top w:w="0" w:type="dxa"/>
+            <w:left w:w="108" w:type="dxa"/>
+            <w:bottom w:w="0" w:type="dxa"/>
+            <w:right w:w="108" w:type="dxa"/>
+          </w:tblCellMar>
+        </w:tblPrEx>
+        <w:trPr>
+          <w:trHeight w:val="272" w:hRule="atLeast"/>
+        </w:trPr>
+        <w:tc>
+          <w:tcPr>
+            <w:tcW w:w="3504" w:type="dxa"/>
+            <w:tcBorders>
+              <w:top w:val="dotted" w:color="auto" w:sz="4" w:space="0"/>
+              <w:bottom w:val="dotted" w:color="auto" w:sz="4" w:space="0"/>
+              <w:right w:val="dotted" w:color="auto" w:sz="4" w:space="0"/>
+            </w:tcBorders>
+            <w:vAlign w:val="center"/>
+          </w:tcPr>
+          <w:p>
+            <w:pPr>
+              <w:keepNext w:val="0"/>
+              <w:keepLines w:val="0"/>
+              <w:pageBreakBefore w:val="0"/>
+              <w:widowControl w:val="0"/>
+              <w:numPr>
+                <w:ilvl w:val="1"/>
+                <w:numId w:val="0"/>
+              </w:numPr>
+              <w:tabs>
+                <w:tab w:val="left" w:pos="601"/>
+              </w:tabs>
+              <w:kinsoku/>
+              <w:wordWrap/>
+              <w:overflowPunct/>
+              <w:topLinePunct w:val="0"/>
+              <w:autoSpaceDE/>
+              <w:autoSpaceDN/>
+              <w:bidi w:val="0"/>
+              <w:adjustRightInd/>
+              <w:snapToGrid/>
+              <w:spacing w:line="300" w:lineRule="auto"/>
+              <w:ind w:left="597" w:leftChars="0" w:hanging="597" w:hangingChars="283"/>
+              <w:jc w:val="left"/>
+              <w:textAlignment w:val="auto"/>
+              <w:rPr>
+                <w:rFonts w:hint="default" w:eastAsia="宋体"/>
+                <w:sz w:val="24"/>
+                <w:lang w:val="en-US" w:eastAsia="zh-CN"/>
+              </w:rPr>
+            </w:pPr>
+            <w:r>
+              <w:rPr>
+                <w:rFonts w:hint="default" w:ascii="Times New Roman" w:hAnsi="Times New Roman" w:eastAsia="宋体" w:cs="Times New Roman"/>
+                <w:b/>
+                <w:kern w:val="2"/>
+                <w:sz w:val="21"/>
+                <w:szCs w:val="21"/>
+                <w:lang w:val="en-US" w:eastAsia="zh-CN" w:bidi="ar-SA"/>
+              </w:rPr>
+              <w:t>12.</w:t>
+            </w:r>
+            <w:r>
+              <w:rPr>
+                <w:rFonts w:hint="eastAsia" w:cs="Times New Roman"/>
+                <w:b/>
+                <w:kern w:val="2"/>
+                <w:sz w:val="21"/>
+                <w:szCs w:val="21"/>
+                <w:lang w:val="en-US" w:eastAsia="zh-CN" w:bidi="ar-SA"/>
+              </w:rPr>
+              <w:t xml:space="preserve">1  </w:t>
+            </w:r>
+            <w:r>
+              <w:rPr>
+                <w:rFonts w:hint="eastAsia" w:hAnsi="Arial"/>
+                <w:b/>
+                <w:sz w:val="24"/>
+              </w:rPr>
+              <w:t>生态毒性：</w:t>
+            </w:r>
+          </w:p>
+        </w:tc>
+        <w:tc>
+          <w:tcPr>
+            <w:tcW w:w="6277" w:type="dxa"/>
+            <w:tcBorders>
+              <w:top w:val="dotted" w:color="auto" w:sz="4" w:space="0"/>
+              <w:left w:val="dotted" w:color="auto" w:sz="4" w:space="0"/>
+              <w:bottom w:val="dotted" w:color="auto" w:sz="4" w:space="0"/>
+            </w:tcBorders>
+            <w:vAlign w:val="center"/>
+          </w:tcPr>
+          <w:p>
+            <w:pPr>
+              <w:keepNext w:val="0"/>
+              <w:keepLines w:val="0"/>
+              <w:pageBreakBefore w:val="0"/>
+              <w:widowControl w:val="0"/>
+              <w:numPr>
+                <w:ilvl w:val="0"/>
+                <w:numId w:val="0"/>
+              </w:numPr>
+              <w:tabs>
+                <w:tab w:val="left" w:pos="601"/>
+              </w:tabs>
+              <w:kinsoku/>
+              <w:wordWrap/>
+              <w:overflowPunct/>
+              <w:topLinePunct w:val="0"/>
+              <w:autoSpaceDE/>
+              <w:autoSpaceDN/>
+              <w:bidi w:val="0"/>
+              <w:adjustRightInd/>
+              <w:snapToGrid/>
+              <w:spacing w:line="300" w:lineRule="auto"/>
+              <w:jc w:val="left"/>
+              <w:textAlignment w:val="auto"/>
+              <w:rPr>
+                <w:rFonts w:hint="eastAsia"/>
+                <w:sz w:val="24"/>
+                <w:shd w:val="clear" w:color="auto" w:fill="auto"/>
+                <w:lang w:val="en-US" w:eastAsia="zh-CN"/>
+                <w:b w:val="0"/>
+                <w:bCs w:val="0"/>
+              </w:rPr>
+            </w:pPr>
+            <w:r>
+              <w:rPr>
+                <w:rFonts w:hint="eastAsia" w:ascii="宋体" w:hAnsi="宋体" w:eastAsia="宋体" w:cs="宋体"/>
+                <w:b w:val="0"/>
+                <w:bCs/>
+                <w:sz w:val="24"/>
+                <w:shd w:val="clear" w:color="auto" w:fill="auto"/>
+                <w:lang w:val="en-US" w:eastAsia="zh-CN"/>
+                <w:szCs w:val="24"/>
+              </w:rPr>
+              <w:t>对鱼类的毒性：</w:t>
+            </w:r>
+          </w:p>
+          <w:p>
+            <w:pPr>
+              <w:keepNext w:val="0"/>
+              <w:keepLines w:val="0"/>
+              <w:pageBreakBefore w:val="0"/>
+              <w:widowControl w:val="0"/>
+              <w:numPr>
+                <w:ilvl w:val="0"/>
+                <w:numId w:val="0"/>
+              </w:numPr>
+              <w:tabs>
+                <w:tab w:val="left" w:pos="601"/>
+              </w:tabs>
+              <w:kinsoku/>
+              <w:wordWrap/>
+              <w:overflowPunct/>
+              <w:topLinePunct w:val="0"/>
+              <w:autoSpaceDE/>
+              <w:autoSpaceDN/>
+              <w:bidi w:val="0"/>
+              <w:adjustRightInd/>
+              <w:snapToGrid/>
+              <w:spacing w:line="300" w:lineRule="auto"/>
+              <w:jc w:val="left"/>
+              <w:textAlignment w:val="auto"/>
+              <w:rPr>
+                <w:rFonts w:ascii="宋体" w:hAnsi="宋体" w:eastAsia="宋体" w:cs="宋体"/>
+                <w:sz w:val="24"/>
+                <w:szCs w:val="24"/>
+              </w:rPr>
+            </w:pPr>
+            <w:r>
+              <w:rPr>
+                <w:rFonts w:ascii="宋体" w:hAnsi="宋体" w:eastAsia="宋体" w:cs="宋体"/>
+                <w:sz w:val="24"/>
+                <w:szCs w:val="24"/>
+              </w:rPr>
+              <w:t>半数致死浓度（LC50）/96 h/ 蓝鳃太阳鱼：1,300 mg/L</w:t>
+            </w:r>
+          </w:p>
+          <w:p>
+            <w:pPr>
+              <w:keepNext w:val="0"/>
+              <w:keepLines w:val="0"/>
+              <w:pageBreakBefore w:val="0"/>
+              <w:widowControl w:val="0"/>
+              <w:numPr>
+                <w:ilvl w:val="0"/>
+                <w:numId w:val="0"/>
+              </w:numPr>
+              <w:tabs>
+                <w:tab w:val="left" w:pos="601"/>
+              </w:tabs>
+              <w:kinsoku/>
+              <w:wordWrap/>
+              <w:overflowPunct/>
+              <w:topLinePunct w:val="0"/>
+              <w:autoSpaceDE/>
+              <w:autoSpaceDN/>
+              <w:bidi w:val="0"/>
+              <w:adjustRightInd/>
+              <w:snapToGrid/>
+              <w:spacing w:line="300" w:lineRule="auto"/>
+              <w:jc w:val="left"/>
+              <w:textAlignment w:val="auto"/>
+              <w:rPr>
+                <w:rFonts w:hint="eastAsia"/>
+                <w:sz w:val="24"/>
+                <w:shd w:val="clear" w:color="auto" w:fill="auto"/>
+                <w:lang w:val="en-US" w:eastAsia="zh-CN"/>
+                <w:b w:val="0"/>
+                <w:bCs w:val="0"/>
+              </w:rPr>
+            </w:pPr>
+            <w:r>
+              <w:rPr>
+                <w:rFonts w:hint="eastAsia" w:ascii="宋体" w:hAnsi="宋体" w:eastAsia="宋体" w:cs="宋体"/>
+                <w:b w:val="0"/>
+                <w:bCs/>
+                <w:sz w:val="24"/>
+                <w:shd w:val="clear" w:color="auto" w:fill="auto"/>
+                <w:lang w:val="en-US" w:eastAsia="zh-CN"/>
+                <w:szCs w:val="24"/>
+              </w:rPr>
+              <w:t>其他：</w:t>
+            </w:r>
+          </w:p>
+          <w:p>
+            <w:pPr>
+              <w:keepNext w:val="0"/>
+              <w:keepLines w:val="0"/>
+              <w:pageBreakBefore w:val="0"/>
+              <w:widowControl w:val="0"/>
+              <w:numPr>
+                <w:ilvl w:val="0"/>
+                <w:numId w:val="0"/>
+              </w:numPr>
+              <w:tabs>
+                <w:tab w:val="left" w:pos="601"/>
+              </w:tabs>
+              <w:kinsoku/>
+              <w:wordWrap/>
+              <w:overflowPunct/>
+              <w:topLinePunct w:val="0"/>
+              <w:autoSpaceDE/>
+              <w:autoSpaceDN/>
+              <w:bidi w:val="0"/>
+              <w:adjustRightInd/>
+              <w:snapToGrid/>
+              <w:spacing w:line="300" w:lineRule="auto"/>
+              <w:jc w:val="left"/>
+              <w:textAlignment w:val="auto"/>
+              <w:rPr>
+                <w:rFonts w:hint="default" w:ascii="宋体" w:hAnsi="宋体" w:eastAsia="宋体" w:cs="宋体"/>
+                <w:sz w:val="24"/>
+                <w:szCs w:val="24"/>
+                <w:lang w:val="en-US" w:eastAsia="zh-CN"/>
+              </w:rPr>
+            </w:pPr>
+            <w:r>
+              <w:rPr>
+                <w:rFonts w:ascii="宋体" w:hAnsi="宋体" w:eastAsia="宋体" w:cs="宋体"/>
+                <w:sz w:val="24"/>
+                <w:szCs w:val="24"/>
+              </w:rPr>
+              <w:t>生物量半数有效浓度（EbC50）/96 h/ 绿藻：＞100 mg/L。 半数有效浓度（EC50）/48 h/ 大型溞：＞100 mg/L</w:t>
+            </w:r>
+          </w:p>
+        </w:tc>
+      </w:tr>
+      <w:tr>
+        <w:tblPrEx>
+          <w:tblBorders>
+            <w:top w:val="single" w:color="auto" w:sz="4" w:space="0"/>
+            <w:left w:val="single" w:color="auto" w:sz="4" w:space="0"/>
+            <w:bottom w:val="single" w:color="auto" w:sz="4" w:space="0"/>
+            <w:right w:val="single" w:color="auto" w:sz="4" w:space="0"/>
+            <w:insideH w:val="none" w:color="auto" w:sz="0" w:space="0"/>
+            <w:insideV w:val="none" w:color="auto" w:sz="0" w:space="0"/>
+          </w:tblBorders>
+          <w:tblCellMar>
+            <w:top w:w="0" w:type="dxa"/>
+            <w:left w:w="108" w:type="dxa"/>
+            <w:bottom w:w="0" w:type="dxa"/>
+            <w:right w:w="108" w:type="dxa"/>
+          </w:tblCellMar>
+        </w:tblPrEx>
+        <w:trPr>
+          <w:trHeight w:val="272" w:hRule="atLeast"/>
+        </w:trPr>
+        <w:tc>
+          <w:tcPr>
+            <w:tcW w:w="3504" w:type="dxa"/>
+            <w:tcBorders>
+              <w:top w:val="dotted" w:color="auto" w:sz="4" w:space="0"/>
+              <w:bottom w:val="dotted" w:color="auto" w:sz="4" w:space="0"/>
+              <w:right w:val="dotted" w:color="auto" w:sz="4" w:space="0"/>
+            </w:tcBorders>
+            <w:vAlign w:val="center"/>
+          </w:tcPr>
+          <w:p>
+            <w:pPr>
+              <w:keepNext w:val="0"/>
+              <w:keepLines w:val="0"/>
+              <w:pageBreakBefore w:val="0"/>
+              <w:widowControl w:val="0"/>
+              <w:numPr>
+                <w:ilvl w:val="1"/>
+                <w:numId w:val="0"/>
+              </w:numPr>
+              <w:tabs>
+                <w:tab w:val="left" w:pos="601"/>
+              </w:tabs>
+              <w:kinsoku/>
+              <w:wordWrap/>
+              <w:overflowPunct/>
+              <w:topLinePunct w:val="0"/>
+              <w:autoSpaceDE/>
+              <w:autoSpaceDN/>
+              <w:bidi w:val="0"/>
+              <w:adjustRightInd/>
+              <w:snapToGrid/>
+              <w:spacing w:line="300" w:lineRule="auto"/>
+              <w:ind w:left="597" w:leftChars="0" w:hanging="597" w:hangingChars="283"/>
+              <w:jc w:val="left"/>
+              <w:textAlignment w:val="auto"/>
+              <w:rPr>
+                <w:b/>
+                <w:sz w:val="24"/>
+              </w:rPr>
+            </w:pPr>
+            <w:r>
+              <w:rPr>
+                <w:rFonts w:hint="default" w:ascii="Times New Roman" w:hAnsi="Times New Roman" w:eastAsia="宋体" w:cs="Times New Roman"/>
+                <w:b/>
+                <w:kern w:val="2"/>
+                <w:sz w:val="21"/>
+                <w:szCs w:val="21"/>
+                <w:lang w:val="en-US" w:eastAsia="zh-CN" w:bidi="ar-SA"/>
+              </w:rPr>
+              <w:t>12.2</w:t>
+            </w:r>
+            <w:r>
+              <w:rPr>
+                <w:rFonts w:hint="eastAsia" w:cs="Times New Roman"/>
+                <w:b/>
+                <w:kern w:val="2"/>
+                <w:sz w:val="24"/>
+                <w:szCs w:val="24"/>
+                <w:lang w:val="en-US" w:eastAsia="zh-CN" w:bidi="ar-SA"/>
+              </w:rPr>
+              <w:t xml:space="preserve">  </w:t>
+            </w:r>
+            <w:r>
+              <w:rPr>
+                <w:rFonts w:hint="eastAsia" w:hAnsi="Arial"/>
+                <w:b/>
+                <w:sz w:val="24"/>
+              </w:rPr>
+              <w:t>持久性和降解性：</w:t>
+            </w:r>
+          </w:p>
+        </w:tc>
+        <w:tc>
+          <w:tcPr>
+            <w:tcW w:w="6277" w:type="dxa"/>
+            <w:tcBorders>
+              <w:top w:val="dotted" w:color="auto" w:sz="4" w:space="0"/>
+              <w:left w:val="dotted" w:color="auto" w:sz="4" w:space="0"/>
+              <w:bottom w:val="dotted" w:color="auto" w:sz="4" w:space="0"/>
+            </w:tcBorders>
+            <w:vAlign w:val="center"/>
+          </w:tcPr>
+          <w:p>
+            <w:pPr>
+              <w:keepNext w:val="0"/>
+              <w:keepLines w:val="0"/>
+              <w:pageBreakBefore w:val="0"/>
+              <w:widowControl w:val="0"/>
+              <w:kinsoku/>
+              <w:wordWrap/>
+              <w:overflowPunct/>
+              <w:topLinePunct w:val="0"/>
+              <w:autoSpaceDE/>
+              <w:autoSpaceDN/>
+              <w:bidi w:val="0"/>
+              <w:adjustRightInd/>
+              <w:snapToGrid/>
+              <w:spacing w:line="300" w:lineRule="auto"/>
+              <w:ind w:left="1"/>
+              <w:jc w:val="left"/>
+              <w:textAlignment w:val="auto"/>
+              <w:rPr>
+                <w:rFonts w:ascii="宋体" w:hAnsi="宋体" w:eastAsia="宋体" w:cs="宋体"/>
+                <w:sz w:val="24"/>
+                <w:szCs w:val="24"/>
+              </w:rPr>
+            </w:pPr>
+            <w:r>
+              <w:rPr>
+                <w:rFonts w:ascii="宋体" w:hAnsi="宋体" w:eastAsia="宋体" w:cs="宋体"/>
+                <w:sz w:val="24"/>
+                <w:szCs w:val="24"/>
+              </w:rPr>
+              <w:t>生物降解率：89%—93%，28 d</w:t>
+            </w:r>
+          </w:p>
+          <w:p>
+            <w:pPr>
+              <w:keepNext w:val="0"/>
+              <w:keepLines w:val="0"/>
+              <w:pageBreakBefore w:val="0"/>
+              <w:widowControl w:val="0"/>
+              <w:kinsoku/>
+              <w:wordWrap/>
+              <w:overflowPunct/>
+              <w:topLinePunct w:val="0"/>
+              <w:autoSpaceDE/>
+              <w:autoSpaceDN/>
+              <w:bidi w:val="0"/>
+              <w:adjustRightInd/>
+              <w:snapToGrid/>
+              <w:spacing w:line="300" w:lineRule="auto"/>
+              <w:ind w:left="1"/>
+              <w:jc w:val="left"/>
+              <w:textAlignment w:val="auto"/>
+              <w:rPr>
+                <w:rFonts w:hint="eastAsia" w:ascii="宋体" w:hAnsi="宋体" w:eastAsia="宋体" w:cs="宋体"/>
+                <w:sz w:val="24"/>
+                <w:szCs w:val="24"/>
+                <w:lang w:val="en-US" w:eastAsia="zh-CN"/>
+              </w:rPr>
+            </w:pPr>
+            <w:r>
+              <w:rPr>
+                <w:rFonts w:ascii="宋体" w:hAnsi="宋体" w:eastAsia="宋体" w:cs="宋体"/>
+                <w:sz w:val="24"/>
+                <w:szCs w:val="24"/>
+              </w:rPr>
+              <w:t>试验方法：OECD 301C或等效方法</w:t>
+            </w:r>
+            <w:r>
+              <w:rPr>
+                <w:rFonts w:hint="eastAsia" w:ascii="宋体" w:hAnsi="宋体" w:cs="宋体" w:eastAsia="宋体"/>
+                <w:sz w:val="24"/>
+                <w:szCs w:val="24"/>
+                <w:lang w:eastAsia="zh-CN"/>
+              </w:rPr>
+              <w:t>。</w:t>
+            </w:r>
+          </w:p>
+        </w:tc>
+      </w:tr>
+      <w:tr>
+        <w:tblPrEx>
+          <w:tblBorders>
+            <w:top w:val="single" w:color="auto" w:sz="4" w:space="0"/>
+            <w:left w:val="single" w:color="auto" w:sz="4" w:space="0"/>
+            <w:bottom w:val="single" w:color="auto" w:sz="4" w:space="0"/>
+            <w:right w:val="single" w:color="auto" w:sz="4" w:space="0"/>
+            <w:insideH w:val="none" w:color="auto" w:sz="0" w:space="0"/>
+            <w:insideV w:val="none" w:color="auto" w:sz="0" w:space="0"/>
+          </w:tblBorders>
+          <w:tblCellMar>
+            <w:top w:w="0" w:type="dxa"/>
+            <w:left w:w="108" w:type="dxa"/>
+            <w:bottom w:w="0" w:type="dxa"/>
+            <w:right w:w="108" w:type="dxa"/>
+          </w:tblCellMar>
+        </w:tblPrEx>
+        <w:trPr>
+          <w:trHeight w:val="272" w:hRule="atLeast"/>
+        </w:trPr>
+        <w:tc>
+          <w:tcPr>
+            <w:tcW w:w="3504" w:type="dxa"/>
+            <w:tcBorders>
+              <w:top w:val="dotted" w:color="auto" w:sz="4" w:space="0"/>
+              <w:bottom w:val="single" w:color="auto" w:sz="4" w:space="0"/>
+              <w:right w:val="dotted" w:color="auto" w:sz="4" w:space="0"/>
+            </w:tcBorders>
+            <w:vAlign w:val="center"/>
+          </w:tcPr>
+          <w:p>
+            <w:pPr>
+              <w:keepNext w:val="0"/>
+              <w:keepLines w:val="0"/>
+              <w:pageBreakBefore w:val="0"/>
+              <w:widowControl w:val="0"/>
+              <w:numPr>
+                <w:ilvl w:val="1"/>
+                <w:numId w:val="0"/>
+              </w:numPr>
+              <w:tabs>
+                <w:tab w:val="left" w:pos="601"/>
+              </w:tabs>
+              <w:kinsoku/>
+              <w:wordWrap/>
+              <w:overflowPunct/>
+              <w:topLinePunct w:val="0"/>
+              <w:autoSpaceDE/>
+              <w:autoSpaceDN/>
+              <w:bidi w:val="0"/>
+              <w:adjustRightInd/>
+              <w:snapToGrid/>
+              <w:spacing w:line="300" w:lineRule="auto"/>
+              <w:ind w:left="597" w:leftChars="0" w:hanging="597" w:hangingChars="283"/>
+              <w:jc w:val="left"/>
+              <w:textAlignment w:val="auto"/>
+              <w:rPr>
+                <w:b/>
+                <w:sz w:val="24"/>
+              </w:rPr>
+            </w:pPr>
+            <w:r>
+              <w:rPr>
+                <w:rFonts w:hint="default" w:ascii="Times New Roman" w:hAnsi="Times New Roman" w:eastAsia="宋体" w:cs="Times New Roman"/>
+                <w:b/>
+                <w:kern w:val="2"/>
+                <w:sz w:val="21"/>
+                <w:szCs w:val="21"/>
+                <w:lang w:val="en-US" w:eastAsia="zh-CN" w:bidi="ar-SA"/>
+              </w:rPr>
+              <w:t>12.3</w:t>
+            </w:r>
+            <w:r>
+              <w:rPr>
+                <w:rFonts w:hint="eastAsia" w:cs="Times New Roman"/>
+                <w:b/>
+                <w:kern w:val="2"/>
+                <w:sz w:val="21"/>
+                <w:szCs w:val="21"/>
+                <w:lang w:val="en-US" w:eastAsia="zh-CN" w:bidi="ar-SA"/>
+              </w:rPr>
+              <w:t xml:space="preserve">  </w:t>
+            </w:r>
+            <w:r>
+              <w:rPr>
+                <w:rFonts w:hint="eastAsia" w:hAnsi="Arial"/>
+                <w:b/>
+                <w:sz w:val="24"/>
+              </w:rPr>
+              <w:t>其他</w:t>
+            </w:r>
+            <w:r>
+              <w:rPr>
+                <w:rFonts w:hint="eastAsia" w:hAnsi="Arial"/>
+                <w:b/>
+                <w:sz w:val="24"/>
+                <w:lang w:val="en-US" w:eastAsia="zh-CN"/>
+              </w:rPr>
+              <w:t>不利的影响</w:t>
+            </w:r>
+            <w:r>
+              <w:rPr>
+                <w:rFonts w:hint="eastAsia" w:hAnsi="Arial"/>
+                <w:b/>
+                <w:sz w:val="24"/>
+              </w:rPr>
+              <w:t>：</w:t>
+            </w:r>
+          </w:p>
+        </w:tc>
+        <w:tc>
+          <w:tcPr>
+            <w:tcW w:w="6277" w:type="dxa"/>
+            <w:tcBorders>
+              <w:top w:val="dotted" w:color="auto" w:sz="4" w:space="0"/>
+              <w:left w:val="dotted" w:color="auto" w:sz="4" w:space="0"/>
+              <w:bottom w:val="single" w:color="auto" w:sz="4" w:space="0"/>
+            </w:tcBorders>
+            <w:vAlign w:val="center"/>
+          </w:tcPr>
+          <w:p>
+            <w:pPr>
+              <w:keepNext w:val="0"/>
+              <w:keepLines w:val="0"/>
+              <w:pageBreakBefore w:val="0"/>
+              <w:widowControl w:val="0"/>
+              <w:kinsoku/>
+              <w:wordWrap/>
+              <w:overflowPunct/>
+              <w:topLinePunct w:val="0"/>
+              <w:autoSpaceDE/>
+              <w:autoSpaceDN/>
+              <w:bidi w:val="0"/>
+              <w:adjustRightInd/>
+              <w:snapToGrid/>
+              <w:spacing w:line="300" w:lineRule="auto"/>
+              <w:ind w:left="1"/>
+              <w:jc w:val="left"/>
+              <w:textAlignment w:val="auto"/>
+              <w:rPr>
+                <w:sz w:val="24"/>
+              </w:rPr>
+            </w:pPr>
+            <w:r>
+              <w:rPr>
+                <w:rFonts w:hint="eastAsia" w:hAnsi="宋体" w:ascii="宋体" w:eastAsia="宋体" w:cs="宋体"/>
+                <w:sz w:val="24"/>
+                <w:lang w:val="en-US" w:eastAsia="zh-CN"/>
+                <w:szCs w:val="24"/>
+              </w:rPr>
+              <w:t>无数据资料。</w:t>
+            </w:r>
+          </w:p>
+        </w:tc>
+      </w:tr>
+    </w:tbl>
+    <w:p>
+      <w:pPr>
+        <w:spacing w:line="300" w:lineRule="auto"/>
+        <w:ind w:right="480"/>
+        <w:rPr>
+          <w:sz w:val="24"/>
+        </w:rPr>
+      </w:pPr>
+    </w:p>
+    <w:tbl>
+      <w:tblPr>
+        <w:tblStyle w:val="4"/>
+        <w:tblW w:w="9781" w:type="dxa"/>
+        <w:tblInd w:w="108" w:type="dxa"/>
+        <w:tblBorders>
+          <w:top w:val="single" w:color="auto" w:sz="4" w:space="0"/>
+          <w:left w:val="single" w:color="auto" w:sz="4" w:space="0"/>
+          <w:bottom w:val="single" w:color="auto" w:sz="4" w:space="0"/>
+          <w:right w:val="single" w:color="auto" w:sz="4" w:space="0"/>
+          <w:insideH w:val="none" w:color="auto" w:sz="0" w:space="0"/>
+          <w:insideV w:val="none" w:color="auto" w:sz="0" w:space="0"/>
+        </w:tblBorders>
+        <w:tblLayout w:type="fixed"/>
+        <w:tblCellMar>
+          <w:top w:w="0" w:type="dxa"/>
+          <w:left w:w="108" w:type="dxa"/>
+          <w:bottom w:w="0" w:type="dxa"/>
+          <w:right w:w="108" w:type="dxa"/>
+        </w:tblCellMar>
+      </w:tblPr>
+      <w:tblGrid>
+        <w:gridCol w:w="3504"/>
+        <w:gridCol w:w="6277"/>
+      </w:tblGrid>
+      <w:tr>
+        <w:tblPrEx>
+          <w:tblBorders>
+            <w:top w:val="single" w:color="auto" w:sz="4" w:space="0"/>
+            <w:left w:val="single" w:color="auto" w:sz="4" w:space="0"/>
+            <w:bottom w:val="single" w:color="auto" w:sz="4" w:space="0"/>
+            <w:right w:val="single" w:color="auto" w:sz="4" w:space="0"/>
+            <w:insideH w:val="none" w:color="auto" w:sz="0" w:space="0"/>
+            <w:insideV w:val="none" w:color="auto" w:sz="0" w:space="0"/>
+          </w:tblBorders>
+        </w:tblPrEx>
+        <w:trPr>
+          <w:tblHeader/>
+        </w:trPr>
+        <w:tc>
+          <w:tcPr>
+            <w:tcW w:w="9781" w:type="dxa"/>
+            <w:gridSpan w:val="2"/>
+            <w:tcBorders>
+              <w:top w:val="single" w:color="auto" w:sz="4" w:space="0"/>
+              <w:bottom w:val="single" w:color="auto" w:sz="4" w:space="0"/>
+            </w:tcBorders>
+            <w:shd w:val="clear" w:color="auto" w:fill="D9D9D9"/>
+          </w:tcPr>
+          <w:p>
+            <w:pPr>
+              <w:keepNext/>
+              <w:spacing w:line="300" w:lineRule="auto"/>
+              <w:ind w:right="480"/>
+              <w:rPr>
+                <w:b/>
+                <w:sz w:val="24"/>
+              </w:rPr>
+            </w:pPr>
+            <w:r>
+              <w:rPr>
+                <w:b/>
+                <w:sz w:val="24"/>
+              </w:rPr>
               <w:t xml:space="preserve">13. </w:t>
             </w:r>
             <w:r>
@@ -16813,7 +16854,7 @@
             <w:gridSpan w:val="2"/>
             <w:tcBorders>
               <w:top w:val="single" w:color="auto" w:sz="4" w:space="0"/>
-              <w:bottom w:val="single" w:color="auto" w:sz="4" w:space="0"/>
+              <w:bottom w:val="dotted" w:color="auto" w:sz="4" w:space="0"/>
             </w:tcBorders>
             <w:shd w:val="clear" w:color="auto" w:fill="D9D9D9"/>
           </w:tcPr>
@@ -16869,7 +16910,7 @@
           <w:tcPr>
             <w:tcW w:w="3504" w:type="dxa"/>
             <w:tcBorders>
-              <w:top w:val="single" w:color="auto" w:sz="4" w:space="0"/>
+              <w:top w:val="dotted" w:color="auto" w:sz="4" w:space="0"/>
               <w:bottom w:val="dotted" w:color="auto" w:sz="4" w:space="0"/>
               <w:right w:val="dotted" w:color="auto" w:sz="4" w:space="0"/>
             </w:tcBorders>
@@ -16942,7 +16983,7 @@
           <w:tcPr>
             <w:tcW w:w="6277" w:type="dxa"/>
             <w:tcBorders>
-              <w:top w:val="single" w:color="auto" w:sz="4" w:space="0"/>
+              <w:top w:val="dotted" w:color="auto" w:sz="4" w:space="0"/>
               <w:left w:val="dotted" w:color="auto" w:sz="4" w:space="0"/>
               <w:bottom w:val="dotted" w:color="auto" w:sz="4" w:space="0"/>
             </w:tcBorders>
@@ -17105,8 +17146,9 @@
               <w:jc w:val="left"/>
               <w:textAlignment w:val="auto"/>
               <w:rPr>
-                <w:b/>
-                <w:sz w:val="24"/>
+                <w:sz w:val="24"/>
+                <w:b w:val="0"/>
+                <w:bCs w:val="0"/>
               </w:rPr>
             </w:pPr>
             <w:r>
@@ -17243,8 +17285,9 @@
               <w:jc w:val="left"/>
               <w:textAlignment w:val="auto"/>
               <w:rPr>
-                <w:b/>
-                <w:sz w:val="24"/>
+                <w:sz w:val="24"/>
+                <w:b w:val="0"/>
+                <w:bCs w:val="0"/>
               </w:rPr>
             </w:pPr>
             <w:r>
@@ -17504,8 +17547,9 @@
               <w:jc w:val="left"/>
               <w:textAlignment w:val="auto"/>
               <w:rPr>
-                <w:b/>
-                <w:sz w:val="24"/>
+                <w:sz w:val="24"/>
+                <w:b w:val="0"/>
+                <w:bCs w:val="0"/>
               </w:rPr>
             </w:pPr>
             <w:r>
@@ -17515,678 +17559,6 @@
                 <w:szCs w:val="24"/>
               </w:rPr>
               <w:t>远离食物、酸和碱。</w:t>
-            </w:r>
-          </w:p>
-        </w:tc>
-      </w:tr>
-    </w:tbl>
-    <w:p>
-      <w:pPr>
-        <w:spacing w:line="300" w:lineRule="auto"/>
-        <w:ind w:right="480"/>
-        <w:rPr>
-          <w:sz w:val="24"/>
-        </w:rPr>
-      </w:pPr>
-    </w:p>
-    <w:tbl>
-      <w:tblPr>
-        <w:tblStyle w:val="4"/>
-        <w:tblW w:w="9781" w:type="dxa"/>
-        <w:tblInd w:w="108" w:type="dxa"/>
-        <w:tblBorders>
-          <w:top w:val="single" w:color="auto" w:sz="4" w:space="0"/>
-          <w:left w:val="single" w:color="auto" w:sz="4" w:space="0"/>
-          <w:bottom w:val="single" w:color="auto" w:sz="4" w:space="0"/>
-          <w:right w:val="single" w:color="auto" w:sz="4" w:space="0"/>
-          <w:insideH w:val="none" w:color="auto" w:sz="0" w:space="0"/>
-          <w:insideV w:val="none" w:color="auto" w:sz="0" w:space="0"/>
-        </w:tblBorders>
-        <w:tblLayout w:type="fixed"/>
-        <w:tblCellMar>
-          <w:top w:w="0" w:type="dxa"/>
-          <w:left w:w="108" w:type="dxa"/>
-          <w:bottom w:w="0" w:type="dxa"/>
-          <w:right w:w="108" w:type="dxa"/>
-        </w:tblCellMar>
-      </w:tblPr>
-      <w:tblGrid>
-        <w:gridCol w:w="9781"/>
-      </w:tblGrid>
-      <w:tr>
-        <w:tblPrEx>
-          <w:tblBorders>
-            <w:top w:val="single" w:color="auto" w:sz="4" w:space="0"/>
-            <w:left w:val="single" w:color="auto" w:sz="4" w:space="0"/>
-            <w:bottom w:val="single" w:color="auto" w:sz="4" w:space="0"/>
-            <w:right w:val="single" w:color="auto" w:sz="4" w:space="0"/>
-            <w:insideH w:val="none" w:color="auto" w:sz="0" w:space="0"/>
-            <w:insideV w:val="none" w:color="auto" w:sz="0" w:space="0"/>
-          </w:tblBorders>
-        </w:tblPrEx>
-        <w:trPr>
-          <w:tblHeader/>
-        </w:trPr>
-        <w:tc>
-          <w:tcPr>
-            <w:tcW w:w="9781" w:type="dxa"/>
-            <w:tcBorders>
-              <w:bottom w:val="single" w:color="auto" w:sz="4" w:space="0"/>
-              <w:tl2br w:val="nil"/>
-              <w:tr2bl w:val="nil"/>
-            </w:tcBorders>
-            <w:shd w:val="clear" w:color="auto" w:fill="D9D9D9"/>
-          </w:tcPr>
-          <w:p>
-            <w:pPr>
-              <w:keepNext/>
-              <w:spacing w:line="300" w:lineRule="auto"/>
-              <w:ind w:right="480"/>
-              <w:rPr>
-                <w:b/>
-                <w:sz w:val="24"/>
-              </w:rPr>
-            </w:pPr>
-            <w:r>
-              <w:rPr>
-                <w:b/>
-                <w:sz w:val="24"/>
-              </w:rPr>
-              <w:t xml:space="preserve">15. </w:t>
-            </w:r>
-            <w:r>
-              <w:rPr>
-                <w:rFonts w:hint="eastAsia"/>
-                <w:b/>
-                <w:sz w:val="24"/>
-              </w:rPr>
-              <w:t>法规信息</w:t>
-            </w:r>
-          </w:p>
-        </w:tc>
-      </w:tr>
-      <w:tr>
-        <w:tblPrEx>
-          <w:tblBorders>
-            <w:top w:val="single" w:color="auto" w:sz="4" w:space="0"/>
-            <w:left w:val="single" w:color="auto" w:sz="4" w:space="0"/>
-            <w:bottom w:val="single" w:color="auto" w:sz="4" w:space="0"/>
-            <w:right w:val="single" w:color="auto" w:sz="4" w:space="0"/>
-            <w:insideH w:val="none" w:color="auto" w:sz="0" w:space="0"/>
-            <w:insideV w:val="none" w:color="auto" w:sz="0" w:space="0"/>
-          </w:tblBorders>
-        </w:tblPrEx>
-        <w:trPr>
-          <w:trHeight w:val="240" w:hRule="atLeast"/>
-        </w:trPr>
-        <w:tc>
-          <w:tcPr>
-            <w:tcW w:w="9781" w:type="dxa"/>
-            <w:tcBorders>
-              <w:top w:val="single" w:color="auto" w:sz="4" w:space="0"/>
-              <w:bottom w:val="dotted" w:color="auto" w:sz="4" w:space="0"/>
-            </w:tcBorders>
-            <w:vAlign w:val="center"/>
-          </w:tcPr>
-          <w:p>
-            <w:pPr>
-              <w:keepNext w:val="0"/>
-              <w:keepLines w:val="0"/>
-              <w:pageBreakBefore w:val="0"/>
-              <w:widowControl w:val="0"/>
-              <w:kinsoku/>
-              <w:wordWrap/>
-              <w:overflowPunct/>
-              <w:topLinePunct w:val="0"/>
-              <w:autoSpaceDE w:val="0"/>
-              <w:autoSpaceDN w:val="0"/>
-              <w:bidi w:val="0"/>
-              <w:adjustRightInd w:val="0"/>
-              <w:snapToGrid/>
-              <w:spacing w:line="300" w:lineRule="auto"/>
-              <w:jc w:val="left"/>
-              <w:textAlignment w:val="auto"/>
-              <w:rPr>
-                <w:rFonts w:cs="Arial"/>
-                <w:bCs/>
-                <w:kern w:val="0"/>
-                <w:sz w:val="24"/>
-              </w:rPr>
-            </w:pPr>
-            <w:r>
-              <w:rPr>
-                <w:rFonts w:hint="eastAsia" w:cs="宋体" w:ascii="宋体" w:hAnsi="宋体" w:eastAsia="宋体"/>
-                <w:bCs/>
-                <w:kern w:val="0"/>
-                <w:sz w:val="24"/>
-                <w:szCs w:val="24"/>
-              </w:rPr>
-              <w:t>物质或混合物的相关安全、健康和环保法律法规</w:t>
-            </w:r>
-          </w:p>
-        </w:tc>
-      </w:tr>
-      <w:tr>
-        <w:tblPrEx>
-          <w:tblBorders>
-            <w:top w:val="single" w:color="auto" w:sz="4" w:space="0"/>
-            <w:left w:val="single" w:color="auto" w:sz="4" w:space="0"/>
-            <w:bottom w:val="single" w:color="auto" w:sz="4" w:space="0"/>
-            <w:right w:val="single" w:color="auto" w:sz="4" w:space="0"/>
-            <w:insideH w:val="none" w:color="auto" w:sz="0" w:space="0"/>
-            <w:insideV w:val="none" w:color="auto" w:sz="0" w:space="0"/>
-          </w:tblBorders>
-          <w:tblCellMar>
-            <w:top w:w="0" w:type="dxa"/>
-            <w:left w:w="108" w:type="dxa"/>
-            <w:bottom w:w="0" w:type="dxa"/>
-            <w:right w:w="108" w:type="dxa"/>
-          </w:tblCellMar>
-        </w:tblPrEx>
-        <w:trPr>
-          <w:trHeight w:val="201" w:hRule="atLeast"/>
-        </w:trPr>
-        <w:tc>
-          <w:tcPr>
-            <w:tcW w:w="9781" w:type="dxa"/>
-            <w:tcBorders>
-              <w:top w:val="dotted" w:color="auto" w:sz="4" w:space="0"/>
-              <w:bottom w:val="dotted" w:color="auto" w:sz="4" w:space="0"/>
-            </w:tcBorders>
-            <w:vAlign w:val="center"/>
-          </w:tcPr>
-          <w:p>
-            <w:pPr>
-              <w:keepNext w:val="0"/>
-              <w:keepLines w:val="0"/>
-              <w:pageBreakBefore w:val="0"/>
-              <w:widowControl w:val="0"/>
-              <w:kinsoku/>
-              <w:wordWrap/>
-              <w:overflowPunct/>
-              <w:topLinePunct w:val="0"/>
-              <w:autoSpaceDE w:val="0"/>
-              <w:autoSpaceDN w:val="0"/>
-              <w:bidi w:val="0"/>
-              <w:adjustRightInd w:val="0"/>
-              <w:snapToGrid/>
-              <w:spacing w:line="300" w:lineRule="auto"/>
-              <w:jc w:val="left"/>
-              <w:textAlignment w:val="auto"/>
-              <w:rPr>
-                <w:rFonts w:cs="Arial"/>
-                <w:b/>
-                <w:bCs/>
-                <w:kern w:val="0"/>
-                <w:sz w:val="24"/>
-              </w:rPr>
-            </w:pPr>
-            <w:r>
-              <w:rPr>
-                <w:rFonts w:hint="eastAsia" w:cs="Arial"/>
-                <w:b/>
-                <w:bCs/>
-                <w:kern w:val="0"/>
-                <w:sz w:val="24"/>
-              </w:rPr>
-              <w:t>其它的规定：</w:t>
-            </w:r>
-          </w:p>
-        </w:tc>
-      </w:tr>
-      <w:tr>
-        <w:tblPrEx>
-          <w:tblBorders>
-            <w:top w:val="single" w:color="auto" w:sz="4" w:space="0"/>
-            <w:left w:val="single" w:color="auto" w:sz="4" w:space="0"/>
-            <w:bottom w:val="single" w:color="auto" w:sz="4" w:space="0"/>
-            <w:right w:val="single" w:color="auto" w:sz="4" w:space="0"/>
-            <w:insideH w:val="none" w:color="auto" w:sz="0" w:space="0"/>
-            <w:insideV w:val="none" w:color="auto" w:sz="0" w:space="0"/>
-          </w:tblBorders>
-          <w:tblCellMar>
-            <w:top w:w="0" w:type="dxa"/>
-            <w:left w:w="108" w:type="dxa"/>
-            <w:bottom w:w="0" w:type="dxa"/>
-            <w:right w:w="108" w:type="dxa"/>
-          </w:tblCellMar>
-        </w:tblPrEx>
-        <w:trPr>
-          <w:trHeight w:val="271" w:hRule="atLeast"/>
-        </w:trPr>
-        <w:tc>
-          <w:tcPr>
-            <w:tcW w:w="9781" w:type="dxa"/>
-            <w:tcBorders>
-              <w:top w:val="dotted" w:color="auto" w:sz="4" w:space="0"/>
-              <w:bottom w:val="dotted" w:color="auto" w:sz="4" w:space="0"/>
-            </w:tcBorders>
-            <w:vAlign w:val="center"/>
-          </w:tcPr>
-          <w:p>
-            <w:pPr>
-              <w:keepNext w:val="0"/>
-              <w:keepLines w:val="0"/>
-              <w:pageBreakBefore w:val="0"/>
-              <w:widowControl w:val="0"/>
-              <w:kinsoku/>
-              <w:wordWrap/>
-              <w:overflowPunct/>
-              <w:topLinePunct w:val="0"/>
-              <w:autoSpaceDE w:val="0"/>
-              <w:autoSpaceDN w:val="0"/>
-              <w:bidi w:val="0"/>
-              <w:adjustRightInd w:val="0"/>
-              <w:snapToGrid/>
-              <w:spacing w:line="300" w:lineRule="auto"/>
-              <w:jc w:val="left"/>
-              <w:textAlignment w:val="auto"/>
-              <w:rPr>
-                <w:rFonts w:cs="Arial"/>
-                <w:b/>
-                <w:bCs/>
-                <w:kern w:val="0"/>
-                <w:sz w:val="24"/>
-              </w:rPr>
-            </w:pPr>
-            <w:r>
-              <w:rPr>
-                <w:rFonts w:hint="eastAsia" w:cs="Arial"/>
-                <w:b/>
-                <w:bCs/>
-                <w:kern w:val="0"/>
-                <w:sz w:val="24"/>
-              </w:rPr>
-              <w:t>符合下列法规要求：</w:t>
-            </w:r>
-          </w:p>
-        </w:tc>
-      </w:tr>
-      <w:tr>
-        <w:tblPrEx>
-          <w:tblBorders>
-            <w:top w:val="single" w:color="auto" w:sz="4" w:space="0"/>
-            <w:left w:val="single" w:color="auto" w:sz="4" w:space="0"/>
-            <w:bottom w:val="single" w:color="auto" w:sz="4" w:space="0"/>
-            <w:right w:val="single" w:color="auto" w:sz="4" w:space="0"/>
-            <w:insideH w:val="none" w:color="auto" w:sz="0" w:space="0"/>
-            <w:insideV w:val="none" w:color="auto" w:sz="0" w:space="0"/>
-          </w:tblBorders>
-          <w:tblCellMar>
-            <w:top w:w="0" w:type="dxa"/>
-            <w:left w:w="108" w:type="dxa"/>
-            <w:bottom w:w="0" w:type="dxa"/>
-            <w:right w:w="108" w:type="dxa"/>
-          </w:tblCellMar>
-        </w:tblPrEx>
-        <w:trPr>
-          <w:trHeight w:val="258" w:hRule="atLeast"/>
-        </w:trPr>
-        <w:tc>
-          <w:tcPr>
-            <w:tcW w:w="9781" w:type="dxa"/>
-            <w:tcBorders>
-              <w:top w:val="dotted" w:color="auto" w:sz="4" w:space="0"/>
-              <w:bottom w:val="dotted" w:color="auto" w:sz="4" w:space="0"/>
-            </w:tcBorders>
-            <w:vAlign w:val="center"/>
-          </w:tcPr>
-          <w:p>
-            <w:pPr>
-              <w:keepNext w:val="0"/>
-              <w:keepLines w:val="0"/>
-              <w:pageBreakBefore w:val="0"/>
-              <w:widowControl w:val="0"/>
-              <w:kinsoku/>
-              <w:wordWrap/>
-              <w:overflowPunct/>
-              <w:topLinePunct w:val="0"/>
-              <w:autoSpaceDE w:val="0"/>
-              <w:autoSpaceDN w:val="0"/>
-              <w:bidi w:val="0"/>
-              <w:adjustRightInd w:val="0"/>
-              <w:snapToGrid/>
-              <w:spacing w:line="300" w:lineRule="auto"/>
-              <w:jc w:val="left"/>
-              <w:textAlignment w:val="auto"/>
-              <w:rPr>
-                <w:rFonts w:cs="Arial"/>
-                <w:bCs/>
-                <w:kern w:val="0"/>
-                <w:sz w:val="24"/>
-              </w:rPr>
-            </w:pPr>
-            <w:r>
-              <w:rPr>
-                <w:rFonts w:hint="eastAsia" w:cs="宋体" w:ascii="宋体" w:hAnsi="宋体" w:eastAsia="宋体"/>
-                <w:bCs/>
-                <w:kern w:val="0"/>
-                <w:sz w:val="24"/>
-                <w:szCs w:val="24"/>
-              </w:rPr>
-              <w:t>危险化学品安全管理条例，国务院令</w:t>
-            </w:r>
-            <w:r>
-              <w:rPr>
-                <w:rFonts w:hint="eastAsia" w:cs="宋体" w:ascii="宋体" w:hAnsi="宋体" w:eastAsia="宋体"/>
-                <w:bCs/>
-                <w:kern w:val="0"/>
-                <w:sz w:val="24"/>
-                <w:lang w:val="en-US" w:eastAsia="zh-CN"/>
-                <w:szCs w:val="24"/>
-              </w:rPr>
-              <w:t>591</w:t>
-            </w:r>
-            <w:r>
-              <w:rPr>
-                <w:rFonts w:hint="eastAsia" w:cs="宋体" w:ascii="宋体" w:hAnsi="宋体" w:eastAsia="宋体"/>
-                <w:bCs/>
-                <w:kern w:val="0"/>
-                <w:sz w:val="24"/>
-                <w:szCs w:val="24"/>
-              </w:rPr>
-              <w:t>号</w:t>
-            </w:r>
-          </w:p>
-        </w:tc>
-      </w:tr>
-      <w:tr>
-        <w:tblPrEx>
-          <w:tblBorders>
-            <w:top w:val="single" w:color="auto" w:sz="4" w:space="0"/>
-            <w:left w:val="single" w:color="auto" w:sz="4" w:space="0"/>
-            <w:bottom w:val="single" w:color="auto" w:sz="4" w:space="0"/>
-            <w:right w:val="single" w:color="auto" w:sz="4" w:space="0"/>
-            <w:insideH w:val="none" w:color="auto" w:sz="0" w:space="0"/>
-            <w:insideV w:val="none" w:color="auto" w:sz="0" w:space="0"/>
-          </w:tblBorders>
-          <w:tblCellMar>
-            <w:top w:w="0" w:type="dxa"/>
-            <w:left w:w="108" w:type="dxa"/>
-            <w:bottom w:w="0" w:type="dxa"/>
-            <w:right w:w="108" w:type="dxa"/>
-          </w:tblCellMar>
-        </w:tblPrEx>
-        <w:trPr>
-          <w:trHeight w:val="258" w:hRule="atLeast"/>
-        </w:trPr>
-        <w:tc>
-          <w:tcPr>
-            <w:tcW w:w="9781" w:type="dxa"/>
-            <w:tcBorders>
-              <w:top w:val="dotted" w:color="auto" w:sz="4" w:space="0"/>
-              <w:bottom w:val="dotted" w:color="auto" w:sz="4" w:space="0"/>
-            </w:tcBorders>
-            <w:vAlign w:val="center"/>
-          </w:tcPr>
-          <w:p>
-            <w:pPr>
-              <w:keepNext w:val="0"/>
-              <w:keepLines w:val="0"/>
-              <w:pageBreakBefore w:val="0"/>
-              <w:widowControl w:val="0"/>
-              <w:kinsoku/>
-              <w:wordWrap/>
-              <w:overflowPunct/>
-              <w:topLinePunct w:val="0"/>
-              <w:autoSpaceDE w:val="0"/>
-              <w:autoSpaceDN w:val="0"/>
-              <w:bidi w:val="0"/>
-              <w:adjustRightInd w:val="0"/>
-              <w:snapToGrid/>
-              <w:spacing w:line="300" w:lineRule="auto"/>
-              <w:jc w:val="left"/>
-              <w:textAlignment w:val="auto"/>
-              <w:rPr>
-                <w:rFonts w:cs="Arial"/>
-                <w:bCs/>
-                <w:kern w:val="0"/>
-                <w:sz w:val="24"/>
-              </w:rPr>
-            </w:pPr>
-            <w:r>
-              <w:rPr>
-                <w:rFonts w:cs="宋体" w:ascii="宋体" w:hAnsi="宋体" w:eastAsia="宋体"/>
-                <w:bCs/>
-                <w:kern w:val="0"/>
-                <w:sz w:val="24"/>
-                <w:szCs w:val="24"/>
-              </w:rPr>
-              <w:t xml:space="preserve">GB/T 16483 </w:t>
-            </w:r>
-            <w:r>
-              <w:rPr>
-                <w:rFonts w:hint="eastAsia" w:cs="宋体" w:ascii="宋体" w:hAnsi="宋体" w:eastAsia="宋体"/>
-                <w:bCs/>
-                <w:kern w:val="0"/>
-                <w:sz w:val="24"/>
-                <w:szCs w:val="24"/>
-              </w:rPr>
-              <w:t>化学品安全技术说明书内容和项目顺序</w:t>
-            </w:r>
-          </w:p>
-        </w:tc>
-      </w:tr>
-      <w:tr>
-        <w:tblPrEx>
-          <w:tblBorders>
-            <w:top w:val="single" w:color="auto" w:sz="4" w:space="0"/>
-            <w:left w:val="single" w:color="auto" w:sz="4" w:space="0"/>
-            <w:bottom w:val="single" w:color="auto" w:sz="4" w:space="0"/>
-            <w:right w:val="single" w:color="auto" w:sz="4" w:space="0"/>
-            <w:insideH w:val="none" w:color="auto" w:sz="0" w:space="0"/>
-            <w:insideV w:val="none" w:color="auto" w:sz="0" w:space="0"/>
-          </w:tblBorders>
-          <w:tblCellMar>
-            <w:top w:w="0" w:type="dxa"/>
-            <w:left w:w="108" w:type="dxa"/>
-            <w:bottom w:w="0" w:type="dxa"/>
-            <w:right w:w="108" w:type="dxa"/>
-          </w:tblCellMar>
-        </w:tblPrEx>
-        <w:trPr>
-          <w:trHeight w:val="258" w:hRule="atLeast"/>
-        </w:trPr>
-        <w:tc>
-          <w:tcPr>
-            <w:tcW w:w="9781" w:type="dxa"/>
-            <w:tcBorders>
-              <w:top w:val="dotted" w:color="auto" w:sz="4" w:space="0"/>
-              <w:bottom w:val="dotted" w:color="auto" w:sz="4" w:space="0"/>
-            </w:tcBorders>
-            <w:vAlign w:val="center"/>
-          </w:tcPr>
-          <w:p>
-            <w:pPr>
-              <w:keepNext w:val="0"/>
-              <w:keepLines w:val="0"/>
-              <w:pageBreakBefore w:val="0"/>
-              <w:widowControl w:val="0"/>
-              <w:kinsoku/>
-              <w:wordWrap/>
-              <w:overflowPunct/>
-              <w:topLinePunct w:val="0"/>
-              <w:autoSpaceDE w:val="0"/>
-              <w:autoSpaceDN w:val="0"/>
-              <w:bidi w:val="0"/>
-              <w:adjustRightInd w:val="0"/>
-              <w:snapToGrid/>
-              <w:spacing w:line="300" w:lineRule="auto"/>
-              <w:jc w:val="left"/>
-              <w:textAlignment w:val="auto"/>
-              <w:rPr>
-                <w:rFonts w:cs="Arial"/>
-                <w:bCs/>
-                <w:kern w:val="0"/>
-                <w:sz w:val="24"/>
-              </w:rPr>
-            </w:pPr>
-            <w:r>
-              <w:rPr>
-                <w:rFonts w:cs="宋体" w:ascii="宋体" w:hAnsi="宋体" w:eastAsia="宋体"/>
-                <w:bCs/>
-                <w:kern w:val="0"/>
-                <w:sz w:val="24"/>
-                <w:szCs w:val="24"/>
-              </w:rPr>
-              <w:t xml:space="preserve">GB 13690 </w:t>
-            </w:r>
-            <w:r>
-              <w:rPr>
-                <w:rFonts w:hint="eastAsia" w:cs="宋体" w:ascii="宋体" w:hAnsi="宋体" w:eastAsia="宋体"/>
-                <w:bCs/>
-                <w:kern w:val="0"/>
-                <w:sz w:val="24"/>
-                <w:szCs w:val="24"/>
-              </w:rPr>
-              <w:t>化学品分类和危险性公示通则</w:t>
-            </w:r>
-          </w:p>
-        </w:tc>
-      </w:tr>
-      <w:tr>
-        <w:tblPrEx>
-          <w:tblBorders>
-            <w:top w:val="single" w:color="auto" w:sz="4" w:space="0"/>
-            <w:left w:val="single" w:color="auto" w:sz="4" w:space="0"/>
-            <w:bottom w:val="single" w:color="auto" w:sz="4" w:space="0"/>
-            <w:right w:val="single" w:color="auto" w:sz="4" w:space="0"/>
-            <w:insideH w:val="none" w:color="auto" w:sz="0" w:space="0"/>
-            <w:insideV w:val="none" w:color="auto" w:sz="0" w:space="0"/>
-          </w:tblBorders>
-          <w:tblCellMar>
-            <w:top w:w="0" w:type="dxa"/>
-            <w:left w:w="108" w:type="dxa"/>
-            <w:bottom w:w="0" w:type="dxa"/>
-            <w:right w:w="108" w:type="dxa"/>
-          </w:tblCellMar>
-        </w:tblPrEx>
-        <w:trPr>
-          <w:trHeight w:val="258" w:hRule="atLeast"/>
-        </w:trPr>
-        <w:tc>
-          <w:tcPr>
-            <w:tcW w:w="9781" w:type="dxa"/>
-            <w:tcBorders>
-              <w:top w:val="dotted" w:color="auto" w:sz="4" w:space="0"/>
-              <w:bottom w:val="dotted" w:color="auto" w:sz="4" w:space="0"/>
-            </w:tcBorders>
-            <w:vAlign w:val="center"/>
-          </w:tcPr>
-          <w:p>
-            <w:pPr>
-              <w:keepNext w:val="0"/>
-              <w:keepLines w:val="0"/>
-              <w:pageBreakBefore w:val="0"/>
-              <w:widowControl w:val="0"/>
-              <w:kinsoku/>
-              <w:wordWrap/>
-              <w:overflowPunct/>
-              <w:topLinePunct w:val="0"/>
-              <w:autoSpaceDE w:val="0"/>
-              <w:autoSpaceDN w:val="0"/>
-              <w:bidi w:val="0"/>
-              <w:adjustRightInd w:val="0"/>
-              <w:snapToGrid/>
-              <w:spacing w:line="300" w:lineRule="auto"/>
-              <w:jc w:val="left"/>
-              <w:textAlignment w:val="auto"/>
-              <w:rPr>
-                <w:rFonts w:hint="default" w:eastAsia="宋体" w:cs="Arial"/>
-                <w:bCs/>
-                <w:kern w:val="0"/>
-                <w:sz w:val="24"/>
-                <w:lang w:val="en-US" w:eastAsia="zh-CN"/>
-              </w:rPr>
-            </w:pPr>
-            <w:r>
-              <w:rPr>
-                <w:rFonts w:cs="宋体" w:ascii="宋体" w:hAnsi="宋体" w:eastAsia="宋体"/>
-                <w:bCs/>
-                <w:kern w:val="0"/>
-                <w:sz w:val="24"/>
-                <w:szCs w:val="24"/>
-              </w:rPr>
-              <w:t xml:space="preserve">GB </w:t>
-            </w:r>
-            <w:r>
-              <w:rPr>
-                <w:rFonts w:hint="eastAsia" w:cs="宋体" w:ascii="宋体" w:hAnsi="宋体" w:eastAsia="宋体"/>
-                <w:bCs/>
-                <w:kern w:val="0"/>
-                <w:sz w:val="24"/>
-                <w:lang w:val="en-US" w:eastAsia="zh-CN"/>
-                <w:szCs w:val="24"/>
-              </w:rPr>
-              <w:t>30000.2-29 化学品分类和标签规范</w:t>
-            </w:r>
-          </w:p>
-        </w:tc>
-      </w:tr>
-      <w:tr>
-        <w:tblPrEx>
-          <w:tblBorders>
-            <w:top w:val="single" w:color="auto" w:sz="4" w:space="0"/>
-            <w:left w:val="single" w:color="auto" w:sz="4" w:space="0"/>
-            <w:bottom w:val="single" w:color="auto" w:sz="4" w:space="0"/>
-            <w:right w:val="single" w:color="auto" w:sz="4" w:space="0"/>
-            <w:insideH w:val="none" w:color="auto" w:sz="0" w:space="0"/>
-            <w:insideV w:val="none" w:color="auto" w:sz="0" w:space="0"/>
-          </w:tblBorders>
-          <w:tblCellMar>
-            <w:top w:w="0" w:type="dxa"/>
-            <w:left w:w="108" w:type="dxa"/>
-            <w:bottom w:w="0" w:type="dxa"/>
-            <w:right w:w="108" w:type="dxa"/>
-          </w:tblCellMar>
-        </w:tblPrEx>
-        <w:trPr>
-          <w:trHeight w:val="258" w:hRule="atLeast"/>
-        </w:trPr>
-        <w:tc>
-          <w:tcPr>
-            <w:tcW w:w="9781" w:type="dxa"/>
-            <w:tcBorders>
-              <w:top w:val="dotted" w:color="auto" w:sz="4" w:space="0"/>
-            </w:tcBorders>
-            <w:vAlign w:val="center"/>
-          </w:tcPr>
-          <w:p>
-            <w:pPr>
-              <w:keepNext w:val="0"/>
-              <w:keepLines w:val="0"/>
-              <w:pageBreakBefore w:val="0"/>
-              <w:widowControl w:val="0"/>
-              <w:kinsoku/>
-              <w:wordWrap/>
-              <w:overflowPunct/>
-              <w:topLinePunct w:val="0"/>
-              <w:autoSpaceDE w:val="0"/>
-              <w:autoSpaceDN w:val="0"/>
-              <w:bidi w:val="0"/>
-              <w:adjustRightInd w:val="0"/>
-              <w:snapToGrid/>
-              <w:spacing w:line="300" w:lineRule="auto"/>
-              <w:jc w:val="left"/>
-              <w:textAlignment w:val="auto"/>
-              <w:rPr>
-                <w:rFonts w:hint="default" w:eastAsia="宋体" w:cs="Arial"/>
-                <w:bCs/>
-                <w:kern w:val="0"/>
-                <w:sz w:val="24"/>
-                <w:lang w:val="en-US" w:eastAsia="zh-CN"/>
-              </w:rPr>
-            </w:pPr>
-            <w:r>
-              <w:rPr>
-                <w:rFonts w:hint="eastAsia" w:cs="宋体" w:ascii="宋体" w:hAnsi="宋体" w:eastAsia="宋体"/>
-                <w:bCs/>
-                <w:kern w:val="0"/>
-                <w:sz w:val="24"/>
-                <w:lang w:val="en-US" w:eastAsia="zh-CN"/>
-                <w:szCs w:val="24"/>
-              </w:rPr>
-              <w:t>GB 15258 化学品安全标签编写规定</w:t>
             </w:r>
           </w:p>
         </w:tc>
@@ -18249,11 +17621,11 @@
           <w:tcPr>
             <w:tcW w:w="9781" w:type="dxa"/>
             <w:tcBorders>
-              <w:top w:val="single" w:color="auto" w:sz="4" w:space="0"/>
               <w:bottom w:val="single" w:color="auto" w:sz="4" w:space="0"/>
+              <w:tl2br w:val="nil"/>
+              <w:tr2bl w:val="nil"/>
             </w:tcBorders>
             <w:shd w:val="clear" w:color="auto" w:fill="D9D9D9"/>
-            <w:vAlign w:val="top"/>
           </w:tcPr>
           <w:p>
             <w:pPr>
@@ -18270,7 +17642,7 @@
                 <w:b/>
                 <w:sz w:val="24"/>
               </w:rPr>
-              <w:t xml:space="preserve">16. </w:t>
+              <w:t xml:space="preserve">15. </w:t>
             </w:r>
             <w:r>
               <w:rPr>
@@ -18278,7 +17650,7 @@
                 <w:b/>
                 <w:sz w:val="24"/>
               </w:rPr>
-              <w:t>其他信息</w:t>
+              <w:t>法规信息</w:t>
             </w:r>
           </w:p>
         </w:tc>
@@ -18300,6 +17672,698 @@
             <w:right w:w="108" w:type="dxa"/>
           </w:tblCellMar>
         </w:tblPrEx>
+        <w:trPr>
+          <w:trHeight w:val="240" w:hRule="atLeast"/>
+        </w:trPr>
+        <w:tc>
+          <w:tcPr>
+            <w:tcW w:w="9781" w:type="dxa"/>
+            <w:tcBorders>
+              <w:top w:val="single" w:color="auto" w:sz="4" w:space="0"/>
+              <w:bottom w:val="dotted" w:color="auto" w:sz="4" w:space="0"/>
+            </w:tcBorders>
+            <w:vAlign w:val="center"/>
+          </w:tcPr>
+          <w:p>
+            <w:pPr>
+              <w:keepNext w:val="0"/>
+              <w:keepLines w:val="0"/>
+              <w:pageBreakBefore w:val="0"/>
+              <w:widowControl w:val="0"/>
+              <w:kinsoku/>
+              <w:wordWrap/>
+              <w:overflowPunct/>
+              <w:topLinePunct w:val="0"/>
+              <w:autoSpaceDE w:val="0"/>
+              <w:autoSpaceDN w:val="0"/>
+              <w:bidi w:val="0"/>
+              <w:adjustRightInd w:val="0"/>
+              <w:snapToGrid/>
+              <w:spacing w:line="300" w:lineRule="auto"/>
+              <w:jc w:val="left"/>
+              <w:textAlignment w:val="auto"/>
+              <w:rPr>
+                <w:rFonts w:cs="Arial"/>
+                <w:kern w:val="0"/>
+                <w:sz w:val="24"/>
+                <w:b w:val="0"/>
+                <w:bCs w:val="0"/>
+              </w:rPr>
+            </w:pPr>
+            <w:bookmarkStart w:id="0" w:name="_GoBack" w:colFirst="0" w:colLast="0"/>
+            <w:r>
+              <w:rPr>
+                <w:rFonts w:hint="eastAsia" w:cs="宋体" w:ascii="宋体" w:hAnsi="宋体" w:eastAsia="宋体"/>
+                <w:bCs/>
+                <w:kern w:val="0"/>
+                <w:sz w:val="24"/>
+                <w:szCs w:val="24"/>
+              </w:rPr>
+              <w:t>物质或混合物的相关安全、健康和环保法律法规</w:t>
+            </w:r>
+          </w:p>
+        </w:tc>
+      </w:tr>
+      <w:tr>
+        <w:tblPrEx>
+          <w:tblBorders>
+            <w:top w:val="single" w:color="auto" w:sz="4" w:space="0"/>
+            <w:left w:val="single" w:color="auto" w:sz="4" w:space="0"/>
+            <w:bottom w:val="single" w:color="auto" w:sz="4" w:space="0"/>
+            <w:right w:val="single" w:color="auto" w:sz="4" w:space="0"/>
+            <w:insideH w:val="none" w:color="auto" w:sz="0" w:space="0"/>
+            <w:insideV w:val="none" w:color="auto" w:sz="0" w:space="0"/>
+          </w:tblBorders>
+          <w:tblCellMar>
+            <w:top w:w="0" w:type="dxa"/>
+            <w:left w:w="108" w:type="dxa"/>
+            <w:bottom w:w="0" w:type="dxa"/>
+            <w:right w:w="108" w:type="dxa"/>
+          </w:tblCellMar>
+        </w:tblPrEx>
+        <w:trPr>
+          <w:trHeight w:val="201" w:hRule="atLeast"/>
+        </w:trPr>
+        <w:tc>
+          <w:tcPr>
+            <w:tcW w:w="9781" w:type="dxa"/>
+            <w:tcBorders>
+              <w:top w:val="dotted" w:color="auto" w:sz="4" w:space="0"/>
+              <w:bottom w:val="dotted" w:color="auto" w:sz="4" w:space="0"/>
+            </w:tcBorders>
+            <w:vAlign w:val="center"/>
+          </w:tcPr>
+          <w:p>
+            <w:pPr>
+              <w:keepNext w:val="0"/>
+              <w:keepLines w:val="0"/>
+              <w:pageBreakBefore w:val="0"/>
+              <w:widowControl w:val="0"/>
+              <w:kinsoku/>
+              <w:wordWrap/>
+              <w:overflowPunct/>
+              <w:topLinePunct w:val="0"/>
+              <w:autoSpaceDE w:val="0"/>
+              <w:autoSpaceDN w:val="0"/>
+              <w:bidi w:val="0"/>
+              <w:adjustRightInd w:val="0"/>
+              <w:snapToGrid/>
+              <w:spacing w:line="300" w:lineRule="auto"/>
+              <w:jc w:val="left"/>
+              <w:textAlignment w:val="auto"/>
+              <w:rPr>
+                <w:rFonts w:cs="Arial"/>
+                <w:b/>
+                <w:bCs/>
+                <w:kern w:val="0"/>
+                <w:sz w:val="24"/>
+              </w:rPr>
+            </w:pPr>
+            <w:r>
+              <w:rPr>
+                <w:rFonts w:hint="eastAsia" w:cs="Arial"/>
+                <w:b/>
+                <w:bCs/>
+                <w:kern w:val="0"/>
+                <w:sz w:val="24"/>
+              </w:rPr>
+              <w:t>其它的规定：</w:t>
+            </w:r>
+          </w:p>
+        </w:tc>
+      </w:tr>
+      <w:tr>
+        <w:tblPrEx>
+          <w:tblBorders>
+            <w:top w:val="single" w:color="auto" w:sz="4" w:space="0"/>
+            <w:left w:val="single" w:color="auto" w:sz="4" w:space="0"/>
+            <w:bottom w:val="single" w:color="auto" w:sz="4" w:space="0"/>
+            <w:right w:val="single" w:color="auto" w:sz="4" w:space="0"/>
+            <w:insideH w:val="none" w:color="auto" w:sz="0" w:space="0"/>
+            <w:insideV w:val="none" w:color="auto" w:sz="0" w:space="0"/>
+          </w:tblBorders>
+          <w:tblCellMar>
+            <w:top w:w="0" w:type="dxa"/>
+            <w:left w:w="108" w:type="dxa"/>
+            <w:bottom w:w="0" w:type="dxa"/>
+            <w:right w:w="108" w:type="dxa"/>
+          </w:tblCellMar>
+        </w:tblPrEx>
+        <w:trPr>
+          <w:trHeight w:val="271" w:hRule="atLeast"/>
+        </w:trPr>
+        <w:tc>
+          <w:tcPr>
+            <w:tcW w:w="9781" w:type="dxa"/>
+            <w:tcBorders>
+              <w:top w:val="dotted" w:color="auto" w:sz="4" w:space="0"/>
+              <w:bottom w:val="dotted" w:color="auto" w:sz="4" w:space="0"/>
+            </w:tcBorders>
+            <w:vAlign w:val="center"/>
+          </w:tcPr>
+          <w:p>
+            <w:pPr>
+              <w:keepNext w:val="0"/>
+              <w:keepLines w:val="0"/>
+              <w:pageBreakBefore w:val="0"/>
+              <w:widowControl w:val="0"/>
+              <w:kinsoku/>
+              <w:wordWrap/>
+              <w:overflowPunct/>
+              <w:topLinePunct w:val="0"/>
+              <w:autoSpaceDE w:val="0"/>
+              <w:autoSpaceDN w:val="0"/>
+              <w:bidi w:val="0"/>
+              <w:adjustRightInd w:val="0"/>
+              <w:snapToGrid/>
+              <w:spacing w:line="300" w:lineRule="auto"/>
+              <w:jc w:val="left"/>
+              <w:textAlignment w:val="auto"/>
+              <w:rPr>
+                <w:rFonts w:cs="Arial"/>
+                <w:b/>
+                <w:bCs/>
+                <w:kern w:val="0"/>
+                <w:sz w:val="24"/>
+              </w:rPr>
+            </w:pPr>
+            <w:r>
+              <w:rPr>
+                <w:rFonts w:hint="eastAsia" w:cs="Arial"/>
+                <w:b/>
+                <w:bCs/>
+                <w:kern w:val="0"/>
+                <w:sz w:val="24"/>
+              </w:rPr>
+              <w:t>符合下列法规要求：</w:t>
+            </w:r>
+          </w:p>
+        </w:tc>
+      </w:tr>
+      <w:tr>
+        <w:tblPrEx>
+          <w:tblBorders>
+            <w:top w:val="single" w:color="auto" w:sz="4" w:space="0"/>
+            <w:left w:val="single" w:color="auto" w:sz="4" w:space="0"/>
+            <w:bottom w:val="single" w:color="auto" w:sz="4" w:space="0"/>
+            <w:right w:val="single" w:color="auto" w:sz="4" w:space="0"/>
+            <w:insideH w:val="none" w:color="auto" w:sz="0" w:space="0"/>
+            <w:insideV w:val="none" w:color="auto" w:sz="0" w:space="0"/>
+          </w:tblBorders>
+          <w:tblCellMar>
+            <w:top w:w="0" w:type="dxa"/>
+            <w:left w:w="108" w:type="dxa"/>
+            <w:bottom w:w="0" w:type="dxa"/>
+            <w:right w:w="108" w:type="dxa"/>
+          </w:tblCellMar>
+        </w:tblPrEx>
+        <w:trPr>
+          <w:trHeight w:val="258" w:hRule="atLeast"/>
+        </w:trPr>
+        <w:tc>
+          <w:tcPr>
+            <w:tcW w:w="9781" w:type="dxa"/>
+            <w:tcBorders>
+              <w:top w:val="dotted" w:color="auto" w:sz="4" w:space="0"/>
+              <w:bottom w:val="dotted" w:color="auto" w:sz="4" w:space="0"/>
+            </w:tcBorders>
+            <w:vAlign w:val="center"/>
+          </w:tcPr>
+          <w:p>
+            <w:pPr>
+              <w:keepNext w:val="0"/>
+              <w:keepLines w:val="0"/>
+              <w:pageBreakBefore w:val="0"/>
+              <w:widowControl w:val="0"/>
+              <w:kinsoku/>
+              <w:wordWrap/>
+              <w:overflowPunct/>
+              <w:topLinePunct w:val="0"/>
+              <w:autoSpaceDE w:val="0"/>
+              <w:autoSpaceDN w:val="0"/>
+              <w:bidi w:val="0"/>
+              <w:adjustRightInd w:val="0"/>
+              <w:snapToGrid/>
+              <w:spacing w:line="300" w:lineRule="auto"/>
+              <w:jc w:val="left"/>
+              <w:textAlignment w:val="auto"/>
+              <w:rPr>
+                <w:rFonts w:cs="Arial"/>
+                <w:kern w:val="0"/>
+                <w:sz w:val="24"/>
+                <w:b w:val="0"/>
+                <w:bCs w:val="0"/>
+              </w:rPr>
+            </w:pPr>
+            <w:r>
+              <w:rPr>
+                <w:rFonts w:hint="eastAsia" w:cs="宋体" w:ascii="宋体" w:hAnsi="宋体" w:eastAsia="宋体"/>
+                <w:bCs/>
+                <w:kern w:val="0"/>
+                <w:sz w:val="24"/>
+                <w:szCs w:val="24"/>
+              </w:rPr>
+              <w:t>危险化学品安全管理条例，国务院令</w:t>
+            </w:r>
+            <w:r>
+              <w:rPr>
+                <w:rFonts w:hint="eastAsia" w:cs="宋体" w:ascii="宋体" w:hAnsi="宋体" w:eastAsia="宋体"/>
+                <w:bCs/>
+                <w:kern w:val="0"/>
+                <w:sz w:val="24"/>
+                <w:lang w:val="en-US" w:eastAsia="zh-CN"/>
+                <w:szCs w:val="24"/>
+              </w:rPr>
+              <w:t>591</w:t>
+            </w:r>
+            <w:r>
+              <w:rPr>
+                <w:rFonts w:hint="eastAsia" w:cs="宋体" w:ascii="宋体" w:hAnsi="宋体" w:eastAsia="宋体"/>
+                <w:bCs/>
+                <w:kern w:val="0"/>
+                <w:sz w:val="24"/>
+                <w:szCs w:val="24"/>
+              </w:rPr>
+              <w:t>号</w:t>
+            </w:r>
+          </w:p>
+        </w:tc>
+      </w:tr>
+      <w:tr>
+        <w:tblPrEx>
+          <w:tblBorders>
+            <w:top w:val="single" w:color="auto" w:sz="4" w:space="0"/>
+            <w:left w:val="single" w:color="auto" w:sz="4" w:space="0"/>
+            <w:bottom w:val="single" w:color="auto" w:sz="4" w:space="0"/>
+            <w:right w:val="single" w:color="auto" w:sz="4" w:space="0"/>
+            <w:insideH w:val="none" w:color="auto" w:sz="0" w:space="0"/>
+            <w:insideV w:val="none" w:color="auto" w:sz="0" w:space="0"/>
+          </w:tblBorders>
+          <w:tblCellMar>
+            <w:top w:w="0" w:type="dxa"/>
+            <w:left w:w="108" w:type="dxa"/>
+            <w:bottom w:w="0" w:type="dxa"/>
+            <w:right w:w="108" w:type="dxa"/>
+          </w:tblCellMar>
+        </w:tblPrEx>
+        <w:trPr>
+          <w:trHeight w:val="258" w:hRule="atLeast"/>
+        </w:trPr>
+        <w:tc>
+          <w:tcPr>
+            <w:tcW w:w="9781" w:type="dxa"/>
+            <w:tcBorders>
+              <w:top w:val="dotted" w:color="auto" w:sz="4" w:space="0"/>
+              <w:bottom w:val="dotted" w:color="auto" w:sz="4" w:space="0"/>
+            </w:tcBorders>
+            <w:vAlign w:val="center"/>
+          </w:tcPr>
+          <w:p>
+            <w:pPr>
+              <w:keepNext w:val="0"/>
+              <w:keepLines w:val="0"/>
+              <w:pageBreakBefore w:val="0"/>
+              <w:widowControl w:val="0"/>
+              <w:kinsoku/>
+              <w:wordWrap/>
+              <w:overflowPunct/>
+              <w:topLinePunct w:val="0"/>
+              <w:autoSpaceDE w:val="0"/>
+              <w:autoSpaceDN w:val="0"/>
+              <w:bidi w:val="0"/>
+              <w:adjustRightInd w:val="0"/>
+              <w:snapToGrid/>
+              <w:spacing w:line="300" w:lineRule="auto"/>
+              <w:jc w:val="left"/>
+              <w:textAlignment w:val="auto"/>
+              <w:rPr>
+                <w:rFonts w:cs="Arial"/>
+                <w:kern w:val="0"/>
+                <w:sz w:val="24"/>
+                <w:b w:val="0"/>
+                <w:bCs w:val="0"/>
+              </w:rPr>
+            </w:pPr>
+            <w:r>
+              <w:rPr>
+                <w:rFonts w:cs="宋体" w:ascii="宋体" w:hAnsi="宋体" w:eastAsia="宋体"/>
+                <w:bCs/>
+                <w:kern w:val="0"/>
+                <w:sz w:val="24"/>
+                <w:szCs w:val="24"/>
+              </w:rPr>
+              <w:t xml:space="preserve">GB/T 16483 </w:t>
+            </w:r>
+            <w:r>
+              <w:rPr>
+                <w:rFonts w:hint="eastAsia" w:cs="宋体" w:ascii="宋体" w:hAnsi="宋体" w:eastAsia="宋体"/>
+                <w:bCs/>
+                <w:kern w:val="0"/>
+                <w:sz w:val="24"/>
+                <w:szCs w:val="24"/>
+              </w:rPr>
+              <w:t>化学品安全技术说明书内容和项目顺序</w:t>
+            </w:r>
+          </w:p>
+        </w:tc>
+      </w:tr>
+      <w:tr>
+        <w:tblPrEx>
+          <w:tblBorders>
+            <w:top w:val="single" w:color="auto" w:sz="4" w:space="0"/>
+            <w:left w:val="single" w:color="auto" w:sz="4" w:space="0"/>
+            <w:bottom w:val="single" w:color="auto" w:sz="4" w:space="0"/>
+            <w:right w:val="single" w:color="auto" w:sz="4" w:space="0"/>
+            <w:insideH w:val="none" w:color="auto" w:sz="0" w:space="0"/>
+            <w:insideV w:val="none" w:color="auto" w:sz="0" w:space="0"/>
+          </w:tblBorders>
+          <w:tblCellMar>
+            <w:top w:w="0" w:type="dxa"/>
+            <w:left w:w="108" w:type="dxa"/>
+            <w:bottom w:w="0" w:type="dxa"/>
+            <w:right w:w="108" w:type="dxa"/>
+          </w:tblCellMar>
+        </w:tblPrEx>
+        <w:trPr>
+          <w:trHeight w:val="258" w:hRule="atLeast"/>
+        </w:trPr>
+        <w:tc>
+          <w:tcPr>
+            <w:tcW w:w="9781" w:type="dxa"/>
+            <w:tcBorders>
+              <w:top w:val="dotted" w:color="auto" w:sz="4" w:space="0"/>
+              <w:bottom w:val="dotted" w:color="auto" w:sz="4" w:space="0"/>
+            </w:tcBorders>
+            <w:vAlign w:val="center"/>
+          </w:tcPr>
+          <w:p>
+            <w:pPr>
+              <w:keepNext w:val="0"/>
+              <w:keepLines w:val="0"/>
+              <w:pageBreakBefore w:val="0"/>
+              <w:widowControl w:val="0"/>
+              <w:kinsoku/>
+              <w:wordWrap/>
+              <w:overflowPunct/>
+              <w:topLinePunct w:val="0"/>
+              <w:autoSpaceDE w:val="0"/>
+              <w:autoSpaceDN w:val="0"/>
+              <w:bidi w:val="0"/>
+              <w:adjustRightInd w:val="0"/>
+              <w:snapToGrid/>
+              <w:spacing w:line="300" w:lineRule="auto"/>
+              <w:jc w:val="left"/>
+              <w:textAlignment w:val="auto"/>
+              <w:rPr>
+                <w:rFonts w:cs="Arial"/>
+                <w:kern w:val="0"/>
+                <w:sz w:val="24"/>
+                <w:b w:val="0"/>
+                <w:bCs w:val="0"/>
+              </w:rPr>
+            </w:pPr>
+            <w:r>
+              <w:rPr>
+                <w:rFonts w:cs="宋体" w:ascii="宋体" w:hAnsi="宋体" w:eastAsia="宋体"/>
+                <w:bCs/>
+                <w:kern w:val="0"/>
+                <w:sz w:val="24"/>
+                <w:szCs w:val="24"/>
+              </w:rPr>
+              <w:t xml:space="preserve">GB 13690 </w:t>
+            </w:r>
+            <w:r>
+              <w:rPr>
+                <w:rFonts w:hint="eastAsia" w:cs="宋体" w:ascii="宋体" w:hAnsi="宋体" w:eastAsia="宋体"/>
+                <w:bCs/>
+                <w:kern w:val="0"/>
+                <w:sz w:val="24"/>
+                <w:szCs w:val="24"/>
+              </w:rPr>
+              <w:t>化学品分类和危险性公示通则</w:t>
+            </w:r>
+          </w:p>
+        </w:tc>
+      </w:tr>
+      <w:tr>
+        <w:tblPrEx>
+          <w:tblBorders>
+            <w:top w:val="single" w:color="auto" w:sz="4" w:space="0"/>
+            <w:left w:val="single" w:color="auto" w:sz="4" w:space="0"/>
+            <w:bottom w:val="single" w:color="auto" w:sz="4" w:space="0"/>
+            <w:right w:val="single" w:color="auto" w:sz="4" w:space="0"/>
+            <w:insideH w:val="none" w:color="auto" w:sz="0" w:space="0"/>
+            <w:insideV w:val="none" w:color="auto" w:sz="0" w:space="0"/>
+          </w:tblBorders>
+          <w:tblCellMar>
+            <w:top w:w="0" w:type="dxa"/>
+            <w:left w:w="108" w:type="dxa"/>
+            <w:bottom w:w="0" w:type="dxa"/>
+            <w:right w:w="108" w:type="dxa"/>
+          </w:tblCellMar>
+        </w:tblPrEx>
+        <w:trPr>
+          <w:trHeight w:val="258" w:hRule="atLeast"/>
+        </w:trPr>
+        <w:tc>
+          <w:tcPr>
+            <w:tcW w:w="9781" w:type="dxa"/>
+            <w:tcBorders>
+              <w:top w:val="dotted" w:color="auto" w:sz="4" w:space="0"/>
+              <w:bottom w:val="dotted" w:color="auto" w:sz="4" w:space="0"/>
+            </w:tcBorders>
+            <w:vAlign w:val="center"/>
+          </w:tcPr>
+          <w:p>
+            <w:pPr>
+              <w:keepNext w:val="0"/>
+              <w:keepLines w:val="0"/>
+              <w:pageBreakBefore w:val="0"/>
+              <w:widowControl w:val="0"/>
+              <w:kinsoku/>
+              <w:wordWrap/>
+              <w:overflowPunct/>
+              <w:topLinePunct w:val="0"/>
+              <w:autoSpaceDE w:val="0"/>
+              <w:autoSpaceDN w:val="0"/>
+              <w:bidi w:val="0"/>
+              <w:adjustRightInd w:val="0"/>
+              <w:snapToGrid/>
+              <w:spacing w:line="300" w:lineRule="auto"/>
+              <w:jc w:val="left"/>
+              <w:textAlignment w:val="auto"/>
+              <w:rPr>
+                <w:rFonts w:hint="default" w:eastAsia="宋体" w:cs="Arial"/>
+                <w:kern w:val="0"/>
+                <w:sz w:val="24"/>
+                <w:lang w:val="en-US" w:eastAsia="zh-CN"/>
+                <w:b w:val="0"/>
+                <w:bCs w:val="0"/>
+              </w:rPr>
+            </w:pPr>
+            <w:r>
+              <w:rPr>
+                <w:rFonts w:cs="宋体" w:ascii="宋体" w:hAnsi="宋体" w:eastAsia="宋体"/>
+                <w:bCs/>
+                <w:kern w:val="0"/>
+                <w:sz w:val="24"/>
+                <w:szCs w:val="24"/>
+              </w:rPr>
+              <w:t xml:space="preserve">GB </w:t>
+            </w:r>
+            <w:r>
+              <w:rPr>
+                <w:rFonts w:hint="eastAsia" w:cs="宋体" w:ascii="宋体" w:hAnsi="宋体" w:eastAsia="宋体"/>
+                <w:bCs/>
+                <w:kern w:val="0"/>
+                <w:sz w:val="24"/>
+                <w:lang w:val="en-US" w:eastAsia="zh-CN"/>
+                <w:szCs w:val="24"/>
+              </w:rPr>
+              <w:t>30000.2-29 化学品分类和标签规范</w:t>
+            </w:r>
+          </w:p>
+        </w:tc>
+      </w:tr>
+      <w:tr>
+        <w:tblPrEx>
+          <w:tblBorders>
+            <w:top w:val="single" w:color="auto" w:sz="4" w:space="0"/>
+            <w:left w:val="single" w:color="auto" w:sz="4" w:space="0"/>
+            <w:bottom w:val="single" w:color="auto" w:sz="4" w:space="0"/>
+            <w:right w:val="single" w:color="auto" w:sz="4" w:space="0"/>
+            <w:insideH w:val="none" w:color="auto" w:sz="0" w:space="0"/>
+            <w:insideV w:val="none" w:color="auto" w:sz="0" w:space="0"/>
+          </w:tblBorders>
+          <w:tblCellMar>
+            <w:top w:w="0" w:type="dxa"/>
+            <w:left w:w="108" w:type="dxa"/>
+            <w:bottom w:w="0" w:type="dxa"/>
+            <w:right w:w="108" w:type="dxa"/>
+          </w:tblCellMar>
+        </w:tblPrEx>
+        <w:trPr>
+          <w:trHeight w:val="258" w:hRule="atLeast"/>
+        </w:trPr>
+        <w:tc>
+          <w:tcPr>
+            <w:tcW w:w="9781" w:type="dxa"/>
+            <w:tcBorders>
+              <w:top w:val="dotted" w:color="auto" w:sz="4" w:space="0"/>
+            </w:tcBorders>
+            <w:vAlign w:val="center"/>
+          </w:tcPr>
+          <w:p>
+            <w:pPr>
+              <w:keepNext w:val="0"/>
+              <w:keepLines w:val="0"/>
+              <w:pageBreakBefore w:val="0"/>
+              <w:widowControl w:val="0"/>
+              <w:kinsoku/>
+              <w:wordWrap/>
+              <w:overflowPunct/>
+              <w:topLinePunct w:val="0"/>
+              <w:autoSpaceDE w:val="0"/>
+              <w:autoSpaceDN w:val="0"/>
+              <w:bidi w:val="0"/>
+              <w:adjustRightInd w:val="0"/>
+              <w:snapToGrid/>
+              <w:spacing w:line="300" w:lineRule="auto"/>
+              <w:jc w:val="left"/>
+              <w:textAlignment w:val="auto"/>
+              <w:rPr>
+                <w:rFonts w:hint="default" w:eastAsia="宋体" w:cs="Arial"/>
+                <w:kern w:val="0"/>
+                <w:sz w:val="24"/>
+                <w:lang w:val="en-US" w:eastAsia="zh-CN"/>
+                <w:b w:val="0"/>
+                <w:bCs w:val="0"/>
+              </w:rPr>
+            </w:pPr>
+            <w:r>
+              <w:rPr>
+                <w:rFonts w:hint="eastAsia" w:cs="宋体" w:ascii="宋体" w:hAnsi="宋体" w:eastAsia="宋体"/>
+                <w:bCs/>
+                <w:kern w:val="0"/>
+                <w:sz w:val="24"/>
+                <w:lang w:val="en-US" w:eastAsia="zh-CN"/>
+                <w:szCs w:val="24"/>
+              </w:rPr>
+              <w:t>GB 15258 化学品安全标签编写规定</w:t>
+            </w:r>
+          </w:p>
+        </w:tc>
+      </w:tr>
+      <w:bookmarkEnd w:id="0"/>
+    </w:tbl>
+    <w:p>
+      <w:pPr>
+        <w:spacing w:line="300" w:lineRule="auto"/>
+        <w:ind w:right="480"/>
+        <w:rPr>
+          <w:sz w:val="24"/>
+        </w:rPr>
+      </w:pPr>
+    </w:p>
+    <w:tbl>
+      <w:tblPr>
+        <w:tblStyle w:val="4"/>
+        <w:tblW w:w="9781" w:type="dxa"/>
+        <w:tblInd w:w="108" w:type="dxa"/>
+        <w:tblBorders>
+          <w:top w:val="single" w:color="auto" w:sz="4" w:space="0"/>
+          <w:left w:val="single" w:color="auto" w:sz="4" w:space="0"/>
+          <w:bottom w:val="single" w:color="auto" w:sz="4" w:space="0"/>
+          <w:right w:val="single" w:color="auto" w:sz="4" w:space="0"/>
+          <w:insideH w:val="none" w:color="auto" w:sz="0" w:space="0"/>
+          <w:insideV w:val="none" w:color="auto" w:sz="0" w:space="0"/>
+        </w:tblBorders>
+        <w:tblLayout w:type="fixed"/>
+        <w:tblCellMar>
+          <w:top w:w="0" w:type="dxa"/>
+          <w:left w:w="108" w:type="dxa"/>
+          <w:bottom w:w="0" w:type="dxa"/>
+          <w:right w:w="108" w:type="dxa"/>
+        </w:tblCellMar>
+      </w:tblPr>
+      <w:tblGrid>
+        <w:gridCol w:w="9781"/>
+      </w:tblGrid>
+      <w:tr>
+        <w:tblPrEx>
+          <w:tblBorders>
+            <w:top w:val="single" w:color="auto" w:sz="4" w:space="0"/>
+            <w:left w:val="single" w:color="auto" w:sz="4" w:space="0"/>
+            <w:bottom w:val="single" w:color="auto" w:sz="4" w:space="0"/>
+            <w:right w:val="single" w:color="auto" w:sz="4" w:space="0"/>
+            <w:insideH w:val="none" w:color="auto" w:sz="0" w:space="0"/>
+            <w:insideV w:val="none" w:color="auto" w:sz="0" w:space="0"/>
+          </w:tblBorders>
+          <w:tblCellMar>
+            <w:top w:w="0" w:type="dxa"/>
+            <w:left w:w="108" w:type="dxa"/>
+            <w:bottom w:w="0" w:type="dxa"/>
+            <w:right w:w="108" w:type="dxa"/>
+          </w:tblCellMar>
+        </w:tblPrEx>
+        <w:trPr>
+          <w:tblHeader/>
+        </w:trPr>
+        <w:tc>
+          <w:tcPr>
+            <w:tcW w:w="9781" w:type="dxa"/>
+            <w:tcBorders>
+              <w:top w:val="single" w:color="auto" w:sz="4" w:space="0"/>
+              <w:bottom w:val="single" w:color="auto" w:sz="4" w:space="0"/>
+            </w:tcBorders>
+            <w:shd w:val="clear" w:color="auto" w:fill="D9D9D9"/>
+            <w:vAlign w:val="top"/>
+          </w:tcPr>
+          <w:p>
+            <w:pPr>
+              <w:keepNext/>
+              <w:spacing w:line="300" w:lineRule="auto"/>
+              <w:ind w:right="480"/>
+              <w:rPr>
+                <w:b/>
+                <w:sz w:val="24"/>
+              </w:rPr>
+            </w:pPr>
+            <w:r>
+              <w:rPr>
+                <w:b/>
+                <w:sz w:val="24"/>
+              </w:rPr>
+              <w:t xml:space="preserve">16. </w:t>
+            </w:r>
+            <w:r>
+              <w:rPr>
+                <w:rFonts w:hint="eastAsia"/>
+                <w:b/>
+                <w:sz w:val="24"/>
+              </w:rPr>
+              <w:t>其他信息</w:t>
+            </w:r>
+          </w:p>
+        </w:tc>
+      </w:tr>
+      <w:tr>
+        <w:tblPrEx>
+          <w:tblBorders>
+            <w:top w:val="single" w:color="auto" w:sz="4" w:space="0"/>
+            <w:left w:val="single" w:color="auto" w:sz="4" w:space="0"/>
+            <w:bottom w:val="single" w:color="auto" w:sz="4" w:space="0"/>
+            <w:right w:val="single" w:color="auto" w:sz="4" w:space="0"/>
+            <w:insideH w:val="none" w:color="auto" w:sz="0" w:space="0"/>
+            <w:insideV w:val="none" w:color="auto" w:sz="0" w:space="0"/>
+          </w:tblBorders>
+          <w:tblCellMar>
+            <w:top w:w="0" w:type="dxa"/>
+            <w:left w:w="108" w:type="dxa"/>
+            <w:bottom w:w="0" w:type="dxa"/>
+            <w:right w:w="108" w:type="dxa"/>
+          </w:tblCellMar>
+        </w:tblPrEx>
         <w:tc>
           <w:tcPr>
             <w:tcW w:w="9781" w:type="dxa"/>
@@ -18329,9 +18393,10 @@
               <w:textAlignment w:val="auto"/>
               <w:rPr>
                 <w:rFonts w:cs="Arial"/>
-                <w:bCs/>
                 <w:kern w:val="0"/>
                 <w:sz w:val="24"/>
+                <w:b w:val="0"/>
+                <w:bCs w:val="0"/>
               </w:rPr>
             </w:pPr>
             <w:r>

</xml_diff>